<commit_message>
docs: consolidate project report versions and update documentation
</commit_message>
<xml_diff>
--- a/QualiVision_AI_Project_Report.docx
+++ b/QualiVision_AI_Project_Report.docx
@@ -180,7 +180,181 @@
         <w:pStyle w:val="IntenseQuote"/>
       </w:pPr>
       <w:r>
-        <w:t>Note: Right-click here and select 'Update Field' to generate the Table of Contents in Word.</w:t>
+        <w:t>Note: If the Table of Contents above is empty, please Right-Click it and select 'Update Field'.</w:t>
+      </w:r>
+    </w:p>
+    <w:p>
+      <w:pPr>
+        <w:pStyle w:val="Heading2"/>
+      </w:pPr>
+      <w:r>
+        <w:br/>
+        <w:t>Fallback Table of Contents:</w:t>
+      </w:r>
+    </w:p>
+    <w:p>
+      <w:r>
+        <w:t>1. Cover Page</w:t>
+      </w:r>
+    </w:p>
+    <w:p>
+      <w:r>
+        <w:t>2. Certificate / Declaration</w:t>
+      </w:r>
+    </w:p>
+    <w:p>
+      <w:r>
+        <w:t>3. Acknowledgement</w:t>
+      </w:r>
+    </w:p>
+    <w:p>
+      <w:r>
+        <w:t>4. Abstract</w:t>
+      </w:r>
+    </w:p>
+    <w:p>
+      <w:r>
+        <w:t>5. Table of Contents</w:t>
+      </w:r>
+    </w:p>
+    <w:p>
+      <w:r>
+        <w:t>6. Introduction</w:t>
+      </w:r>
+    </w:p>
+    <w:p>
+      <w:r>
+        <w:t>7. Problem Statement</w:t>
+      </w:r>
+    </w:p>
+    <w:p>
+      <w:r>
+        <w:t>8. Objectives</w:t>
+      </w:r>
+    </w:p>
+    <w:p>
+      <w:r>
+        <w:t>9. Scope of the Project</w:t>
+      </w:r>
+    </w:p>
+    <w:p>
+      <w:r>
+        <w:t>10. Existing System</w:t>
+      </w:r>
+    </w:p>
+    <w:p>
+      <w:r>
+        <w:t>11. Proposed System</w:t>
+      </w:r>
+    </w:p>
+    <w:p>
+      <w:r>
+        <w:t>12. System Requirements</w:t>
+      </w:r>
+    </w:p>
+    <w:p>
+      <w:r>
+        <w:t>13. Technology Stack</w:t>
+      </w:r>
+    </w:p>
+    <w:p>
+      <w:r>
+        <w:t>14. Project Architecture</w:t>
+      </w:r>
+    </w:p>
+    <w:p>
+      <w:r>
+        <w:t>15. Dataset</w:t>
+      </w:r>
+    </w:p>
+    <w:p>
+      <w:r>
+        <w:t>16. AI Model</w:t>
+      </w:r>
+    </w:p>
+    <w:p>
+      <w:r>
+        <w:t>17. Prediction Pipeline</w:t>
+      </w:r>
+    </w:p>
+    <w:p>
+      <w:r>
+        <w:t>18. Database Design</w:t>
+      </w:r>
+    </w:p>
+    <w:p>
+      <w:r>
+        <w:t>19. Flask Backend</w:t>
+      </w:r>
+    </w:p>
+    <w:p>
+      <w:r>
+        <w:t>20. Application Modules</w:t>
+      </w:r>
+    </w:p>
+    <w:p>
+      <w:r>
+        <w:t>21. User Interface</w:t>
+      </w:r>
+    </w:p>
+    <w:p>
+      <w:r>
+        <w:t>22. API Workflow</w:t>
+      </w:r>
+    </w:p>
+    <w:p>
+      <w:r>
+        <w:t>23. Authentication</w:t>
+      </w:r>
+    </w:p>
+    <w:p>
+      <w:r>
+        <w:t>24. Security</w:t>
+      </w:r>
+    </w:p>
+    <w:p>
+      <w:r>
+        <w:t>25. Testing</w:t>
+      </w:r>
+    </w:p>
+    <w:p>
+      <w:r>
+        <w:t>26. Performance Analysis</w:t>
+      </w:r>
+    </w:p>
+    <w:p>
+      <w:r>
+        <w:t>27. Results</w:t>
+      </w:r>
+    </w:p>
+    <w:p>
+      <w:r>
+        <w:t>28. Advantages</w:t>
+      </w:r>
+    </w:p>
+    <w:p>
+      <w:r>
+        <w:t>29. Limitations</w:t>
+      </w:r>
+    </w:p>
+    <w:p>
+      <w:r>
+        <w:t>30. Future Enhancements</w:t>
+      </w:r>
+    </w:p>
+    <w:p>
+      <w:r>
+        <w:t>31. Conclusion</w:t>
+      </w:r>
+    </w:p>
+    <w:p>
+      <w:r>
+        <w:t>32. References</w:t>
+      </w:r>
+    </w:p>
+    <w:p>
+      <w:r>
+        <w:t>33. Appendix</w:t>
       </w:r>
     </w:p>
     <w:p>
@@ -467,7 +641,7 @@
       <w:r>
         <w:drawing>
           <wp:inline xmlns:a="http://schemas.openxmlformats.org/drawingml/2006/main" xmlns:pic="http://schemas.openxmlformats.org/drawingml/2006/picture">
-            <wp:extent cx="5486400" cy="3086100"/>
+            <wp:extent cx="5486400" cy="4434840"/>
             <wp:docPr id="1" name="Picture 1"/>
             <wp:cNvGraphicFramePr>
               <a:graphicFrameLocks noChangeAspect="1"/>
@@ -488,7 +662,7 @@
                   <pic:spPr>
                     <a:xfrm>
                       <a:off x="0" y="0"/>
-                      <a:ext cx="5486400" cy="3086100"/>
+                      <a:ext cx="5486400" cy="4434840"/>
                     </a:xfrm>
                     <a:prstGeom prst="rect"/>
                   </pic:spPr>
@@ -560,7 +734,7 @@
       <w:r>
         <w:drawing>
           <wp:inline xmlns:a="http://schemas.openxmlformats.org/drawingml/2006/main" xmlns:pic="http://schemas.openxmlformats.org/drawingml/2006/picture">
-            <wp:extent cx="5486400" cy="3086100"/>
+            <wp:extent cx="5486400" cy="3429000"/>
             <wp:docPr id="2" name="Picture 2"/>
             <wp:cNvGraphicFramePr>
               <a:graphicFrameLocks noChangeAspect="1"/>
@@ -569,11 +743,11 @@
               <a:graphicData uri="http://schemas.openxmlformats.org/drawingml/2006/picture">
                 <pic:pic>
                   <pic:nvPicPr>
-                    <pic:cNvPr id="0" name="02-dashboard.png"/>
+                    <pic:cNvPr id="0" name="10-dataset.png"/>
                     <pic:cNvPicPr/>
                   </pic:nvPicPr>
                   <pic:blipFill>
-                    <a:blip r:embed="rId9"/>
+                    <a:blip r:embed="rId10"/>
                     <a:stretch>
                       <a:fillRect/>
                     </a:stretch>
@@ -581,7 +755,7 @@
                   <pic:spPr>
                     <a:xfrm>
                       <a:off x="0" y="0"/>
-                      <a:ext cx="5486400" cy="3086100"/>
+                      <a:ext cx="5486400" cy="3429000"/>
                     </a:xfrm>
                     <a:prstGeom prst="rect"/>
                   </pic:spPr>
@@ -618,7 +792,7 @@
       <w:r>
         <w:drawing>
           <wp:inline xmlns:a="http://schemas.openxmlformats.org/drawingml/2006/main" xmlns:pic="http://schemas.openxmlformats.org/drawingml/2006/picture">
-            <wp:extent cx="5486400" cy="3086100"/>
+            <wp:extent cx="5486400" cy="4278630"/>
             <wp:docPr id="3" name="Picture 3"/>
             <wp:cNvGraphicFramePr>
               <a:graphicFrameLocks noChangeAspect="1"/>
@@ -627,11 +801,11 @@
               <a:graphicData uri="http://schemas.openxmlformats.org/drawingml/2006/picture">
                 <pic:pic>
                   <pic:nvPicPr>
-                    <pic:cNvPr id="0" name="02-dashboard.png"/>
+                    <pic:cNvPr id="0" name="11-model-manager.png"/>
                     <pic:cNvPicPr/>
                   </pic:nvPicPr>
                   <pic:blipFill>
-                    <a:blip r:embed="rId9"/>
+                    <a:blip r:embed="rId11"/>
                     <a:stretch>
                       <a:fillRect/>
                     </a:stretch>
@@ -639,7 +813,7 @@
                   <pic:spPr>
                     <a:xfrm>
                       <a:off x="0" y="0"/>
-                      <a:ext cx="5486400" cy="3086100"/>
+                      <a:ext cx="5486400" cy="4278630"/>
                     </a:xfrm>
                     <a:prstGeom prst="rect"/>
                   </pic:spPr>
@@ -809,7 +983,7 @@
       <w:r>
         <w:drawing>
           <wp:inline xmlns:a="http://schemas.openxmlformats.org/drawingml/2006/main" xmlns:pic="http://schemas.openxmlformats.org/drawingml/2006/picture">
-            <wp:extent cx="5486400" cy="3086100"/>
+            <wp:extent cx="5486400" cy="3429000"/>
             <wp:docPr id="4" name="Picture 4"/>
             <wp:cNvGraphicFramePr>
               <a:graphicFrameLocks noChangeAspect="1"/>
@@ -822,7 +996,7 @@
                     <pic:cNvPicPr/>
                   </pic:nvPicPr>
                   <pic:blipFill>
-                    <a:blip r:embed="rId10"/>
+                    <a:blip r:embed="rId12"/>
                     <a:stretch>
                       <a:fillRect/>
                     </a:stretch>
@@ -830,7 +1004,7 @@
                   <pic:spPr>
                     <a:xfrm>
                       <a:off x="0" y="0"/>
-                      <a:ext cx="5486400" cy="3086100"/>
+                      <a:ext cx="5486400" cy="3429000"/>
                     </a:xfrm>
                     <a:prstGeom prst="rect"/>
                   </pic:spPr>
@@ -859,7 +1033,7 @@
       <w:r>
         <w:drawing>
           <wp:inline xmlns:a="http://schemas.openxmlformats.org/drawingml/2006/main" xmlns:pic="http://schemas.openxmlformats.org/drawingml/2006/picture">
-            <wp:extent cx="5486400" cy="3086100"/>
+            <wp:extent cx="5486400" cy="5600700"/>
             <wp:docPr id="5" name="Picture 5"/>
             <wp:cNvGraphicFramePr>
               <a:graphicFrameLocks noChangeAspect="1"/>
@@ -872,7 +1046,7 @@
                     <pic:cNvPicPr/>
                   </pic:nvPicPr>
                   <pic:blipFill>
-                    <a:blip r:embed="rId11"/>
+                    <a:blip r:embed="rId13"/>
                     <a:stretch>
                       <a:fillRect/>
                     </a:stretch>
@@ -880,7 +1054,7 @@
                   <pic:spPr>
                     <a:xfrm>
                       <a:off x="0" y="0"/>
-                      <a:ext cx="5486400" cy="3086100"/>
+                      <a:ext cx="5486400" cy="5600700"/>
                     </a:xfrm>
                     <a:prstGeom prst="rect"/>
                   </pic:spPr>
@@ -922,7 +1096,7 @@
       <w:r>
         <w:drawing>
           <wp:inline xmlns:a="http://schemas.openxmlformats.org/drawingml/2006/main" xmlns:pic="http://schemas.openxmlformats.org/drawingml/2006/picture">
-            <wp:extent cx="5486400" cy="3086100"/>
+            <wp:extent cx="5486400" cy="3429000"/>
             <wp:docPr id="6" name="Picture 6"/>
             <wp:cNvGraphicFramePr>
               <a:graphicFrameLocks noChangeAspect="1"/>
@@ -935,7 +1109,7 @@
                     <pic:cNvPicPr/>
                   </pic:nvPicPr>
                   <pic:blipFill>
-                    <a:blip r:embed="rId12"/>
+                    <a:blip r:embed="rId14"/>
                     <a:stretch>
                       <a:fillRect/>
                     </a:stretch>
@@ -943,7 +1117,7 @@
                   <pic:spPr>
                     <a:xfrm>
                       <a:off x="0" y="0"/>
-                      <a:ext cx="5486400" cy="3086100"/>
+                      <a:ext cx="5486400" cy="3429000"/>
                     </a:xfrm>
                     <a:prstGeom prst="rect"/>
                   </pic:spPr>
@@ -967,7 +1141,7 @@
       <w:r>
         <w:drawing>
           <wp:inline xmlns:a="http://schemas.openxmlformats.org/drawingml/2006/main" xmlns:pic="http://schemas.openxmlformats.org/drawingml/2006/picture">
-            <wp:extent cx="5486400" cy="3086100"/>
+            <wp:extent cx="5486400" cy="3429000"/>
             <wp:docPr id="7" name="Picture 7"/>
             <wp:cNvGraphicFramePr>
               <a:graphicFrameLocks noChangeAspect="1"/>
@@ -980,7 +1154,7 @@
                     <pic:cNvPicPr/>
                   </pic:nvPicPr>
                   <pic:blipFill>
-                    <a:blip r:embed="rId13"/>
+                    <a:blip r:embed="rId15"/>
                     <a:stretch>
                       <a:fillRect/>
                     </a:stretch>
@@ -988,7 +1162,7 @@
                   <pic:spPr>
                     <a:xfrm>
                       <a:off x="0" y="0"/>
-                      <a:ext cx="5486400" cy="3086100"/>
+                      <a:ext cx="5486400" cy="3429000"/>
                     </a:xfrm>
                     <a:prstGeom prst="rect"/>
                   </pic:spPr>
@@ -1025,7 +1199,7 @@
                     <pic:cNvPicPr/>
                   </pic:nvPicPr>
                   <pic:blipFill>
-                    <a:blip r:embed="rId14"/>
+                    <a:blip r:embed="rId16"/>
                     <a:stretch>
                       <a:fillRect/>
                     </a:stretch>
@@ -1170,7 +1344,7 @@
       <w:r>
         <w:drawing>
           <wp:inline xmlns:a="http://schemas.openxmlformats.org/drawingml/2006/main" xmlns:pic="http://schemas.openxmlformats.org/drawingml/2006/picture">
-            <wp:extent cx="5486400" cy="3086100"/>
+            <wp:extent cx="5486400" cy="3429000"/>
             <wp:docPr id="9" name="Picture 9"/>
             <wp:cNvGraphicFramePr>
               <a:graphicFrameLocks noChangeAspect="1"/>
@@ -1183,7 +1357,7 @@
                     <pic:cNvPicPr/>
                   </pic:nvPicPr>
                   <pic:blipFill>
-                    <a:blip r:embed="rId15"/>
+                    <a:blip r:embed="rId17"/>
                     <a:stretch>
                       <a:fillRect/>
                     </a:stretch>
@@ -1191,7 +1365,7 @@
                   <pic:spPr>
                     <a:xfrm>
                       <a:off x="0" y="0"/>
-                      <a:ext cx="5486400" cy="3086100"/>
+                      <a:ext cx="5486400" cy="3429000"/>
                     </a:xfrm>
                     <a:prstGeom prst="rect"/>
                   </pic:spPr>

</xml_diff>

<commit_message>
docs: update project report and remove temporary lock file
</commit_message>
<xml_diff>
--- a/QualiVision_AI_Project_Report.docx
+++ b/QualiVision_AI_Project_Report.docx
@@ -92,6 +92,23 @@
         <w:jc w:val="center"/>
       </w:pPr>
       <w:r>
+        <w:t>GitHub Repository:</w:t>
+        <w:br/>
+      </w:r>
+      <w:r>
+        <w:rPr>
+          <w:b/>
+        </w:rPr>
+        <w:t>https://github.com/JiphinGeorge/SmartCam-AI---Industrial-Quality-Control-System</w:t>
+        <w:br/>
+        <w:br/>
+      </w:r>
+    </w:p>
+    <w:p>
+      <w:pPr>
+        <w:jc w:val="center"/>
+      </w:pPr>
+      <w:r>
         <w:t>Date: July 2026</w:t>
       </w:r>
     </w:p>
@@ -105,25 +122,7 @@
         <w:pStyle w:val="Heading1"/>
       </w:pPr>
       <w:r>
-        <w:t>2. Certificate / Declaration</w:t>
-      </w:r>
-    </w:p>
-    <w:p>
-      <w:r>
-        <w:t>[Placeholder for Official Certificate and Declaration signed by the college and internship organization.]</w:t>
-      </w:r>
-    </w:p>
-    <w:p>
-      <w:r>
-        <w:br w:type="page"/>
-      </w:r>
-    </w:p>
-    <w:p>
-      <w:pPr>
-        <w:pStyle w:val="Heading1"/>
-      </w:pPr>
-      <w:r>
-        <w:t>3. Acknowledgement</w:t>
+        <w:t>2. Acknowledgement</w:t>
       </w:r>
     </w:p>
     <w:p>
@@ -132,16 +131,11 @@
       </w:r>
     </w:p>
     <w:p>
-      <w:r>
-        <w:br w:type="page"/>
-      </w:r>
-    </w:p>
-    <w:p>
       <w:pPr>
         <w:pStyle w:val="Heading1"/>
       </w:pPr>
       <w:r>
-        <w:t>4. Abstract</w:t>
+        <w:t>3. Abstract</w:t>
       </w:r>
     </w:p>
     <w:p>
@@ -155,16 +149,11 @@
       </w:r>
     </w:p>
     <w:p>
-      <w:r>
-        <w:br w:type="page"/>
-      </w:r>
-    </w:p>
-    <w:p>
       <w:pPr>
         <w:pStyle w:val="Heading1"/>
       </w:pPr>
       <w:r>
-        <w:t>5. Table of Contents</w:t>
+        <w:t>4. Table of Contents</w:t>
       </w:r>
     </w:p>
     <w:p>
@@ -177,197 +166,10 @@
     </w:p>
     <w:p>
       <w:pPr>
-        <w:pStyle w:val="IntenseQuote"/>
-      </w:pPr>
-      <w:r>
-        <w:t>Note: If the Table of Contents above is empty, please Right-Click it and select 'Update Field'.</w:t>
-      </w:r>
-    </w:p>
-    <w:p>
-      <w:pPr>
-        <w:pStyle w:val="Heading2"/>
-      </w:pPr>
-      <w:r>
-        <w:br/>
-        <w:t>Fallback Table of Contents:</w:t>
-      </w:r>
-    </w:p>
-    <w:p>
-      <w:r>
-        <w:t>1. Cover Page</w:t>
-      </w:r>
-    </w:p>
-    <w:p>
-      <w:r>
-        <w:t>2. Certificate / Declaration</w:t>
-      </w:r>
-    </w:p>
-    <w:p>
-      <w:r>
-        <w:t>3. Acknowledgement</w:t>
-      </w:r>
-    </w:p>
-    <w:p>
-      <w:r>
-        <w:t>4. Abstract</w:t>
-      </w:r>
-    </w:p>
-    <w:p>
-      <w:r>
-        <w:t>5. Table of Contents</w:t>
-      </w:r>
-    </w:p>
-    <w:p>
-      <w:r>
-        <w:t>6. Introduction</w:t>
-      </w:r>
-    </w:p>
-    <w:p>
-      <w:r>
-        <w:t>7. Problem Statement</w:t>
-      </w:r>
-    </w:p>
-    <w:p>
-      <w:r>
-        <w:t>8. Objectives</w:t>
-      </w:r>
-    </w:p>
-    <w:p>
-      <w:r>
-        <w:t>9. Scope of the Project</w:t>
-      </w:r>
-    </w:p>
-    <w:p>
-      <w:r>
-        <w:t>10. Existing System</w:t>
-      </w:r>
-    </w:p>
-    <w:p>
-      <w:r>
-        <w:t>11. Proposed System</w:t>
-      </w:r>
-    </w:p>
-    <w:p>
-      <w:r>
-        <w:t>12. System Requirements</w:t>
-      </w:r>
-    </w:p>
-    <w:p>
-      <w:r>
-        <w:t>13. Technology Stack</w:t>
-      </w:r>
-    </w:p>
-    <w:p>
-      <w:r>
-        <w:t>14. Project Architecture</w:t>
-      </w:r>
-    </w:p>
-    <w:p>
-      <w:r>
-        <w:t>15. Dataset</w:t>
-      </w:r>
-    </w:p>
-    <w:p>
-      <w:r>
-        <w:t>16. AI Model</w:t>
-      </w:r>
-    </w:p>
-    <w:p>
-      <w:r>
-        <w:t>17. Prediction Pipeline</w:t>
-      </w:r>
-    </w:p>
-    <w:p>
-      <w:r>
-        <w:t>18. Database Design</w:t>
-      </w:r>
-    </w:p>
-    <w:p>
-      <w:r>
-        <w:t>19. Flask Backend</w:t>
-      </w:r>
-    </w:p>
-    <w:p>
-      <w:r>
-        <w:t>20. Application Modules</w:t>
-      </w:r>
-    </w:p>
-    <w:p>
-      <w:r>
-        <w:t>21. User Interface</w:t>
-      </w:r>
-    </w:p>
-    <w:p>
-      <w:r>
-        <w:t>22. API Workflow</w:t>
-      </w:r>
-    </w:p>
-    <w:p>
-      <w:r>
-        <w:t>23. Authentication</w:t>
-      </w:r>
-    </w:p>
-    <w:p>
-      <w:r>
-        <w:t>24. Security</w:t>
-      </w:r>
-    </w:p>
-    <w:p>
-      <w:r>
-        <w:t>25. Testing</w:t>
-      </w:r>
-    </w:p>
-    <w:p>
-      <w:r>
-        <w:t>26. Performance Analysis</w:t>
-      </w:r>
-    </w:p>
-    <w:p>
-      <w:r>
-        <w:t>27. Results</w:t>
-      </w:r>
-    </w:p>
-    <w:p>
-      <w:r>
-        <w:t>28. Advantages</w:t>
-      </w:r>
-    </w:p>
-    <w:p>
-      <w:r>
-        <w:t>29. Limitations</w:t>
-      </w:r>
-    </w:p>
-    <w:p>
-      <w:r>
-        <w:t>30. Future Enhancements</w:t>
-      </w:r>
-    </w:p>
-    <w:p>
-      <w:r>
-        <w:t>31. Conclusion</w:t>
-      </w:r>
-    </w:p>
-    <w:p>
-      <w:r>
-        <w:t>32. References</w:t>
-      </w:r>
-    </w:p>
-    <w:p>
-      <w:r>
-        <w:t>33. Appendix</w:t>
-      </w:r>
-    </w:p>
-    <w:p>
-      <w:r>
-        <w:br w:type="page"/>
-      </w:r>
-    </w:p>
-    <w:p>
-      <w:pPr>
         <w:pStyle w:val="Heading1"/>
       </w:pPr>
       <w:r>
-        <w:t>6. Introduction</w:t>
+        <w:t>5. Introduction</w:t>
       </w:r>
     </w:p>
     <w:p>
@@ -385,7 +187,7 @@
         <w:pStyle w:val="Heading1"/>
       </w:pPr>
       <w:r>
-        <w:t>7. Problem Statement</w:t>
+        <w:t>6. Problem Statement</w:t>
       </w:r>
     </w:p>
     <w:p>
@@ -430,7 +232,7 @@
         <w:pStyle w:val="Heading1"/>
       </w:pPr>
       <w:r>
-        <w:t>8. Objectives</w:t>
+        <w:t>7. Objectives</w:t>
       </w:r>
     </w:p>
     <w:p>
@@ -470,7 +272,7 @@
         <w:pStyle w:val="Heading1"/>
       </w:pPr>
       <w:r>
-        <w:t>9. Scope of the Project</w:t>
+        <w:t>8. Scope of the Project</w:t>
       </w:r>
     </w:p>
     <w:p>
@@ -483,7 +285,7 @@
         <w:pStyle w:val="Heading1"/>
       </w:pPr>
       <w:r>
-        <w:t>10. Existing System</w:t>
+        <w:t>9. Existing System</w:t>
       </w:r>
     </w:p>
     <w:p>
@@ -496,7 +298,7 @@
         <w:pStyle w:val="Heading1"/>
       </w:pPr>
       <w:r>
-        <w:t>11. Proposed System</w:t>
+        <w:t>10. Proposed System</w:t>
       </w:r>
     </w:p>
     <w:p>
@@ -509,7 +311,7 @@
         <w:pStyle w:val="Heading1"/>
       </w:pPr>
       <w:r>
-        <w:t>12. System Requirements</w:t>
+        <w:t>11. System Requirements</w:t>
       </w:r>
     </w:p>
     <w:p>
@@ -589,7 +391,7 @@
         <w:pStyle w:val="Heading1"/>
       </w:pPr>
       <w:r>
-        <w:t>13. Technology Stack</w:t>
+        <w:t>12. Technology Stack</w:t>
       </w:r>
     </w:p>
     <w:p>
@@ -629,7 +431,7 @@
         <w:pStyle w:val="Heading1"/>
       </w:pPr>
       <w:r>
-        <w:t>14. Project Architecture</w:t>
+        <w:t>13. Project Architecture</w:t>
       </w:r>
     </w:p>
     <w:p>
@@ -687,7 +489,7 @@
         <w:pStyle w:val="Heading1"/>
       </w:pPr>
       <w:r>
-        <w:t>15. Dataset</w:t>
+        <w:t>14. Dataset</w:t>
       </w:r>
     </w:p>
     <w:p>
@@ -780,7 +582,7 @@
         <w:pStyle w:val="Heading1"/>
       </w:pPr>
       <w:r>
-        <w:t>16. AI Model</w:t>
+        <w:t>15. AI Model</w:t>
       </w:r>
     </w:p>
     <w:p>
@@ -838,7 +640,7 @@
         <w:pStyle w:val="Heading1"/>
       </w:pPr>
       <w:r>
-        <w:t>17. Prediction Pipeline</w:t>
+        <w:t>16. Prediction Pipeline</w:t>
       </w:r>
     </w:p>
     <w:p>
@@ -881,7 +683,7 @@
         <w:pStyle w:val="Heading1"/>
       </w:pPr>
       <w:r>
-        <w:t>18. Database Design</w:t>
+        <w:t>17. Database Design</w:t>
       </w:r>
     </w:p>
     <w:p>
@@ -918,7 +720,7 @@
         <w:pStyle w:val="Heading1"/>
       </w:pPr>
       <w:r>
-        <w:t>19. Flask Backend</w:t>
+        <w:t>18. Flask Backend</w:t>
       </w:r>
     </w:p>
     <w:p>
@@ -971,7 +773,7 @@
         <w:pStyle w:val="Heading1"/>
       </w:pPr>
       <w:r>
-        <w:t>20. Application Modules</w:t>
+        <w:t>19. Application Modules</w:t>
       </w:r>
     </w:p>
     <w:p>
@@ -1084,7 +886,7 @@
         <w:pStyle w:val="Heading1"/>
       </w:pPr>
       <w:r>
-        <w:t>21. User Interface</w:t>
+        <w:t>20. User Interface</w:t>
       </w:r>
     </w:p>
     <w:p>
@@ -1232,7 +1034,7 @@
         <w:pStyle w:val="Heading1"/>
       </w:pPr>
       <w:r>
-        <w:t>22. API Workflow</w:t>
+        <w:t>21. API Workflow</w:t>
       </w:r>
     </w:p>
     <w:p>
@@ -1245,7 +1047,7 @@
         <w:pStyle w:val="Heading1"/>
       </w:pPr>
       <w:r>
-        <w:t>23. Authentication</w:t>
+        <w:t>22. Authentication</w:t>
       </w:r>
     </w:p>
     <w:p>
@@ -1258,7 +1060,7 @@
         <w:pStyle w:val="Heading1"/>
       </w:pPr>
       <w:r>
-        <w:t>24. Security</w:t>
+        <w:t>23. Security</w:t>
       </w:r>
     </w:p>
     <w:p>
@@ -1281,7 +1083,7 @@
         <w:pStyle w:val="Heading1"/>
       </w:pPr>
       <w:r>
-        <w:t>25. Testing</w:t>
+        <w:t>24. Testing</w:t>
       </w:r>
     </w:p>
     <w:p>
@@ -1304,7 +1106,7 @@
         <w:pStyle w:val="Heading1"/>
       </w:pPr>
       <w:r>
-        <w:t>26. Performance Analysis</w:t>
+        <w:t>25. Performance Analysis</w:t>
       </w:r>
     </w:p>
     <w:p>
@@ -1332,7 +1134,7 @@
         <w:pStyle w:val="Heading1"/>
       </w:pPr>
       <w:r>
-        <w:t>27. Results</w:t>
+        <w:t>26. Results</w:t>
       </w:r>
     </w:p>
     <w:p>
@@ -1390,7 +1192,7 @@
         <w:pStyle w:val="Heading1"/>
       </w:pPr>
       <w:r>
-        <w:t>28. Advantages</w:t>
+        <w:t>27. Advantages</w:t>
       </w:r>
     </w:p>
     <w:p>
@@ -1418,7 +1220,7 @@
         <w:pStyle w:val="Heading1"/>
       </w:pPr>
       <w:r>
-        <w:t>29. Limitations</w:t>
+        <w:t>28. Limitations</w:t>
       </w:r>
     </w:p>
     <w:p>
@@ -1436,7 +1238,7 @@
         <w:pStyle w:val="Heading1"/>
       </w:pPr>
       <w:r>
-        <w:t>30. Future Enhancements</w:t>
+        <w:t>29. Future Enhancements</w:t>
       </w:r>
     </w:p>
     <w:p>
@@ -1459,7 +1261,7 @@
         <w:pStyle w:val="Heading1"/>
       </w:pPr>
       <w:r>
-        <w:t>31. Conclusion</w:t>
+        <w:t>30. Conclusion</w:t>
       </w:r>
     </w:p>
     <w:p>
@@ -1472,7 +1274,7 @@
         <w:pStyle w:val="Heading1"/>
       </w:pPr>
       <w:r>
-        <w:t>32. References</w:t>
+        <w:t>31. References</w:t>
       </w:r>
     </w:p>
     <w:p>
@@ -1500,12 +1302,17 @@
         <w:pStyle w:val="Heading1"/>
       </w:pPr>
       <w:r>
-        <w:t>33. Appendix</w:t>
+        <w:t>32. Appendix</w:t>
       </w:r>
     </w:p>
     <w:p>
       <w:r>
-        <w:t>Refer to the project repository for complete source code, configuration files (`config.py`), and installation instructions.</w:t>
+        <w:t>Refer to the project repository for complete source code, configuration files (`config.py`), and installation instructions:</w:t>
+      </w:r>
+    </w:p>
+    <w:p>
+      <w:r>
+        <w:t>GitHub: https://github.com/JiphinGeorge/SmartCam-AI---Industrial-Quality-Control-System</w:t>
       </w:r>
     </w:p>
     <w:sectPr>

</xml_diff>

<commit_message>
docs: update QualiVision AI project report with latest implementation details
</commit_message>
<xml_diff>
--- a/QualiVision_AI_Project_Report.docx
+++ b/QualiVision_AI_Project_Report.docx
@@ -157,11 +157,259 @@
       </w:r>
     </w:p>
     <w:p>
+      <w:pPr>
+        <w:ind w:left="360"/>
+      </w:pPr>
       <w:r>
-        <w:fldChar w:fldCharType="begin"/>
-        <w:instrText xml:space="preserve">TOC \o "1-3" \h \z \u</w:instrText>
-        <w:fldChar w:fldCharType="separate"/>
-        <w:fldChar w:fldCharType="end"/>
+        <w:t>1. Cover Page</w:t>
+      </w:r>
+    </w:p>
+    <w:p>
+      <w:pPr>
+        <w:ind w:left="360"/>
+      </w:pPr>
+      <w:r>
+        <w:t>2. Acknowledgement</w:t>
+      </w:r>
+    </w:p>
+    <w:p>
+      <w:pPr>
+        <w:ind w:left="360"/>
+      </w:pPr>
+      <w:r>
+        <w:t>3. Abstract</w:t>
+      </w:r>
+    </w:p>
+    <w:p>
+      <w:pPr>
+        <w:ind w:left="360"/>
+      </w:pPr>
+      <w:r>
+        <w:t>4. Table of Contents</w:t>
+      </w:r>
+    </w:p>
+    <w:p>
+      <w:pPr>
+        <w:ind w:left="360"/>
+      </w:pPr>
+      <w:r>
+        <w:t>5. Introduction</w:t>
+      </w:r>
+    </w:p>
+    <w:p>
+      <w:pPr>
+        <w:ind w:left="360"/>
+      </w:pPr>
+      <w:r>
+        <w:t>6. Problem Statement</w:t>
+      </w:r>
+    </w:p>
+    <w:p>
+      <w:pPr>
+        <w:ind w:left="360"/>
+      </w:pPr>
+      <w:r>
+        <w:t>7. Objectives</w:t>
+      </w:r>
+    </w:p>
+    <w:p>
+      <w:pPr>
+        <w:ind w:left="360"/>
+      </w:pPr>
+      <w:r>
+        <w:t>8. Scope of the Project</w:t>
+      </w:r>
+    </w:p>
+    <w:p>
+      <w:pPr>
+        <w:ind w:left="360"/>
+      </w:pPr>
+      <w:r>
+        <w:t>9. Existing System</w:t>
+      </w:r>
+    </w:p>
+    <w:p>
+      <w:pPr>
+        <w:ind w:left="360"/>
+      </w:pPr>
+      <w:r>
+        <w:t>10. Proposed System</w:t>
+      </w:r>
+    </w:p>
+    <w:p>
+      <w:pPr>
+        <w:ind w:left="360"/>
+      </w:pPr>
+      <w:r>
+        <w:t>11. System Requirements</w:t>
+      </w:r>
+    </w:p>
+    <w:p>
+      <w:pPr>
+        <w:ind w:left="360"/>
+      </w:pPr>
+      <w:r>
+        <w:t>12. Technology Stack</w:t>
+      </w:r>
+    </w:p>
+    <w:p>
+      <w:pPr>
+        <w:ind w:left="360"/>
+      </w:pPr>
+      <w:r>
+        <w:t>13. Project Architecture</w:t>
+      </w:r>
+    </w:p>
+    <w:p>
+      <w:pPr>
+        <w:ind w:left="360"/>
+      </w:pPr>
+      <w:r>
+        <w:t>14. Dataset</w:t>
+      </w:r>
+    </w:p>
+    <w:p>
+      <w:pPr>
+        <w:ind w:left="360"/>
+      </w:pPr>
+      <w:r>
+        <w:t>15. AI Model</w:t>
+      </w:r>
+    </w:p>
+    <w:p>
+      <w:pPr>
+        <w:ind w:left="360"/>
+      </w:pPr>
+      <w:r>
+        <w:t>16. Prediction Pipeline</w:t>
+      </w:r>
+    </w:p>
+    <w:p>
+      <w:pPr>
+        <w:ind w:left="360"/>
+      </w:pPr>
+      <w:r>
+        <w:t>17. Database Design</w:t>
+      </w:r>
+    </w:p>
+    <w:p>
+      <w:pPr>
+        <w:ind w:left="360"/>
+      </w:pPr>
+      <w:r>
+        <w:t>18. Flask Backend</w:t>
+      </w:r>
+    </w:p>
+    <w:p>
+      <w:pPr>
+        <w:ind w:left="360"/>
+      </w:pPr>
+      <w:r>
+        <w:t>19. Application Modules</w:t>
+      </w:r>
+    </w:p>
+    <w:p>
+      <w:pPr>
+        <w:ind w:left="360"/>
+      </w:pPr>
+      <w:r>
+        <w:t>20. User Interface</w:t>
+      </w:r>
+    </w:p>
+    <w:p>
+      <w:pPr>
+        <w:ind w:left="360"/>
+      </w:pPr>
+      <w:r>
+        <w:t>21. API Workflow</w:t>
+      </w:r>
+    </w:p>
+    <w:p>
+      <w:pPr>
+        <w:ind w:left="360"/>
+      </w:pPr>
+      <w:r>
+        <w:t>22. Authentication</w:t>
+      </w:r>
+    </w:p>
+    <w:p>
+      <w:pPr>
+        <w:ind w:left="360"/>
+      </w:pPr>
+      <w:r>
+        <w:t>23. Security</w:t>
+      </w:r>
+    </w:p>
+    <w:p>
+      <w:pPr>
+        <w:ind w:left="360"/>
+      </w:pPr>
+      <w:r>
+        <w:t>24. Testing</w:t>
+      </w:r>
+    </w:p>
+    <w:p>
+      <w:pPr>
+        <w:ind w:left="360"/>
+      </w:pPr>
+      <w:r>
+        <w:t>25. Performance Analysis</w:t>
+      </w:r>
+    </w:p>
+    <w:p>
+      <w:pPr>
+        <w:ind w:left="360"/>
+      </w:pPr>
+      <w:r>
+        <w:t>26. Results</w:t>
+      </w:r>
+    </w:p>
+    <w:p>
+      <w:pPr>
+        <w:ind w:left="360"/>
+      </w:pPr>
+      <w:r>
+        <w:t>27. Advantages</w:t>
+      </w:r>
+    </w:p>
+    <w:p>
+      <w:pPr>
+        <w:ind w:left="360"/>
+      </w:pPr>
+      <w:r>
+        <w:t>28. Limitations</w:t>
+      </w:r>
+    </w:p>
+    <w:p>
+      <w:pPr>
+        <w:ind w:left="360"/>
+      </w:pPr>
+      <w:r>
+        <w:t>29. Future Enhancements</w:t>
+      </w:r>
+    </w:p>
+    <w:p>
+      <w:pPr>
+        <w:ind w:left="360"/>
+      </w:pPr>
+      <w:r>
+        <w:t>30. Conclusion</w:t>
+      </w:r>
+    </w:p>
+    <w:p>
+      <w:pPr>
+        <w:ind w:left="360"/>
+      </w:pPr>
+      <w:r>
+        <w:t>31. References</w:t>
+      </w:r>
+    </w:p>
+    <w:p>
+      <w:pPr>
+        <w:ind w:left="360"/>
+      </w:pPr>
+      <w:r>
+        <w:t>32. Appendix</w:t>
       </w:r>
     </w:p>
     <w:p>

</xml_diff>

<commit_message>
docs: update QualiVision AI project report with latest development status
</commit_message>
<xml_diff>
--- a/QualiVision_AI_Project_Report.docx
+++ b/QualiVision_AI_Project_Report.docx
@@ -122,7 +122,7 @@
         <w:pStyle w:val="Heading1"/>
       </w:pPr>
       <w:r>
-        <w:t>2. Acknowledgement</w:t>
+        <w:t>Acknowledgement</w:t>
       </w:r>
     </w:p>
     <w:p>
@@ -131,11 +131,16 @@
       </w:r>
     </w:p>
     <w:p>
+      <w:r>
+        <w:br w:type="page"/>
+      </w:r>
+    </w:p>
+    <w:p>
       <w:pPr>
         <w:pStyle w:val="Heading1"/>
       </w:pPr>
       <w:r>
-        <w:t>3. Abstract</w:t>
+        <w:t>Abstract</w:t>
       </w:r>
     </w:p>
     <w:p>
@@ -149,275 +154,414 @@
       </w:r>
     </w:p>
     <w:p>
-      <w:pPr>
-        <w:pStyle w:val="Heading1"/>
-      </w:pPr>
       <w:r>
-        <w:t>4. Table of Contents</w:t>
+        <w:br w:type="page"/>
       </w:r>
     </w:p>
     <w:p>
       <w:pPr>
-        <w:ind w:left="360"/>
+        <w:pStyle w:val="Heading1"/>
       </w:pPr>
       <w:r>
-        <w:t>1. Cover Page</w:t>
+        <w:t>Table of Contents</w:t>
       </w:r>
     </w:p>
     <w:p>
-      <w:pPr>
-        <w:ind w:left="360"/>
-      </w:pPr>
       <w:r>
-        <w:t>2. Acknowledgement</w:t>
+        <w:fldChar w:fldCharType="begin"/>
+        <w:instrText xml:space="preserve">TOC \o "1-3" \h \z \u</w:instrText>
+        <w:fldChar w:fldCharType="separate"/>
+        <w:fldChar w:fldCharType="end"/>
       </w:r>
     </w:p>
     <w:p>
-      <w:pPr>
-        <w:ind w:left="360"/>
-      </w:pPr>
       <w:r>
-        <w:t>3. Abstract</w:t>
+        <w:br w:type="page"/>
       </w:r>
     </w:p>
     <w:p>
       <w:pPr>
-        <w:ind w:left="360"/>
+        <w:pStyle w:val="Heading1"/>
       </w:pPr>
       <w:r>
-        <w:t>4. Table of Contents</w:t>
+        <w:t>List of Figures</w:t>
       </w:r>
     </w:p>
     <w:p>
-      <w:pPr>
-        <w:ind w:left="360"/>
-      </w:pPr>
       <w:r>
-        <w:t>5. Introduction</w:t>
+        <w:fldChar w:fldCharType="begin"/>
+        <w:instrText xml:space="preserve">TOC \h \z \c "Figure"</w:instrText>
+        <w:fldChar w:fldCharType="separate"/>
+        <w:fldChar w:fldCharType="end"/>
       </w:r>
     </w:p>
     <w:p>
-      <w:pPr>
-        <w:ind w:left="360"/>
-      </w:pPr>
       <w:r>
-        <w:t>6. Problem Statement</w:t>
+        <w:br w:type="page"/>
       </w:r>
     </w:p>
     <w:p>
       <w:pPr>
-        <w:ind w:left="360"/>
+        <w:pStyle w:val="Heading1"/>
       </w:pPr>
       <w:r>
-        <w:t>7. Objectives</w:t>
+        <w:t>List of Tables</w:t>
       </w:r>
     </w:p>
     <w:p>
-      <w:pPr>
-        <w:ind w:left="360"/>
-      </w:pPr>
       <w:r>
-        <w:t>8. Scope of the Project</w:t>
+        <w:fldChar w:fldCharType="begin"/>
+        <w:instrText xml:space="preserve">TOC \h \z \c "Table"</w:instrText>
+        <w:fldChar w:fldCharType="separate"/>
+        <w:fldChar w:fldCharType="end"/>
       </w:r>
     </w:p>
     <w:p>
-      <w:pPr>
-        <w:ind w:left="360"/>
-      </w:pPr>
       <w:r>
-        <w:t>9. Existing System</w:t>
+        <w:br w:type="page"/>
       </w:r>
     </w:p>
     <w:p>
       <w:pPr>
-        <w:ind w:left="360"/>
+        <w:pStyle w:val="Heading1"/>
       </w:pPr>
       <w:r>
-        <w:t>10. Proposed System</w:t>
+        <w:t>Abbreviations</w:t>
       </w:r>
     </w:p>
     <w:p>
       <w:pPr>
-        <w:ind w:left="360"/>
+        <w:pStyle w:val="Caption"/>
+        <w:jc w:val="center"/>
       </w:pPr>
       <w:r>
-        <w:t>11. System Requirements</w:t>
+        <w:t xml:space="preserve">Table </w:t>
+        <w:fldChar w:fldCharType="begin"/>
+        <w:instrText xml:space="preserve">SEQ Table \* ARABIC</w:instrText>
+        <w:fldChar w:fldCharType="separate"/>
+        <w:t>1</w:t>
+        <w:fldChar w:fldCharType="end"/>
+      </w:r>
+      <w:r>
+        <w:t>: List of Abbreviations</w:t>
+      </w:r>
+    </w:p>
+    <w:tbl>
+      <w:tblPr>
+        <w:tblStyle w:val="TableGrid"/>
+        <w:tblW w:type="auto" w:w="0"/>
+        <w:tblLayout w:type="autofit"/>
+        <w:tblLook w:firstColumn="1" w:firstRow="1" w:lastColumn="0" w:lastRow="0" w:noHBand="0" w:noVBand="1" w:val="04A0"/>
+      </w:tblPr>
+      <w:tblGrid>
+        <w:gridCol w:w="4320"/>
+        <w:gridCol w:w="4320"/>
+      </w:tblGrid>
+      <w:tr>
+        <w:tc>
+          <w:tcPr>
+            <w:tcW w:type="dxa" w:w="4320"/>
+          </w:tcPr>
+          <w:p>
+            <w:r>
+              <w:rPr>
+                <w:b/>
+              </w:rPr>
+              <w:t>Abbreviation</w:t>
+            </w:r>
+          </w:p>
+        </w:tc>
+        <w:tc>
+          <w:tcPr>
+            <w:tcW w:type="dxa" w:w="4320"/>
+          </w:tcPr>
+          <w:p>
+            <w:r>
+              <w:rPr>
+                <w:b/>
+              </w:rPr>
+              <w:t>Full Form</w:t>
+            </w:r>
+          </w:p>
+        </w:tc>
+      </w:tr>
+      <w:tr>
+        <w:tc>
+          <w:tcPr>
+            <w:tcW w:type="dxa" w:w="4320"/>
+          </w:tcPr>
+          <w:p>
+            <w:r>
+              <w:t>AI</w:t>
+            </w:r>
+          </w:p>
+        </w:tc>
+        <w:tc>
+          <w:tcPr>
+            <w:tcW w:type="dxa" w:w="4320"/>
+          </w:tcPr>
+          <w:p>
+            <w:r>
+              <w:t>Artificial Intelligence</w:t>
+            </w:r>
+          </w:p>
+        </w:tc>
+      </w:tr>
+      <w:tr>
+        <w:tc>
+          <w:tcPr>
+            <w:tcW w:type="dxa" w:w="4320"/>
+          </w:tcPr>
+          <w:p>
+            <w:r>
+              <w:t>CNN</w:t>
+            </w:r>
+          </w:p>
+        </w:tc>
+        <w:tc>
+          <w:tcPr>
+            <w:tcW w:type="dxa" w:w="4320"/>
+          </w:tcPr>
+          <w:p>
+            <w:r>
+              <w:t>Convolutional Neural Network</w:t>
+            </w:r>
+          </w:p>
+        </w:tc>
+      </w:tr>
+      <w:tr>
+        <w:tc>
+          <w:tcPr>
+            <w:tcW w:type="dxa" w:w="4320"/>
+          </w:tcPr>
+          <w:p>
+            <w:r>
+              <w:t>ER</w:t>
+            </w:r>
+          </w:p>
+        </w:tc>
+        <w:tc>
+          <w:tcPr>
+            <w:tcW w:type="dxa" w:w="4320"/>
+          </w:tcPr>
+          <w:p>
+            <w:r>
+              <w:t>Entity-Relationship</w:t>
+            </w:r>
+          </w:p>
+        </w:tc>
+      </w:tr>
+      <w:tr>
+        <w:tc>
+          <w:tcPr>
+            <w:tcW w:type="dxa" w:w="4320"/>
+          </w:tcPr>
+          <w:p>
+            <w:r>
+              <w:t>Grad-CAM</w:t>
+            </w:r>
+          </w:p>
+        </w:tc>
+        <w:tc>
+          <w:tcPr>
+            <w:tcW w:type="dxa" w:w="4320"/>
+          </w:tcPr>
+          <w:p>
+            <w:r>
+              <w:t>Gradient-weighted Class Activation Mapping</w:t>
+            </w:r>
+          </w:p>
+        </w:tc>
+      </w:tr>
+      <w:tr>
+        <w:tc>
+          <w:tcPr>
+            <w:tcW w:type="dxa" w:w="4320"/>
+          </w:tcPr>
+          <w:p>
+            <w:r>
+              <w:t>LOF</w:t>
+            </w:r>
+          </w:p>
+        </w:tc>
+        <w:tc>
+          <w:tcPr>
+            <w:tcW w:type="dxa" w:w="4320"/>
+          </w:tcPr>
+          <w:p>
+            <w:r>
+              <w:t>List of Figures</w:t>
+            </w:r>
+          </w:p>
+        </w:tc>
+      </w:tr>
+      <w:tr>
+        <w:tc>
+          <w:tcPr>
+            <w:tcW w:type="dxa" w:w="4320"/>
+          </w:tcPr>
+          <w:p>
+            <w:r>
+              <w:t>LOT</w:t>
+            </w:r>
+          </w:p>
+        </w:tc>
+        <w:tc>
+          <w:tcPr>
+            <w:tcW w:type="dxa" w:w="4320"/>
+          </w:tcPr>
+          <w:p>
+            <w:r>
+              <w:t>List of Tables</w:t>
+            </w:r>
+          </w:p>
+        </w:tc>
+      </w:tr>
+      <w:tr>
+        <w:tc>
+          <w:tcPr>
+            <w:tcW w:type="dxa" w:w="4320"/>
+          </w:tcPr>
+          <w:p>
+            <w:r>
+              <w:t>MVC</w:t>
+            </w:r>
+          </w:p>
+        </w:tc>
+        <w:tc>
+          <w:tcPr>
+            <w:tcW w:type="dxa" w:w="4320"/>
+          </w:tcPr>
+          <w:p>
+            <w:r>
+              <w:t>Model-View-Controller</w:t>
+            </w:r>
+          </w:p>
+        </w:tc>
+      </w:tr>
+      <w:tr>
+        <w:tc>
+          <w:tcPr>
+            <w:tcW w:type="dxa" w:w="4320"/>
+          </w:tcPr>
+          <w:p>
+            <w:r>
+              <w:t>OOD</w:t>
+            </w:r>
+          </w:p>
+        </w:tc>
+        <w:tc>
+          <w:tcPr>
+            <w:tcW w:type="dxa" w:w="4320"/>
+          </w:tcPr>
+          <w:p>
+            <w:r>
+              <w:t>Out-of-Distribution</w:t>
+            </w:r>
+          </w:p>
+        </w:tc>
+      </w:tr>
+      <w:tr>
+        <w:tc>
+          <w:tcPr>
+            <w:tcW w:type="dxa" w:w="4320"/>
+          </w:tcPr>
+          <w:p>
+            <w:r>
+              <w:t>QC</w:t>
+            </w:r>
+          </w:p>
+        </w:tc>
+        <w:tc>
+          <w:tcPr>
+            <w:tcW w:type="dxa" w:w="4320"/>
+          </w:tcPr>
+          <w:p>
+            <w:r>
+              <w:t>Quality Control</w:t>
+            </w:r>
+          </w:p>
+        </w:tc>
+      </w:tr>
+      <w:tr>
+        <w:tc>
+          <w:tcPr>
+            <w:tcW w:type="dxa" w:w="4320"/>
+          </w:tcPr>
+          <w:p>
+            <w:r>
+              <w:t>RBAC</w:t>
+            </w:r>
+          </w:p>
+        </w:tc>
+        <w:tc>
+          <w:tcPr>
+            <w:tcW w:type="dxa" w:w="4320"/>
+          </w:tcPr>
+          <w:p>
+            <w:r>
+              <w:t>Role-Based Access Control</w:t>
+            </w:r>
+          </w:p>
+        </w:tc>
+      </w:tr>
+      <w:tr>
+        <w:tc>
+          <w:tcPr>
+            <w:tcW w:type="dxa" w:w="4320"/>
+          </w:tcPr>
+          <w:p>
+            <w:r>
+              <w:t>REST</w:t>
+            </w:r>
+          </w:p>
+        </w:tc>
+        <w:tc>
+          <w:tcPr>
+            <w:tcW w:type="dxa" w:w="4320"/>
+          </w:tcPr>
+          <w:p>
+            <w:r>
+              <w:t>Representational State Transfer</w:t>
+            </w:r>
+          </w:p>
+        </w:tc>
+      </w:tr>
+      <w:tr>
+        <w:tc>
+          <w:tcPr>
+            <w:tcW w:type="dxa" w:w="4320"/>
+          </w:tcPr>
+          <w:p>
+            <w:r>
+              <w:t>TOC</w:t>
+            </w:r>
+          </w:p>
+        </w:tc>
+        <w:tc>
+          <w:tcPr>
+            <w:tcW w:type="dxa" w:w="4320"/>
+          </w:tcPr>
+          <w:p>
+            <w:r>
+              <w:t>Table of Contents</w:t>
+            </w:r>
+          </w:p>
+        </w:tc>
+      </w:tr>
+    </w:tbl>
+    <w:p/>
+    <w:p>
+      <w:r>
+        <w:br w:type="page"/>
       </w:r>
     </w:p>
     <w:p>
       <w:pPr>
-        <w:ind w:left="360"/>
+        <w:pStyle w:val="Heading1"/>
       </w:pPr>
       <w:r>
-        <w:t>12. Technology Stack</w:t>
-      </w:r>
-    </w:p>
-    <w:p>
-      <w:pPr>
-        <w:ind w:left="360"/>
-      </w:pPr>
-      <w:r>
-        <w:t>13. Project Architecture</w:t>
-      </w:r>
-    </w:p>
-    <w:p>
-      <w:pPr>
-        <w:ind w:left="360"/>
-      </w:pPr>
-      <w:r>
-        <w:t>14. Dataset</w:t>
-      </w:r>
-    </w:p>
-    <w:p>
-      <w:pPr>
-        <w:ind w:left="360"/>
-      </w:pPr>
-      <w:r>
-        <w:t>15. AI Model</w:t>
-      </w:r>
-    </w:p>
-    <w:p>
-      <w:pPr>
-        <w:ind w:left="360"/>
-      </w:pPr>
-      <w:r>
-        <w:t>16. Prediction Pipeline</w:t>
-      </w:r>
-    </w:p>
-    <w:p>
-      <w:pPr>
-        <w:ind w:left="360"/>
-      </w:pPr>
-      <w:r>
-        <w:t>17. Database Design</w:t>
-      </w:r>
-    </w:p>
-    <w:p>
-      <w:pPr>
-        <w:ind w:left="360"/>
-      </w:pPr>
-      <w:r>
-        <w:t>18. Flask Backend</w:t>
-      </w:r>
-    </w:p>
-    <w:p>
-      <w:pPr>
-        <w:ind w:left="360"/>
-      </w:pPr>
-      <w:r>
-        <w:t>19. Application Modules</w:t>
-      </w:r>
-    </w:p>
-    <w:p>
-      <w:pPr>
-        <w:ind w:left="360"/>
-      </w:pPr>
-      <w:r>
-        <w:t>20. User Interface</w:t>
-      </w:r>
-    </w:p>
-    <w:p>
-      <w:pPr>
-        <w:ind w:left="360"/>
-      </w:pPr>
-      <w:r>
-        <w:t>21. API Workflow</w:t>
-      </w:r>
-    </w:p>
-    <w:p>
-      <w:pPr>
-        <w:ind w:left="360"/>
-      </w:pPr>
-      <w:r>
-        <w:t>22. Authentication</w:t>
-      </w:r>
-    </w:p>
-    <w:p>
-      <w:pPr>
-        <w:ind w:left="360"/>
-      </w:pPr>
-      <w:r>
-        <w:t>23. Security</w:t>
-      </w:r>
-    </w:p>
-    <w:p>
-      <w:pPr>
-        <w:ind w:left="360"/>
-      </w:pPr>
-      <w:r>
-        <w:t>24. Testing</w:t>
-      </w:r>
-    </w:p>
-    <w:p>
-      <w:pPr>
-        <w:ind w:left="360"/>
-      </w:pPr>
-      <w:r>
-        <w:t>25. Performance Analysis</w:t>
-      </w:r>
-    </w:p>
-    <w:p>
-      <w:pPr>
-        <w:ind w:left="360"/>
-      </w:pPr>
-      <w:r>
-        <w:t>26. Results</w:t>
-      </w:r>
-    </w:p>
-    <w:p>
-      <w:pPr>
-        <w:ind w:left="360"/>
-      </w:pPr>
-      <w:r>
-        <w:t>27. Advantages</w:t>
-      </w:r>
-    </w:p>
-    <w:p>
-      <w:pPr>
-        <w:ind w:left="360"/>
-      </w:pPr>
-      <w:r>
-        <w:t>28. Limitations</w:t>
-      </w:r>
-    </w:p>
-    <w:p>
-      <w:pPr>
-        <w:ind w:left="360"/>
-      </w:pPr>
-      <w:r>
-        <w:t>29. Future Enhancements</w:t>
-      </w:r>
-    </w:p>
-    <w:p>
-      <w:pPr>
-        <w:ind w:left="360"/>
-      </w:pPr>
-      <w:r>
-        <w:t>30. Conclusion</w:t>
-      </w:r>
-    </w:p>
-    <w:p>
-      <w:pPr>
-        <w:ind w:left="360"/>
-      </w:pPr>
-      <w:r>
-        <w:t>31. References</w:t>
-      </w:r>
-    </w:p>
-    <w:p>
-      <w:pPr>
-        <w:ind w:left="360"/>
-      </w:pPr>
-      <w:r>
-        <w:t>32. Appendix</w:t>
-      </w:r>
-    </w:p>
-    <w:p>
-      <w:pPr>
-        <w:pStyle w:val="Heading1"/>
-      </w:pPr>
-      <w:r>
-        <w:t>5. Introduction</w:t>
+        <w:t>1. Introduction</w:t>
       </w:r>
     </w:p>
     <w:p>
@@ -435,7 +579,7 @@
         <w:pStyle w:val="Heading1"/>
       </w:pPr>
       <w:r>
-        <w:t>6. Problem Statement</w:t>
+        <w:t>2. Problem Statement</w:t>
       </w:r>
     </w:p>
     <w:p>
@@ -448,7 +592,7 @@
         <w:pStyle w:val="ListBullet"/>
       </w:pPr>
       <w:r>
-        <w:t>• Slow: Cannot keep up with the physical throughput of conveyor belts.</w:t>
+        <w:t>Slow: Cannot keep up with the physical throughput of conveyor belts.</w:t>
       </w:r>
     </w:p>
     <w:p>
@@ -456,7 +600,7 @@
         <w:pStyle w:val="ListBullet"/>
       </w:pPr>
       <w:r>
-        <w:t>• Inconsistent: Prone to human error, visual fatigue, and subjective judgments.</w:t>
+        <w:t>Inconsistent: Prone to human error, visual fatigue, and subjective judgments.</w:t>
       </w:r>
     </w:p>
     <w:p>
@@ -464,7 +608,7 @@
         <w:pStyle w:val="ListBullet"/>
       </w:pPr>
       <w:r>
-        <w:t>• Labor Intensive: Requires dedicated, round-the-clock staffing for monotonous tasks.</w:t>
+        <w:t>Labor Intensive: Requires dedicated, round-the-clock staffing for monotonous tasks.</w:t>
       </w:r>
     </w:p>
     <w:p>
@@ -472,7 +616,7 @@
         <w:pStyle w:val="ListBullet"/>
       </w:pPr>
       <w:r>
-        <w:t>• Expensive: Results in high operational costs over time.</w:t>
+        <w:t>Expensive: Results in high operational costs over time.</w:t>
       </w:r>
     </w:p>
     <w:p>
@@ -480,7 +624,7 @@
         <w:pStyle w:val="Heading1"/>
       </w:pPr>
       <w:r>
-        <w:t>7. Objectives</w:t>
+        <w:t>3. Objectives</w:t>
       </w:r>
     </w:p>
     <w:p>
@@ -488,7 +632,7 @@
         <w:pStyle w:val="ListBullet"/>
       </w:pPr>
       <w:r>
-        <w:t>• To develop an automated vision system capable of identifying defective objects in real-time.</w:t>
+        <w:t>To develop an automated vision system capable of identifying defective objects in real-time.</w:t>
       </w:r>
     </w:p>
     <w:p>
@@ -496,7 +640,7 @@
         <w:pStyle w:val="ListBullet"/>
       </w:pPr>
       <w:r>
-        <w:t>• To provide Explainable AI (XAI) using Grad-CAM so operators can trust the model's decisions.</w:t>
+        <w:t>To provide Explainable AI (XAI) using Grad-CAM so operators can trust the model's decisions.</w:t>
       </w:r>
     </w:p>
     <w:p>
@@ -504,7 +648,7 @@
         <w:pStyle w:val="ListBullet"/>
       </w:pPr>
       <w:r>
-        <w:t>• To build an industrial dashboard for real-time monitoring and telemetry.</w:t>
+        <w:t>To build an industrial dashboard for real-time monitoring and telemetry.</w:t>
       </w:r>
     </w:p>
     <w:p>
@@ -512,7 +656,7 @@
         <w:pStyle w:val="ListBullet"/>
       </w:pPr>
       <w:r>
-        <w:t>• To implement persistent data logging and automated reporting for production managers.</w:t>
+        <w:t>To implement persistent data logging and automated reporting for production managers.</w:t>
       </w:r>
     </w:p>
     <w:p>
@@ -520,7 +664,7 @@
         <w:pStyle w:val="Heading1"/>
       </w:pPr>
       <w:r>
-        <w:t>8. Scope of the Project</w:t>
+        <w:t>4. Scope of the Project</w:t>
       </w:r>
     </w:p>
     <w:p>
@@ -533,7 +677,7 @@
         <w:pStyle w:val="Heading1"/>
       </w:pPr>
       <w:r>
-        <w:t>9. Existing System</w:t>
+        <w:t>5. Existing System</w:t>
       </w:r>
     </w:p>
     <w:p>
@@ -546,7 +690,7 @@
         <w:pStyle w:val="Heading1"/>
       </w:pPr>
       <w:r>
-        <w:t>10. Proposed System</w:t>
+        <w:t>6. Proposed System</w:t>
       </w:r>
     </w:p>
     <w:p>
@@ -559,7 +703,7 @@
         <w:pStyle w:val="Heading1"/>
       </w:pPr>
       <w:r>
-        <w:t>11. System Requirements</w:t>
+        <w:t>7. System Requirements</w:t>
       </w:r>
     </w:p>
     <w:p>
@@ -567,7 +711,7 @@
         <w:pStyle w:val="Heading2"/>
       </w:pPr>
       <w:r>
-        <w:t>Hardware Requirements</w:t>
+        <w:t>7.1 Hardware Requirements</w:t>
       </w:r>
     </w:p>
     <w:p>
@@ -575,7 +719,7 @@
         <w:pStyle w:val="ListBullet"/>
       </w:pPr>
       <w:r>
-        <w:t>• Processor: Intel Core i5 / AMD Ryzen 5 or higher</w:t>
+        <w:t>Processor: Intel Core i5 / AMD Ryzen 5 or higher</w:t>
       </w:r>
     </w:p>
     <w:p>
@@ -583,7 +727,7 @@
         <w:pStyle w:val="ListBullet"/>
       </w:pPr>
       <w:r>
-        <w:t>• RAM: 8 GB Minimum (16 GB Recommended)</w:t>
+        <w:t>RAM: 8 GB Minimum (16 GB Recommended)</w:t>
       </w:r>
     </w:p>
     <w:p>
@@ -591,7 +735,7 @@
         <w:pStyle w:val="ListBullet"/>
       </w:pPr>
       <w:r>
-        <w:t>• GPU: Dedicated NVIDIA GPU (e.g., RTX 3050) with CUDA support for inference</w:t>
+        <w:t>GPU: Dedicated NVIDIA GPU (e.g., RTX 3050) with CUDA support for inference</w:t>
       </w:r>
     </w:p>
     <w:p>
@@ -599,7 +743,7 @@
         <w:pStyle w:val="ListBullet"/>
       </w:pPr>
       <w:r>
-        <w:t>• Storage: 500 MB for application, additional space for datasets</w:t>
+        <w:t>Storage: 500 MB for application, additional space for datasets</w:t>
       </w:r>
     </w:p>
     <w:p>
@@ -607,7 +751,7 @@
         <w:pStyle w:val="Heading2"/>
       </w:pPr>
       <w:r>
-        <w:t>Software Requirements</w:t>
+        <w:t>7.2 Software Requirements</w:t>
       </w:r>
     </w:p>
     <w:p>
@@ -615,7 +759,7 @@
         <w:pStyle w:val="ListBullet"/>
       </w:pPr>
       <w:r>
-        <w:t>• OS: Windows 10/11, Ubuntu 20.04+, or macOS</w:t>
+        <w:t>OS: Windows 10/11, Ubuntu 20.04+, or macOS</w:t>
       </w:r>
     </w:p>
     <w:p>
@@ -623,7 +767,7 @@
         <w:pStyle w:val="ListBullet"/>
       </w:pPr>
       <w:r>
-        <w:t>• Python: 3.10+</w:t>
+        <w:t>Python: 3.10+</w:t>
       </w:r>
     </w:p>
     <w:p>
@@ -631,7 +775,7 @@
         <w:pStyle w:val="ListBullet"/>
       </w:pPr>
       <w:r>
-        <w:t>• Database: SQLite 3</w:t>
+        <w:t>Database: SQLite 3</w:t>
       </w:r>
     </w:p>
     <w:p>
@@ -639,47 +783,205 @@
         <w:pStyle w:val="Heading1"/>
       </w:pPr>
       <w:r>
-        <w:t>12. Technology Stack</w:t>
+        <w:t>8. Technology Stack</w:t>
       </w:r>
     </w:p>
     <w:p>
       <w:pPr>
-        <w:pStyle w:val="ListBullet"/>
+        <w:pStyle w:val="Caption"/>
+        <w:jc w:val="center"/>
       </w:pPr>
       <w:r>
-        <w:t>• Backend: Python, Flask, Flask-SocketIO, Flask-Limiter</w:t>
+        <w:t xml:space="preserve">Table </w:t>
+        <w:fldChar w:fldCharType="begin"/>
+        <w:instrText xml:space="preserve">SEQ Table \* ARABIC</w:instrText>
+        <w:fldChar w:fldCharType="separate"/>
+        <w:t>2</w:t>
+        <w:fldChar w:fldCharType="end"/>
+      </w:r>
+      <w:r>
+        <w:t>: Technology Stack Details</w:t>
       </w:r>
     </w:p>
+    <w:tbl>
+      <w:tblPr>
+        <w:tblStyle w:val="TableGrid"/>
+        <w:tblW w:type="auto" w:w="0"/>
+        <w:tblLayout w:type="autofit"/>
+        <w:tblLook w:firstColumn="1" w:firstRow="1" w:lastColumn="0" w:lastRow="0" w:noHBand="0" w:noVBand="1" w:val="04A0"/>
+      </w:tblPr>
+      <w:tblGrid>
+        <w:gridCol w:w="4320"/>
+        <w:gridCol w:w="4320"/>
+      </w:tblGrid>
+      <w:tr>
+        <w:tc>
+          <w:tcPr>
+            <w:tcW w:type="dxa" w:w="4320"/>
+          </w:tcPr>
+          <w:p>
+            <w:r>
+              <w:rPr>
+                <w:b/>
+              </w:rPr>
+              <w:t>Layer</w:t>
+            </w:r>
+          </w:p>
+        </w:tc>
+        <w:tc>
+          <w:tcPr>
+            <w:tcW w:type="dxa" w:w="4320"/>
+          </w:tcPr>
+          <w:p>
+            <w:r>
+              <w:rPr>
+                <w:b/>
+              </w:rPr>
+              <w:t>Technology</w:t>
+            </w:r>
+          </w:p>
+        </w:tc>
+      </w:tr>
+      <w:tr>
+        <w:tc>
+          <w:tcPr>
+            <w:tcW w:type="dxa" w:w="4320"/>
+          </w:tcPr>
+          <w:p>
+            <w:r>
+              <w:t>Frontend</w:t>
+            </w:r>
+          </w:p>
+        </w:tc>
+        <w:tc>
+          <w:tcPr>
+            <w:tcW w:type="dxa" w:w="4320"/>
+          </w:tcPr>
+          <w:p>
+            <w:r>
+              <w:t>HTML, CSS (Tailwind), JS</w:t>
+            </w:r>
+          </w:p>
+        </w:tc>
+      </w:tr>
+      <w:tr>
+        <w:tc>
+          <w:tcPr>
+            <w:tcW w:type="dxa" w:w="4320"/>
+          </w:tcPr>
+          <w:p>
+            <w:r>
+              <w:t>Backend</w:t>
+            </w:r>
+          </w:p>
+        </w:tc>
+        <w:tc>
+          <w:tcPr>
+            <w:tcW w:type="dxa" w:w="4320"/>
+          </w:tcPr>
+          <w:p>
+            <w:r>
+              <w:t>Flask, Flask-SocketIO</w:t>
+            </w:r>
+          </w:p>
+        </w:tc>
+      </w:tr>
+      <w:tr>
+        <w:tc>
+          <w:tcPr>
+            <w:tcW w:type="dxa" w:w="4320"/>
+          </w:tcPr>
+          <w:p>
+            <w:r>
+              <w:t>AI / ML</w:t>
+            </w:r>
+          </w:p>
+        </w:tc>
+        <w:tc>
+          <w:tcPr>
+            <w:tcW w:type="dxa" w:w="4320"/>
+          </w:tcPr>
+          <w:p>
+            <w:r>
+              <w:t>TensorFlow, Keras</w:t>
+            </w:r>
+          </w:p>
+        </w:tc>
+      </w:tr>
+      <w:tr>
+        <w:tc>
+          <w:tcPr>
+            <w:tcW w:type="dxa" w:w="4320"/>
+          </w:tcPr>
+          <w:p>
+            <w:r>
+              <w:t>Model</w:t>
+            </w:r>
+          </w:p>
+        </w:tc>
+        <w:tc>
+          <w:tcPr>
+            <w:tcW w:type="dxa" w:w="4320"/>
+          </w:tcPr>
+          <w:p>
+            <w:r>
+              <w:t>EfficientNetV2B0</w:t>
+            </w:r>
+          </w:p>
+        </w:tc>
+      </w:tr>
+      <w:tr>
+        <w:tc>
+          <w:tcPr>
+            <w:tcW w:type="dxa" w:w="4320"/>
+          </w:tcPr>
+          <w:p>
+            <w:r>
+              <w:t>Database</w:t>
+            </w:r>
+          </w:p>
+        </w:tc>
+        <w:tc>
+          <w:tcPr>
+            <w:tcW w:type="dxa" w:w="4320"/>
+          </w:tcPr>
+          <w:p>
+            <w:r>
+              <w:t>SQLite</w:t>
+            </w:r>
+          </w:p>
+        </w:tc>
+      </w:tr>
+      <w:tr>
+        <w:tc>
+          <w:tcPr>
+            <w:tcW w:type="dxa" w:w="4320"/>
+          </w:tcPr>
+          <w:p>
+            <w:r>
+              <w:t>Vision / Camera</w:t>
+            </w:r>
+          </w:p>
+        </w:tc>
+        <w:tc>
+          <w:tcPr>
+            <w:tcW w:type="dxa" w:w="4320"/>
+          </w:tcPr>
+          <w:p>
+            <w:r>
+              <w:t>OpenCV</w:t>
+            </w:r>
+          </w:p>
+        </w:tc>
+      </w:tr>
+    </w:tbl>
+    <w:p/>
     <w:p>
       <w:pPr>
-        <w:pStyle w:val="ListBullet"/>
+        <w:pStyle w:val="Heading1"/>
       </w:pPr>
       <w:r>
-        <w:t>• Frontend: HTML5, Vanilla JavaScript, TailwindCSS (for modern UI)</w:t>
-      </w:r>
-    </w:p>
-    <w:p>
-      <w:pPr>
-        <w:pStyle w:val="ListBullet"/>
-      </w:pPr>
-      <w:r>
-        <w:t>• AI/ML: TensorFlow 2.x, Keras, OpenCV, NumPy, Pillow</w:t>
-      </w:r>
-    </w:p>
-    <w:p>
-      <w:pPr>
-        <w:pStyle w:val="ListBullet"/>
-      </w:pPr>
-      <w:r>
-        <w:t>• Database: SQLite (via Python sqlite3 module)</w:t>
-      </w:r>
-    </w:p>
-    <w:p>
-      <w:pPr>
-        <w:pStyle w:val="Heading1"/>
-      </w:pPr>
-      <w:r>
-        <w:t>13. Project Architecture</w:t>
+        <w:t>9. Project Architecture</w:t>
       </w:r>
     </w:p>
     <w:p>
@@ -688,10 +990,176 @@
       </w:r>
     </w:p>
     <w:p>
+      <w:pPr>
+        <w:jc w:val="center"/>
+      </w:pPr>
+      <w:r>
+        <w:rPr>
+          <w:b/>
+        </w:rPr>
+        <w:t>Camera</w:t>
+      </w:r>
+    </w:p>
+    <w:p>
+      <w:pPr>
+        <w:jc w:val="center"/>
+      </w:pPr>
+      <w:r>
+        <w:t>↓</w:t>
+      </w:r>
+    </w:p>
+    <w:p>
+      <w:pPr>
+        <w:jc w:val="center"/>
+      </w:pPr>
+      <w:r>
+        <w:rPr>
+          <w:b/>
+        </w:rPr>
+        <w:t>OpenCV</w:t>
+      </w:r>
+    </w:p>
+    <w:p>
+      <w:pPr>
+        <w:jc w:val="center"/>
+      </w:pPr>
+      <w:r>
+        <w:t>↓</w:t>
+      </w:r>
+    </w:p>
+    <w:p>
+      <w:pPr>
+        <w:jc w:val="center"/>
+      </w:pPr>
+      <w:r>
+        <w:rPr>
+          <w:b/>
+        </w:rPr>
+        <w:t>Preprocessing</w:t>
+      </w:r>
+    </w:p>
+    <w:p>
+      <w:pPr>
+        <w:jc w:val="center"/>
+      </w:pPr>
+      <w:r>
+        <w:t>↓</w:t>
+      </w:r>
+    </w:p>
+    <w:p>
+      <w:pPr>
+        <w:jc w:val="center"/>
+      </w:pPr>
+      <w:r>
+        <w:rPr>
+          <w:b/>
+        </w:rPr>
+        <w:t>TensorFlow Model</w:t>
+      </w:r>
+    </w:p>
+    <w:p>
+      <w:pPr>
+        <w:jc w:val="center"/>
+      </w:pPr>
+      <w:r>
+        <w:t>↓</w:t>
+      </w:r>
+    </w:p>
+    <w:p>
+      <w:pPr>
+        <w:jc w:val="center"/>
+      </w:pPr>
+      <w:r>
+        <w:rPr>
+          <w:b/>
+        </w:rPr>
+        <w:t>Prediction</w:t>
+      </w:r>
+    </w:p>
+    <w:p>
+      <w:pPr>
+        <w:jc w:val="center"/>
+      </w:pPr>
+      <w:r>
+        <w:t>↓</w:t>
+      </w:r>
+    </w:p>
+    <w:p>
+      <w:pPr>
+        <w:jc w:val="center"/>
+      </w:pPr>
+      <w:r>
+        <w:rPr>
+          <w:b/>
+        </w:rPr>
+        <w:t>GradCAM</w:t>
+      </w:r>
+    </w:p>
+    <w:p>
+      <w:pPr>
+        <w:jc w:val="center"/>
+      </w:pPr>
+      <w:r>
+        <w:t>↓</w:t>
+      </w:r>
+    </w:p>
+    <w:p>
+      <w:pPr>
+        <w:jc w:val="center"/>
+      </w:pPr>
+      <w:r>
+        <w:rPr>
+          <w:b/>
+        </w:rPr>
+        <w:t>SQLite</w:t>
+      </w:r>
+    </w:p>
+    <w:p>
+      <w:pPr>
+        <w:jc w:val="center"/>
+      </w:pPr>
+      <w:r>
+        <w:t>↓</w:t>
+      </w:r>
+    </w:p>
+    <w:p>
+      <w:pPr>
+        <w:jc w:val="center"/>
+      </w:pPr>
+      <w:r>
+        <w:rPr>
+          <w:b/>
+        </w:rPr>
+        <w:t>Flask API</w:t>
+      </w:r>
+    </w:p>
+    <w:p>
+      <w:pPr>
+        <w:jc w:val="center"/>
+      </w:pPr>
+      <w:r>
+        <w:t>↓</w:t>
+      </w:r>
+    </w:p>
+    <w:p>
+      <w:pPr>
+        <w:jc w:val="center"/>
+      </w:pPr>
+      <w:r>
+        <w:rPr>
+          <w:b/>
+        </w:rPr>
+        <w:t>Dashboard</w:t>
+      </w:r>
+    </w:p>
+    <w:p>
+      <w:pPr>
+        <w:jc w:val="center"/>
+      </w:pPr>
       <w:r>
         <w:drawing>
           <wp:inline xmlns:a="http://schemas.openxmlformats.org/drawingml/2006/main" xmlns:pic="http://schemas.openxmlformats.org/drawingml/2006/picture">
-            <wp:extent cx="5486400" cy="4434840"/>
+            <wp:extent cx="4572000" cy="3695700"/>
             <wp:docPr id="1" name="Picture 1"/>
             <wp:cNvGraphicFramePr>
               <a:graphicFrameLocks noChangeAspect="1"/>
@@ -704,7 +1172,7 @@
                     <pic:cNvPicPr/>
                   </pic:nvPicPr>
                   <pic:blipFill>
-                    <a:blip r:embed="rId9"/>
+                    <a:blip r:embed="rId11"/>
                     <a:stretch>
                       <a:fillRect/>
                     </a:stretch>
@@ -712,7 +1180,7 @@
                   <pic:spPr>
                     <a:xfrm>
                       <a:off x="0" y="0"/>
-                      <a:ext cx="5486400" cy="4434840"/>
+                      <a:ext cx="4572000" cy="3695700"/>
                     </a:xfrm>
                     <a:prstGeom prst="rect"/>
                   </pic:spPr>
@@ -729,7 +1197,15 @@
         <w:jc w:val="center"/>
       </w:pPr>
       <w:r>
-        <w:t>Figure 1: Executive Dashboard Overview showing architecture implementation</w:t>
+        <w:t xml:space="preserve">Figure </w:t>
+        <w:fldChar w:fldCharType="begin"/>
+        <w:instrText xml:space="preserve">SEQ Figure \* ARABIC</w:instrText>
+        <w:fldChar w:fldCharType="separate"/>
+        <w:t>1</w:t>
+        <w:fldChar w:fldCharType="end"/>
+      </w:r>
+      <w:r>
+        <w:t>: Executive Dashboard Overview</w:t>
       </w:r>
     </w:p>
     <w:p>
@@ -737,54 +1213,208 @@
         <w:pStyle w:val="Heading1"/>
       </w:pPr>
       <w:r>
-        <w:t>14. Dataset</w:t>
-      </w:r>
-    </w:p>
-    <w:p>
-      <w:pPr>
-        <w:pStyle w:val="ListBullet"/>
-      </w:pPr>
-      <w:r>
-        <w:t>• Source: Aggregated from Roboflow and Kaggle open datasets.</w:t>
-      </w:r>
-    </w:p>
-    <w:p>
-      <w:pPr>
-        <w:pStyle w:val="ListBullet"/>
-      </w:pPr>
-      <w:r>
-        <w:t>• Collection: Focus on agricultural produce (Apples, Tomatoes, Oranges, Bananas).</w:t>
-      </w:r>
-    </w:p>
-    <w:p>
-      <w:pPr>
-        <w:pStyle w:val="ListBullet"/>
-      </w:pPr>
-      <w:r>
-        <w:t>• Cleaning: Removed corrupted images, extremely blurry samples, and duplicates.</w:t>
-      </w:r>
-    </w:p>
-    <w:p>
-      <w:pPr>
-        <w:pStyle w:val="ListBullet"/>
-      </w:pPr>
-      <w:r>
-        <w:t>• Preparation: Images resized to 224x224. Data augmentation applied (rotations, flips, contrast) to prevent overfitting.</w:t>
-      </w:r>
-    </w:p>
-    <w:p>
-      <w:pPr>
-        <w:pStyle w:val="ListBullet"/>
-      </w:pPr>
-      <w:r>
-        <w:t>• Statistics: Over 7,900 images, perfectly balanced between Fresh and Rotten classes.</w:t>
+        <w:t>10. Database Design</w:t>
       </w:r>
     </w:p>
     <w:p>
       <w:r>
+        <w:t>The SQLite database uses a relational structure linking users to their inspection activities and system configurations.</w:t>
+      </w:r>
+    </w:p>
+    <w:p>
+      <w:pPr>
+        <w:jc w:val="center"/>
+      </w:pPr>
+      <w:r>
+        <w:rPr>
+          <w:b/>
+        </w:rPr>
+        <w:t>Users (Authentication &amp; RBAC)</w:t>
+      </w:r>
+    </w:p>
+    <w:p>
+      <w:pPr>
+        <w:jc w:val="center"/>
+      </w:pPr>
+      <w:r>
+        <w:t>↓</w:t>
+      </w:r>
+    </w:p>
+    <w:p>
+      <w:pPr>
+        <w:jc w:val="center"/>
+      </w:pPr>
+      <w:r>
+        <w:rPr>
+          <w:b/>
+        </w:rPr>
+        <w:t>Predictions (Inspection Logs &amp; Metrics)</w:t>
+      </w:r>
+    </w:p>
+    <w:p>
+      <w:pPr>
+        <w:jc w:val="center"/>
+      </w:pPr>
+      <w:r>
+        <w:t>↓</w:t>
+      </w:r>
+    </w:p>
+    <w:p>
+      <w:pPr>
+        <w:jc w:val="center"/>
+      </w:pPr>
+      <w:r>
+        <w:rPr>
+          <w:b/>
+        </w:rPr>
+        <w:t>Settings (Global Configurations)</w:t>
+      </w:r>
+    </w:p>
+    <w:p>
+      <w:pPr>
+        <w:pStyle w:val="Heading1"/>
+      </w:pPr>
+      <w:r>
+        <w:t>11. Dataset</w:t>
+      </w:r>
+    </w:p>
+    <w:p>
+      <w:r>
+        <w:t>The neural network is trained on a rigorously prepared and audited agricultural dataset collected from open sources.</w:t>
+      </w:r>
+    </w:p>
+    <w:p>
+      <w:pPr>
+        <w:pStyle w:val="Caption"/>
+        <w:jc w:val="center"/>
+      </w:pPr>
+      <w:r>
+        <w:t xml:space="preserve">Table </w:t>
+        <w:fldChar w:fldCharType="begin"/>
+        <w:instrText xml:space="preserve">SEQ Table \* ARABIC</w:instrText>
+        <w:fldChar w:fldCharType="separate"/>
+        <w:t>3</w:t>
+        <w:fldChar w:fldCharType="end"/>
+      </w:r>
+      <w:r>
+        <w:t>: Dataset Class Distribution</w:t>
+      </w:r>
+    </w:p>
+    <w:tbl>
+      <w:tblPr>
+        <w:tblStyle w:val="TableGrid"/>
+        <w:tblW w:type="auto" w:w="0"/>
+        <w:tblLayout w:type="autofit"/>
+        <w:tblLook w:firstColumn="1" w:firstRow="1" w:lastColumn="0" w:lastRow="0" w:noHBand="0" w:noVBand="1" w:val="04A0"/>
+      </w:tblPr>
+      <w:tblGrid>
+        <w:gridCol w:w="4320"/>
+        <w:gridCol w:w="4320"/>
+      </w:tblGrid>
+      <w:tr>
+        <w:tc>
+          <w:tcPr>
+            <w:tcW w:type="dxa" w:w="4320"/>
+          </w:tcPr>
+          <w:p>
+            <w:r>
+              <w:rPr>
+                <w:b/>
+              </w:rPr>
+              <w:t>Class</w:t>
+            </w:r>
+          </w:p>
+        </w:tc>
+        <w:tc>
+          <w:tcPr>
+            <w:tcW w:type="dxa" w:w="4320"/>
+          </w:tcPr>
+          <w:p>
+            <w:r>
+              <w:rPr>
+                <w:b/>
+              </w:rPr>
+              <w:t>Images</w:t>
+            </w:r>
+          </w:p>
+        </w:tc>
+      </w:tr>
+      <w:tr>
+        <w:tc>
+          <w:tcPr>
+            <w:tcW w:type="dxa" w:w="4320"/>
+          </w:tcPr>
+          <w:p>
+            <w:r>
+              <w:t>Fresh Item</w:t>
+            </w:r>
+          </w:p>
+        </w:tc>
+        <w:tc>
+          <w:tcPr>
+            <w:tcW w:type="dxa" w:w="4320"/>
+          </w:tcPr>
+          <w:p>
+            <w:r>
+              <w:t>3,950</w:t>
+            </w:r>
+          </w:p>
+        </w:tc>
+      </w:tr>
+      <w:tr>
+        <w:tc>
+          <w:tcPr>
+            <w:tcW w:type="dxa" w:w="4320"/>
+          </w:tcPr>
+          <w:p>
+            <w:r>
+              <w:t>Rotten Item</w:t>
+            </w:r>
+          </w:p>
+        </w:tc>
+        <w:tc>
+          <w:tcPr>
+            <w:tcW w:type="dxa" w:w="4320"/>
+          </w:tcPr>
+          <w:p>
+            <w:r>
+              <w:t>3,950</w:t>
+            </w:r>
+          </w:p>
+        </w:tc>
+      </w:tr>
+      <w:tr>
+        <w:tc>
+          <w:tcPr>
+            <w:tcW w:type="dxa" w:w="4320"/>
+          </w:tcPr>
+          <w:p>
+            <w:r>
+              <w:t>Total</w:t>
+            </w:r>
+          </w:p>
+        </w:tc>
+        <w:tc>
+          <w:tcPr>
+            <w:tcW w:type="dxa" w:w="4320"/>
+          </w:tcPr>
+          <w:p>
+            <w:r>
+              <w:t>7,900</w:t>
+            </w:r>
+          </w:p>
+        </w:tc>
+      </w:tr>
+    </w:tbl>
+    <w:p/>
+    <w:p>
+      <w:pPr>
+        <w:jc w:val="center"/>
+      </w:pPr>
+      <w:r>
         <w:drawing>
           <wp:inline xmlns:a="http://schemas.openxmlformats.org/drawingml/2006/main" xmlns:pic="http://schemas.openxmlformats.org/drawingml/2006/picture">
-            <wp:extent cx="5486400" cy="3429000"/>
+            <wp:extent cx="4572000" cy="2857500"/>
             <wp:docPr id="2" name="Picture 2"/>
             <wp:cNvGraphicFramePr>
               <a:graphicFrameLocks noChangeAspect="1"/>
@@ -797,7 +1427,7 @@
                     <pic:cNvPicPr/>
                   </pic:nvPicPr>
                   <pic:blipFill>
-                    <a:blip r:embed="rId10"/>
+                    <a:blip r:embed="rId12"/>
                     <a:stretch>
                       <a:fillRect/>
                     </a:stretch>
@@ -805,7 +1435,7 @@
                   <pic:spPr>
                     <a:xfrm>
                       <a:off x="0" y="0"/>
-                      <a:ext cx="5486400" cy="3429000"/>
+                      <a:ext cx="4572000" cy="2857500"/>
                     </a:xfrm>
                     <a:prstGeom prst="rect"/>
                   </pic:spPr>
@@ -822,7 +1452,15 @@
         <w:jc w:val="center"/>
       </w:pPr>
       <w:r>
-        <w:t>Figure 2: Dataset Repository View</w:t>
+        <w:t xml:space="preserve">Figure </w:t>
+        <w:fldChar w:fldCharType="begin"/>
+        <w:instrText xml:space="preserve">SEQ Figure \* ARABIC</w:instrText>
+        <w:fldChar w:fldCharType="separate"/>
+        <w:t>2</w:t>
+        <w:fldChar w:fldCharType="end"/>
+      </w:r>
+      <w:r>
+        <w:t>: Dataset Repository User Interface</w:t>
       </w:r>
     </w:p>
     <w:p>
@@ -830,19 +1468,278 @@
         <w:pStyle w:val="Heading1"/>
       </w:pPr>
       <w:r>
-        <w:t>15. AI Model</w:t>
+        <w:t>12. AI Model</w:t>
       </w:r>
     </w:p>
     <w:p>
       <w:r>
-        <w:t>The core vision model is EfficientNetV2B0, known for its excellent trade-off between accuracy and computational efficiency. Transfer learning was utilized, starting with ImageNet weights and fine-tuning the dense layers for the binary classification task. The model was trained using the Adam optimizer with Binary Crossentropy loss. It achieves a 99.82% validation accuracy on the holdout set.</w:t>
+        <w:t>The core vision model is EfficientNetV2B0, known for its excellent trade-off between accuracy and computational efficiency. Transfer learning was utilized, starting with ImageNet weights and fine-tuning the dense layers for the binary classification task.</w:t>
       </w:r>
     </w:p>
     <w:p>
+      <w:pPr>
+        <w:pStyle w:val="Caption"/>
+        <w:jc w:val="center"/>
+      </w:pPr>
+      <w:r>
+        <w:t xml:space="preserve">Table </w:t>
+        <w:fldChar w:fldCharType="begin"/>
+        <w:instrText xml:space="preserve">SEQ Table \* ARABIC</w:instrText>
+        <w:fldChar w:fldCharType="separate"/>
+        <w:t>4</w:t>
+        <w:fldChar w:fldCharType="end"/>
+      </w:r>
+      <w:r>
+        <w:t>: AI Model Training Hyperparameters</w:t>
+      </w:r>
+    </w:p>
+    <w:tbl>
+      <w:tblPr>
+        <w:tblStyle w:val="TableGrid"/>
+        <w:tblW w:type="auto" w:w="0"/>
+        <w:tblLayout w:type="autofit"/>
+        <w:tblLook w:firstColumn="1" w:firstRow="1" w:lastColumn="0" w:lastRow="0" w:noHBand="0" w:noVBand="1" w:val="04A0"/>
+      </w:tblPr>
+      <w:tblGrid>
+        <w:gridCol w:w="4320"/>
+        <w:gridCol w:w="4320"/>
+      </w:tblGrid>
+      <w:tr>
+        <w:tc>
+          <w:tcPr>
+            <w:tcW w:type="dxa" w:w="4320"/>
+          </w:tcPr>
+          <w:p>
+            <w:r>
+              <w:rPr>
+                <w:b/>
+              </w:rPr>
+              <w:t>Parameter</w:t>
+            </w:r>
+          </w:p>
+        </w:tc>
+        <w:tc>
+          <w:tcPr>
+            <w:tcW w:type="dxa" w:w="4320"/>
+          </w:tcPr>
+          <w:p>
+            <w:r>
+              <w:rPr>
+                <w:b/>
+              </w:rPr>
+              <w:t>Value</w:t>
+            </w:r>
+          </w:p>
+        </w:tc>
+      </w:tr>
+      <w:tr>
+        <w:tc>
+          <w:tcPr>
+            <w:tcW w:type="dxa" w:w="4320"/>
+          </w:tcPr>
+          <w:p>
+            <w:r>
+              <w:t>Image Size</w:t>
+            </w:r>
+          </w:p>
+        </w:tc>
+        <w:tc>
+          <w:tcPr>
+            <w:tcW w:type="dxa" w:w="4320"/>
+          </w:tcPr>
+          <w:p>
+            <w:r>
+              <w:t>224 x 224 RGB</w:t>
+            </w:r>
+          </w:p>
+        </w:tc>
+      </w:tr>
+      <w:tr>
+        <w:tc>
+          <w:tcPr>
+            <w:tcW w:type="dxa" w:w="4320"/>
+          </w:tcPr>
+          <w:p>
+            <w:r>
+              <w:t>Batch Size</w:t>
+            </w:r>
+          </w:p>
+        </w:tc>
+        <w:tc>
+          <w:tcPr>
+            <w:tcW w:type="dxa" w:w="4320"/>
+          </w:tcPr>
+          <w:p>
+            <w:r>
+              <w:t>32</w:t>
+            </w:r>
+          </w:p>
+        </w:tc>
+      </w:tr>
+      <w:tr>
+        <w:tc>
+          <w:tcPr>
+            <w:tcW w:type="dxa" w:w="4320"/>
+          </w:tcPr>
+          <w:p>
+            <w:r>
+              <w:t>Epochs</w:t>
+            </w:r>
+          </w:p>
+        </w:tc>
+        <w:tc>
+          <w:tcPr>
+            <w:tcW w:type="dxa" w:w="4320"/>
+          </w:tcPr>
+          <w:p>
+            <w:r>
+              <w:t>25</w:t>
+            </w:r>
+          </w:p>
+        </w:tc>
+      </w:tr>
+      <w:tr>
+        <w:tc>
+          <w:tcPr>
+            <w:tcW w:type="dxa" w:w="4320"/>
+          </w:tcPr>
+          <w:p>
+            <w:r>
+              <w:t>Optimizer</w:t>
+            </w:r>
+          </w:p>
+        </w:tc>
+        <w:tc>
+          <w:tcPr>
+            <w:tcW w:type="dxa" w:w="4320"/>
+          </w:tcPr>
+          <w:p>
+            <w:r>
+              <w:t>Adam</w:t>
+            </w:r>
+          </w:p>
+        </w:tc>
+      </w:tr>
+      <w:tr>
+        <w:tc>
+          <w:tcPr>
+            <w:tcW w:type="dxa" w:w="4320"/>
+          </w:tcPr>
+          <w:p>
+            <w:r>
+              <w:t>Learning Rate</w:t>
+            </w:r>
+          </w:p>
+        </w:tc>
+        <w:tc>
+          <w:tcPr>
+            <w:tcW w:type="dxa" w:w="4320"/>
+          </w:tcPr>
+          <w:p>
+            <w:r>
+              <w:t>1e-4</w:t>
+            </w:r>
+          </w:p>
+        </w:tc>
+      </w:tr>
+      <w:tr>
+        <w:tc>
+          <w:tcPr>
+            <w:tcW w:type="dxa" w:w="4320"/>
+          </w:tcPr>
+          <w:p>
+            <w:r>
+              <w:t>Loss Function</w:t>
+            </w:r>
+          </w:p>
+        </w:tc>
+        <w:tc>
+          <w:tcPr>
+            <w:tcW w:type="dxa" w:w="4320"/>
+          </w:tcPr>
+          <w:p>
+            <w:r>
+              <w:t>Binary Crossentropy</w:t>
+            </w:r>
+          </w:p>
+        </w:tc>
+      </w:tr>
+      <w:tr>
+        <w:tc>
+          <w:tcPr>
+            <w:tcW w:type="dxa" w:w="4320"/>
+          </w:tcPr>
+          <w:p>
+            <w:r>
+              <w:t>Validation Accuracy</w:t>
+            </w:r>
+          </w:p>
+        </w:tc>
+        <w:tc>
+          <w:tcPr>
+            <w:tcW w:type="dxa" w:w="4320"/>
+          </w:tcPr>
+          <w:p>
+            <w:r>
+              <w:t>99.82%</w:t>
+            </w:r>
+          </w:p>
+        </w:tc>
+      </w:tr>
+      <w:tr>
+        <w:tc>
+          <w:tcPr>
+            <w:tcW w:type="dxa" w:w="4320"/>
+          </w:tcPr>
+          <w:p>
+            <w:r>
+              <w:t>Validation Loss</w:t>
+            </w:r>
+          </w:p>
+        </w:tc>
+        <w:tc>
+          <w:tcPr>
+            <w:tcW w:type="dxa" w:w="4320"/>
+          </w:tcPr>
+          <w:p>
+            <w:r>
+              <w:t>0.0076</w:t>
+            </w:r>
+          </w:p>
+        </w:tc>
+      </w:tr>
+      <w:tr>
+        <w:tc>
+          <w:tcPr>
+            <w:tcW w:type="dxa" w:w="4320"/>
+          </w:tcPr>
+          <w:p>
+            <w:r>
+              <w:t>Training Time</w:t>
+            </w:r>
+          </w:p>
+        </w:tc>
+        <w:tc>
+          <w:tcPr>
+            <w:tcW w:type="dxa" w:w="4320"/>
+          </w:tcPr>
+          <w:p>
+            <w:r>
+              <w:t>~45 minutes (RTX 3050)</w:t>
+            </w:r>
+          </w:p>
+        </w:tc>
+      </w:tr>
+    </w:tbl>
+    <w:p/>
+    <w:p>
+      <w:pPr>
+        <w:jc w:val="center"/>
+      </w:pPr>
       <w:r>
         <w:drawing>
           <wp:inline xmlns:a="http://schemas.openxmlformats.org/drawingml/2006/main" xmlns:pic="http://schemas.openxmlformats.org/drawingml/2006/picture">
-            <wp:extent cx="5486400" cy="4278630"/>
+            <wp:extent cx="4572000" cy="3565525"/>
             <wp:docPr id="3" name="Picture 3"/>
             <wp:cNvGraphicFramePr>
               <a:graphicFrameLocks noChangeAspect="1"/>
@@ -855,7 +1752,7 @@
                     <pic:cNvPicPr/>
                   </pic:nvPicPr>
                   <pic:blipFill>
-                    <a:blip r:embed="rId11"/>
+                    <a:blip r:embed="rId13"/>
                     <a:stretch>
                       <a:fillRect/>
                     </a:stretch>
@@ -863,7 +1760,7 @@
                   <pic:spPr>
                     <a:xfrm>
                       <a:off x="0" y="0"/>
-                      <a:ext cx="5486400" cy="4278630"/>
+                      <a:ext cx="4572000" cy="3565525"/>
                     </a:xfrm>
                     <a:prstGeom prst="rect"/>
                   </pic:spPr>
@@ -880,7 +1777,15 @@
         <w:jc w:val="center"/>
       </w:pPr>
       <w:r>
-        <w:t>Figure 3: Model Management View</w:t>
+        <w:t xml:space="preserve">Figure </w:t>
+        <w:fldChar w:fldCharType="begin"/>
+        <w:instrText xml:space="preserve">SEQ Figure \* ARABIC</w:instrText>
+        <w:fldChar w:fldCharType="separate"/>
+        <w:t>3</w:t>
+        <w:fldChar w:fldCharType="end"/>
+      </w:r>
+      <w:r>
+        <w:t>: Model Management Interface</w:t>
       </w:r>
     </w:p>
     <w:p>
@@ -888,153 +1793,484 @@
         <w:pStyle w:val="Heading1"/>
       </w:pPr>
       <w:r>
-        <w:t>16. Prediction Pipeline</w:t>
+        <w:t>13. Prediction Pipeline Workflow</w:t>
+      </w:r>
+    </w:p>
+    <w:p>
+      <w:pPr>
+        <w:jc w:val="center"/>
+      </w:pPr>
+      <w:r>
+        <w:rPr>
+          <w:b/>
+        </w:rPr>
+        <w:t>Start</w:t>
+      </w:r>
+    </w:p>
+    <w:p>
+      <w:pPr>
+        <w:jc w:val="center"/>
+      </w:pPr>
+      <w:r>
+        <w:t>↓</w:t>
+      </w:r>
+    </w:p>
+    <w:p>
+      <w:pPr>
+        <w:jc w:val="center"/>
+      </w:pPr>
+      <w:r>
+        <w:rPr>
+          <w:b/>
+        </w:rPr>
+        <w:t>Upload Image / Live Stream</w:t>
+      </w:r>
+    </w:p>
+    <w:p>
+      <w:pPr>
+        <w:jc w:val="center"/>
+      </w:pPr>
+      <w:r>
+        <w:t>↓</w:t>
+      </w:r>
+    </w:p>
+    <w:p>
+      <w:pPr>
+        <w:jc w:val="center"/>
+      </w:pPr>
+      <w:r>
+        <w:rPr>
+          <w:b/>
+        </w:rPr>
+        <w:t>Preprocessing &amp; Normalization</w:t>
+      </w:r>
+    </w:p>
+    <w:p>
+      <w:pPr>
+        <w:jc w:val="center"/>
+      </w:pPr>
+      <w:r>
+        <w:t>↓</w:t>
+      </w:r>
+    </w:p>
+    <w:p>
+      <w:pPr>
+        <w:jc w:val="center"/>
+      </w:pPr>
+      <w:r>
+        <w:rPr>
+          <w:b/>
+        </w:rPr>
+        <w:t>Prediction Inference</w:t>
+      </w:r>
+    </w:p>
+    <w:p>
+      <w:pPr>
+        <w:jc w:val="center"/>
+      </w:pPr>
+      <w:r>
+        <w:t>↓</w:t>
+      </w:r>
+    </w:p>
+    <w:p>
+      <w:pPr>
+        <w:jc w:val="center"/>
+      </w:pPr>
+      <w:r>
+        <w:rPr>
+          <w:b/>
+        </w:rPr>
+        <w:t>Confidence Threshold Check (&gt; 65%)</w:t>
+      </w:r>
+    </w:p>
+    <w:p>
+      <w:pPr>
+        <w:jc w:val="center"/>
+      </w:pPr>
+      <w:r>
+        <w:t>↓</w:t>
+      </w:r>
+    </w:p>
+    <w:p>
+      <w:pPr>
+        <w:jc w:val="center"/>
+      </w:pPr>
+      <w:r>
+        <w:rPr>
+          <w:b/>
+        </w:rPr>
+        <w:t>Result: Fresh / Rotten / Unknown</w:t>
+      </w:r>
+    </w:p>
+    <w:p>
+      <w:pPr>
+        <w:jc w:val="center"/>
+      </w:pPr>
+      <w:r>
+        <w:t>↓</w:t>
+      </w:r>
+    </w:p>
+    <w:p>
+      <w:pPr>
+        <w:jc w:val="center"/>
+      </w:pPr>
+      <w:r>
+        <w:rPr>
+          <w:b/>
+        </w:rPr>
+        <w:t>Generate Grad-CAM</w:t>
+      </w:r>
+    </w:p>
+    <w:p>
+      <w:pPr>
+        <w:jc w:val="center"/>
+      </w:pPr>
+      <w:r>
+        <w:t>↓</w:t>
+      </w:r>
+    </w:p>
+    <w:p>
+      <w:pPr>
+        <w:jc w:val="center"/>
+      </w:pPr>
+      <w:r>
+        <w:rPr>
+          <w:b/>
+        </w:rPr>
+        <w:t>Store Result in DB</w:t>
+      </w:r>
+    </w:p>
+    <w:p>
+      <w:pPr>
+        <w:jc w:val="center"/>
+      </w:pPr>
+      <w:r>
+        <w:t>↓</w:t>
+      </w:r>
+    </w:p>
+    <w:p>
+      <w:pPr>
+        <w:jc w:val="center"/>
+      </w:pPr>
+      <w:r>
+        <w:rPr>
+          <w:b/>
+        </w:rPr>
+        <w:t>Surface to Dashboard via WebSocket/API</w:t>
+      </w:r>
+    </w:p>
+    <w:p>
+      <w:pPr>
+        <w:pStyle w:val="Heading1"/>
+      </w:pPr>
+      <w:r>
+        <w:t>14. Flask Backend &amp; APIs</w:t>
       </w:r>
     </w:p>
     <w:p>
       <w:r>
-        <w:t>1. Image Capture: OpenCV captures a frame from the live feed or the user uploads a file.</w:t>
+        <w:t>The backend is structured using Flask Blueprints to separate concerns. REST APIs power the dynamic nature of the app.</w:t>
+      </w:r>
+    </w:p>
+    <w:p>
+      <w:pPr>
+        <w:pStyle w:val="Caption"/>
+        <w:jc w:val="center"/>
+      </w:pPr>
+      <w:r>
+        <w:t xml:space="preserve">Table </w:t>
+        <w:fldChar w:fldCharType="begin"/>
+        <w:instrText xml:space="preserve">SEQ Table \* ARABIC</w:instrText>
+        <w:fldChar w:fldCharType="separate"/>
+        <w:t>5</w:t>
+        <w:fldChar w:fldCharType="end"/>
+      </w:r>
+      <w:r>
+        <w:t>: Core API Endpoints</w:t>
+      </w:r>
+    </w:p>
+    <w:tbl>
+      <w:tblPr>
+        <w:tblStyle w:val="TableGrid"/>
+        <w:tblW w:type="auto" w:w="0"/>
+        <w:tblLayout w:type="autofit"/>
+        <w:tblLook w:firstColumn="1" w:firstRow="1" w:lastColumn="0" w:lastRow="0" w:noHBand="0" w:noVBand="1" w:val="04A0"/>
+      </w:tblPr>
+      <w:tblGrid>
+        <w:gridCol w:w="2880"/>
+        <w:gridCol w:w="2880"/>
+        <w:gridCol w:w="2880"/>
+      </w:tblGrid>
+      <w:tr>
+        <w:tc>
+          <w:tcPr>
+            <w:tcW w:type="dxa" w:w="2880"/>
+          </w:tcPr>
+          <w:p>
+            <w:r>
+              <w:rPr>
+                <w:b/>
+              </w:rPr>
+              <w:t>Endpoint</w:t>
+            </w:r>
+          </w:p>
+        </w:tc>
+        <w:tc>
+          <w:tcPr>
+            <w:tcW w:type="dxa" w:w="2880"/>
+          </w:tcPr>
+          <w:p>
+            <w:r>
+              <w:rPr>
+                <w:b/>
+              </w:rPr>
+              <w:t>Method</w:t>
+            </w:r>
+          </w:p>
+        </w:tc>
+        <w:tc>
+          <w:tcPr>
+            <w:tcW w:type="dxa" w:w="2880"/>
+          </w:tcPr>
+          <w:p>
+            <w:r>
+              <w:rPr>
+                <w:b/>
+              </w:rPr>
+              <w:t>Purpose</w:t>
+            </w:r>
+          </w:p>
+        </w:tc>
+      </w:tr>
+      <w:tr>
+        <w:tc>
+          <w:tcPr>
+            <w:tcW w:type="dxa" w:w="2880"/>
+          </w:tcPr>
+          <w:p>
+            <w:r>
+              <w:t>/api/predict</w:t>
+            </w:r>
+          </w:p>
+        </w:tc>
+        <w:tc>
+          <w:tcPr>
+            <w:tcW w:type="dxa" w:w="2880"/>
+          </w:tcPr>
+          <w:p>
+            <w:r>
+              <w:t>POST</w:t>
+            </w:r>
+          </w:p>
+        </w:tc>
+        <w:tc>
+          <w:tcPr>
+            <w:tcW w:type="dxa" w:w="2880"/>
+          </w:tcPr>
+          <w:p>
+            <w:r>
+              <w:t>Execute inference on uploaded image</w:t>
+            </w:r>
+          </w:p>
+        </w:tc>
+      </w:tr>
+      <w:tr>
+        <w:tc>
+          <w:tcPr>
+            <w:tcW w:type="dxa" w:w="2880"/>
+          </w:tcPr>
+          <w:p>
+            <w:r>
+              <w:t>/api/history</w:t>
+            </w:r>
+          </w:p>
+        </w:tc>
+        <w:tc>
+          <w:tcPr>
+            <w:tcW w:type="dxa" w:w="2880"/>
+          </w:tcPr>
+          <w:p>
+            <w:r>
+              <w:t>GET</w:t>
+            </w:r>
+          </w:p>
+        </w:tc>
+        <w:tc>
+          <w:tcPr>
+            <w:tcW w:type="dxa" w:w="2880"/>
+          </w:tcPr>
+          <w:p>
+            <w:r>
+              <w:t>Fetch, filter, and search inspection history logs</w:t>
+            </w:r>
+          </w:p>
+        </w:tc>
+      </w:tr>
+      <w:tr>
+        <w:tc>
+          <w:tcPr>
+            <w:tcW w:type="dxa" w:w="2880"/>
+          </w:tcPr>
+          <w:p>
+            <w:r>
+              <w:t>/api/stats</w:t>
+            </w:r>
+          </w:p>
+        </w:tc>
+        <w:tc>
+          <w:tcPr>
+            <w:tcW w:type="dxa" w:w="2880"/>
+          </w:tcPr>
+          <w:p>
+            <w:r>
+              <w:t>GET</w:t>
+            </w:r>
+          </w:p>
+        </w:tc>
+        <w:tc>
+          <w:tcPr>
+            <w:tcW w:type="dxa" w:w="2880"/>
+          </w:tcPr>
+          <w:p>
+            <w:r>
+              <w:t>Retrieve real-time dashboard telemetry and statistics</w:t>
+            </w:r>
+          </w:p>
+        </w:tc>
+      </w:tr>
+      <w:tr>
+        <w:tc>
+          <w:tcPr>
+            <w:tcW w:type="dxa" w:w="2880"/>
+          </w:tcPr>
+          <w:p>
+            <w:r>
+              <w:t>/api/report</w:t>
+            </w:r>
+          </w:p>
+        </w:tc>
+        <w:tc>
+          <w:tcPr>
+            <w:tcW w:type="dxa" w:w="2880"/>
+          </w:tcPr>
+          <w:p>
+            <w:r>
+              <w:t>GET</w:t>
+            </w:r>
+          </w:p>
+        </w:tc>
+        <w:tc>
+          <w:tcPr>
+            <w:tcW w:type="dxa" w:w="2880"/>
+          </w:tcPr>
+          <w:p>
+            <w:r>
+              <w:t>Generate and export PDF/CSV analytical reports</w:t>
+            </w:r>
+          </w:p>
+        </w:tc>
+      </w:tr>
+    </w:tbl>
+    <w:p/>
+    <w:p>
+      <w:pPr>
+        <w:pStyle w:val="Heading1"/>
+      </w:pPr>
+      <w:r>
+        <w:t>15. Application Modules</w:t>
+      </w:r>
+    </w:p>
+    <w:p>
+      <w:pPr>
+        <w:pStyle w:val="Heading2"/>
+      </w:pPr>
+      <w:r>
+        <w:t>15.1 Executive Dashboard</w:t>
       </w:r>
     </w:p>
     <w:p>
       <w:r>
-        <w:t>2. Preprocessing: Resized to 224x224 and converted to array.</w:t>
+        <w:t>The Executive Dashboard acts as the central nerve center for the QualiVision AI system. It provides high-level telemetry, displaying total inspections, pass/fail rates, and live activity streams. The UI utilizes dark mode elements and glassmorphism to present critical industrial data in a clean, modern way without overwhelming the operator.</w:t>
+      </w:r>
+    </w:p>
+    <w:p>
+      <w:pPr>
+        <w:jc w:val="center"/>
+      </w:pPr>
+      <w:r>
+        <w:drawing>
+          <wp:inline xmlns:a="http://schemas.openxmlformats.org/drawingml/2006/main" xmlns:pic="http://schemas.openxmlformats.org/drawingml/2006/picture">
+            <wp:extent cx="4572000" cy="3695700"/>
+            <wp:docPr id="4" name="Picture 4"/>
+            <wp:cNvGraphicFramePr>
+              <a:graphicFrameLocks noChangeAspect="1"/>
+            </wp:cNvGraphicFramePr>
+            <a:graphic>
+              <a:graphicData uri="http://schemas.openxmlformats.org/drawingml/2006/picture">
+                <pic:pic>
+                  <pic:nvPicPr>
+                    <pic:cNvPr id="0" name="02-dashboard.png"/>
+                    <pic:cNvPicPr/>
+                  </pic:nvPicPr>
+                  <pic:blipFill>
+                    <a:blip r:embed="rId11"/>
+                    <a:stretch>
+                      <a:fillRect/>
+                    </a:stretch>
+                  </pic:blipFill>
+                  <pic:spPr>
+                    <a:xfrm>
+                      <a:off x="0" y="0"/>
+                      <a:ext cx="4572000" cy="3695700"/>
+                    </a:xfrm>
+                    <a:prstGeom prst="rect"/>
+                  </pic:spPr>
+                </pic:pic>
+              </a:graphicData>
+            </a:graphic>
+          </wp:inline>
+        </w:drawing>
+      </w:r>
+    </w:p>
+    <w:p>
+      <w:pPr>
+        <w:pStyle w:val="Caption"/>
+        <w:jc w:val="center"/>
+      </w:pPr>
+      <w:r>
+        <w:t xml:space="preserve">Figure </w:t>
+        <w:fldChar w:fldCharType="begin"/>
+        <w:instrText xml:space="preserve">SEQ Figure \* ARABIC</w:instrText>
+        <w:fldChar w:fldCharType="separate"/>
+        <w:t>4</w:t>
+        <w:fldChar w:fldCharType="end"/>
+      </w:r>
+      <w:r>
+        <w:t>: Executive Dashboard Module</w:t>
+      </w:r>
+    </w:p>
+    <w:p>
+      <w:pPr>
+        <w:pStyle w:val="Heading2"/>
+      </w:pPr>
+      <w:r>
+        <w:t>15.2 Live Monitoring</w:t>
       </w:r>
     </w:p>
     <w:p>
       <w:r>
-        <w:t>3. Normalization: Pixel values scaled depending on the EfficientNet requirements.</w:t>
+        <w:t>This module integrates directly with factory webcams or IP cameras to provide a continuous, real-time stream. OpenCV captures frames asynchronously, pushing them through the TensorFlow model, and broadcasting the prediction overlay back to the user via MJPEG streaming. This allows operators to monitor the conveyor belt dynamically.</w:t>
       </w:r>
     </w:p>
     <w:p>
-      <w:r>
-        <w:t>4. Inference: TensorFlow model generates probability scores.</w:t>
-      </w:r>
-    </w:p>
-    <w:p>
-      <w:r>
-        <w:t>5. Thresholding: Checks for Out-of-Distribution (OOD). If confidence &lt; 65%, flagged as 'Unknown'.</w:t>
-      </w:r>
-    </w:p>
-    <w:p>
-      <w:r>
-        <w:t>6. Grad-CAM: Generates a heat map overlay highlighting the defective areas.</w:t>
-      </w:r>
-    </w:p>
-    <w:p>
-      <w:r>
-        <w:t>7. Dashboard: Pushes JSON payload and image URL to the frontend via API.</w:t>
-      </w:r>
-    </w:p>
-    <w:p>
-      <w:pPr>
-        <w:pStyle w:val="Heading1"/>
-      </w:pPr>
-      <w:r>
-        <w:t>17. Database Design</w:t>
-      </w:r>
-    </w:p>
-    <w:p>
-      <w:r>
-        <w:t>The SQLite database consists of:</w:t>
-      </w:r>
-    </w:p>
-    <w:p>
-      <w:pPr>
-        <w:pStyle w:val="ListBullet"/>
-      </w:pPr>
-      <w:r>
-        <w:t>• users table: id, username, password_hash, role.</w:t>
-      </w:r>
-    </w:p>
-    <w:p>
-      <w:pPr>
-        <w:pStyle w:val="ListBullet"/>
-      </w:pPr>
-      <w:r>
-        <w:t>• predictions table: id, inspection_id, timestamp, filename, prediction, confidence, status, inference_time_ms, image_path, gradcam_path, machine_id, operator, batch_id, notes.</w:t>
-      </w:r>
-    </w:p>
-    <w:p>
-      <w:pPr>
-        <w:pStyle w:val="ListBullet"/>
-      </w:pPr>
-      <w:r>
-        <w:t>• settings table: Key-value store for application configuration.</w:t>
-      </w:r>
-    </w:p>
-    <w:p>
-      <w:pPr>
-        <w:pStyle w:val="Heading1"/>
-      </w:pPr>
-      <w:r>
-        <w:t>18. Flask Backend</w:t>
-      </w:r>
-    </w:p>
-    <w:p>
-      <w:r>
-        <w:t>The backend is structured using Flask Blueprints to separate concerns:</w:t>
-      </w:r>
-    </w:p>
-    <w:p>
-      <w:pPr>
-        <w:pStyle w:val="ListBullet"/>
-      </w:pPr>
-      <w:r>
-        <w:t>• app/routes/auth.py: Handles login and sessions.</w:t>
-      </w:r>
-    </w:p>
-    <w:p>
-      <w:pPr>
-        <w:pStyle w:val="ListBullet"/>
-      </w:pPr>
-      <w:r>
-        <w:t>• app/routes/api.py: JSON endpoints for history, analytics, and predictions.</w:t>
-      </w:r>
-    </w:p>
-    <w:p>
-      <w:pPr>
-        <w:pStyle w:val="ListBullet"/>
-      </w:pPr>
-      <w:r>
-        <w:t>• app/routes/dashboard.py: Serves the HTML views.</w:t>
-      </w:r>
-    </w:p>
-    <w:p>
-      <w:pPr>
-        <w:pStyle w:val="ListBullet"/>
-      </w:pPr>
-      <w:r>
-        <w:t>• app/services/predictor.py: Encapsulates the TensorFlow model loading and inference logic.</w:t>
-      </w:r>
-    </w:p>
-    <w:p>
-      <w:pPr>
-        <w:pStyle w:val="ListBullet"/>
-      </w:pPr>
-      <w:r>
-        <w:t>• app/services/database.py: Database connection pooling and CRUD operations.</w:t>
-      </w:r>
-    </w:p>
-    <w:p>
-      <w:pPr>
-        <w:pStyle w:val="Heading1"/>
-      </w:pPr>
-      <w:r>
-        <w:t>19. Application Modules</w:t>
-      </w:r>
-    </w:p>
-    <w:p>
-      <w:r>
-        <w:t>• Live Monitor: Connects to a webcam stream and runs a continuous background thread for detection.</w:t>
-      </w:r>
-    </w:p>
-    <w:p>
+      <w:pPr>
+        <w:jc w:val="center"/>
+      </w:pPr>
       <w:r>
         <w:drawing>
           <wp:inline xmlns:a="http://schemas.openxmlformats.org/drawingml/2006/main" xmlns:pic="http://schemas.openxmlformats.org/drawingml/2006/picture">
-            <wp:extent cx="5486400" cy="3429000"/>
-            <wp:docPr id="4" name="Picture 4"/>
+            <wp:extent cx="4572000" cy="2857500"/>
+            <wp:docPr id="5" name="Picture 5"/>
             <wp:cNvGraphicFramePr>
               <a:graphicFrameLocks noChangeAspect="1"/>
             </wp:cNvGraphicFramePr>
@@ -1046,7 +2282,7 @@
                     <pic:cNvPicPr/>
                   </pic:nvPicPr>
                   <pic:blipFill>
-                    <a:blip r:embed="rId12"/>
+                    <a:blip r:embed="rId14"/>
                     <a:stretch>
                       <a:fillRect/>
                     </a:stretch>
@@ -1054,7 +2290,7 @@
                   <pic:spPr>
                     <a:xfrm>
                       <a:off x="0" y="0"/>
-                      <a:ext cx="5486400" cy="3429000"/>
+                      <a:ext cx="4572000" cy="2857500"/>
                     </a:xfrm>
                     <a:prstGeom prst="rect"/>
                   </pic:spPr>
@@ -1071,20 +2307,39 @@
         <w:jc w:val="center"/>
       </w:pPr>
       <w:r>
-        <w:t>Figure 4: Live Monitoring Module</w:t>
+        <w:t xml:space="preserve">Figure </w:t>
+        <w:fldChar w:fldCharType="begin"/>
+        <w:instrText xml:space="preserve">SEQ Figure \* ARABIC</w:instrText>
+        <w:fldChar w:fldCharType="separate"/>
+        <w:t>5</w:t>
+        <w:fldChar w:fldCharType="end"/>
+      </w:r>
+      <w:r>
+        <w:t>: Live Camera Monitoring Module</w:t>
+      </w:r>
+    </w:p>
+    <w:p>
+      <w:pPr>
+        <w:pStyle w:val="Heading2"/>
+      </w:pPr>
+      <w:r>
+        <w:t>15.3 Inspection Studio</w:t>
       </w:r>
     </w:p>
     <w:p>
       <w:r>
-        <w:t>• Inspection Studio: Allows users to upload individual images or batch folders, view the detailed Tensor JSON output, and inspect the Grad-CAM heatmap.</w:t>
+        <w:t>The Inspection Studio provides a highly detailed, analytical view of individual inferences. Users can upload specific images for testing. Upon prediction, the module displays the raw probability tensors, the final classification, and an overlay of the Grad-CAM heatmap. The heatmap highlights the specific pixels that triggered the AI's decision, providing essential Explainable AI (XAI) capabilities.</w:t>
       </w:r>
     </w:p>
     <w:p>
+      <w:pPr>
+        <w:jc w:val="center"/>
+      </w:pPr>
       <w:r>
         <w:drawing>
           <wp:inline xmlns:a="http://schemas.openxmlformats.org/drawingml/2006/main" xmlns:pic="http://schemas.openxmlformats.org/drawingml/2006/picture">
-            <wp:extent cx="5486400" cy="5600700"/>
-            <wp:docPr id="5" name="Picture 5"/>
+            <wp:extent cx="4572000" cy="4667250"/>
+            <wp:docPr id="6" name="Picture 6"/>
             <wp:cNvGraphicFramePr>
               <a:graphicFrameLocks noChangeAspect="1"/>
             </wp:cNvGraphicFramePr>
@@ -1096,7 +2351,7 @@
                     <pic:cNvPicPr/>
                   </pic:nvPicPr>
                   <pic:blipFill>
-                    <a:blip r:embed="rId13"/>
+                    <a:blip r:embed="rId15"/>
                     <a:stretch>
                       <a:fillRect/>
                     </a:stretch>
@@ -1104,7 +2359,7 @@
                   <pic:spPr>
                     <a:xfrm>
                       <a:off x="0" y="0"/>
-                      <a:ext cx="5486400" cy="5600700"/>
+                      <a:ext cx="4572000" cy="4667250"/>
                     </a:xfrm>
                     <a:prstGeom prst="rect"/>
                   </pic:spPr>
@@ -1121,33 +2376,177 @@
         <w:jc w:val="center"/>
       </w:pPr>
       <w:r>
-        <w:t>Figure 5: Inspection Studio Module</w:t>
+        <w:t xml:space="preserve">Figure </w:t>
+        <w:fldChar w:fldCharType="begin"/>
+        <w:instrText xml:space="preserve">SEQ Figure \* ARABIC</w:instrText>
+        <w:fldChar w:fldCharType="separate"/>
+        <w:t>6</w:t>
+        <w:fldChar w:fldCharType="end"/>
+      </w:r>
+      <w:r>
+        <w:t>: Animated Inspection Studio &amp; Grad-CAM</w:t>
+      </w:r>
+    </w:p>
+    <w:p>
+      <w:pPr>
+        <w:pStyle w:val="Heading2"/>
+      </w:pPr>
+      <w:r>
+        <w:t>15.4 Analytics &amp; Reports</w:t>
       </w:r>
     </w:p>
     <w:p>
       <w:r>
-        <w:t>• History &amp; Analytics: Fetches logs, filters by time and status, and exports to CSV.</w:t>
+        <w:t>Data collected over time is aggregated into the Analytics module, which uses Chart.js to visualize trends, daily throughput, and defect rates over time. Managers can easily identify periods of low quality. The Reports tab allows users to generate PDF and CSV documents containing raw telemetry for auditing purposes.</w:t>
       </w:r>
     </w:p>
     <w:p>
       <w:pPr>
-        <w:pStyle w:val="Heading1"/>
+        <w:jc w:val="center"/>
       </w:pPr>
       <w:r>
-        <w:t>20. User Interface</w:t>
+        <w:drawing>
+          <wp:inline xmlns:a="http://schemas.openxmlformats.org/drawingml/2006/main" xmlns:pic="http://schemas.openxmlformats.org/drawingml/2006/picture">
+            <wp:extent cx="4572000" cy="2857500"/>
+            <wp:docPr id="7" name="Picture 7"/>
+            <wp:cNvGraphicFramePr>
+              <a:graphicFrameLocks noChangeAspect="1"/>
+            </wp:cNvGraphicFramePr>
+            <a:graphic>
+              <a:graphicData uri="http://schemas.openxmlformats.org/drawingml/2006/picture">
+                <pic:pic>
+                  <pic:nvPicPr>
+                    <pic:cNvPr id="0" name="07-analytics.png"/>
+                    <pic:cNvPicPr/>
+                  </pic:nvPicPr>
+                  <pic:blipFill>
+                    <a:blip r:embed="rId16"/>
+                    <a:stretch>
+                      <a:fillRect/>
+                    </a:stretch>
+                  </pic:blipFill>
+                  <pic:spPr>
+                    <a:xfrm>
+                      <a:off x="0" y="0"/>
+                      <a:ext cx="4572000" cy="2857500"/>
+                    </a:xfrm>
+                    <a:prstGeom prst="rect"/>
+                  </pic:spPr>
+                </pic:pic>
+              </a:graphicData>
+            </a:graphic>
+          </wp:inline>
+        </w:drawing>
+      </w:r>
+    </w:p>
+    <w:p>
+      <w:pPr>
+        <w:pStyle w:val="Caption"/>
+        <w:jc w:val="center"/>
+      </w:pPr>
+      <w:r>
+        <w:t xml:space="preserve">Figure </w:t>
+        <w:fldChar w:fldCharType="begin"/>
+        <w:instrText xml:space="preserve">SEQ Figure \* ARABIC</w:instrText>
+        <w:fldChar w:fldCharType="separate"/>
+        <w:t>7</w:t>
+        <w:fldChar w:fldCharType="end"/>
+      </w:r>
+      <w:r>
+        <w:t>: Performance Analytics Module</w:t>
+      </w:r>
+    </w:p>
+    <w:p>
+      <w:pPr>
+        <w:pStyle w:val="Heading2"/>
+      </w:pPr>
+      <w:r>
+        <w:t>15.5 Inspection History</w:t>
       </w:r>
     </w:p>
     <w:p>
       <w:r>
-        <w:t>The UI is built with a premium 'Google Stitch' aesthetic, featuring dark mode, glassmorphism, responsive grids, and clean typography.</w:t>
+        <w:t>Every inference is securely logged into the SQLite database and presented in the History module. It features a robust, dynamic data table with Global Search capabilities, date range filters, and prediction status filters. Operators can review past decisions, verify the Grad-CAM thumbnail, and delete erroneous entries if authorized.</w:t>
+      </w:r>
+    </w:p>
+    <w:p>
+      <w:pPr>
+        <w:jc w:val="center"/>
+      </w:pPr>
+      <w:r>
+        <w:drawing>
+          <wp:inline xmlns:a="http://schemas.openxmlformats.org/drawingml/2006/main" xmlns:pic="http://schemas.openxmlformats.org/drawingml/2006/picture">
+            <wp:extent cx="4572000" cy="2857500"/>
+            <wp:docPr id="8" name="Picture 8"/>
+            <wp:cNvGraphicFramePr>
+              <a:graphicFrameLocks noChangeAspect="1"/>
+            </wp:cNvGraphicFramePr>
+            <a:graphic>
+              <a:graphicData uri="http://schemas.openxmlformats.org/drawingml/2006/picture">
+                <pic:pic>
+                  <pic:nvPicPr>
+                    <pic:cNvPr id="0" name="08-history.png"/>
+                    <pic:cNvPicPr/>
+                  </pic:nvPicPr>
+                  <pic:blipFill>
+                    <a:blip r:embed="rId17"/>
+                    <a:stretch>
+                      <a:fillRect/>
+                    </a:stretch>
+                  </pic:blipFill>
+                  <pic:spPr>
+                    <a:xfrm>
+                      <a:off x="0" y="0"/>
+                      <a:ext cx="4572000" cy="2857500"/>
+                    </a:xfrm>
+                    <a:prstGeom prst="rect"/>
+                  </pic:spPr>
+                </pic:pic>
+              </a:graphicData>
+            </a:graphic>
+          </wp:inline>
+        </w:drawing>
+      </w:r>
+    </w:p>
+    <w:p>
+      <w:pPr>
+        <w:pStyle w:val="Caption"/>
+        <w:jc w:val="center"/>
+      </w:pPr>
+      <w:r>
+        <w:t xml:space="preserve">Figure </w:t>
+        <w:fldChar w:fldCharType="begin"/>
+        <w:instrText xml:space="preserve">SEQ Figure \* ARABIC</w:instrText>
+        <w:fldChar w:fldCharType="separate"/>
+        <w:t>8</w:t>
+        <w:fldChar w:fldCharType="end"/>
+      </w:r>
+      <w:r>
+        <w:t>: Inspection History and Log Search</w:t>
+      </w:r>
+    </w:p>
+    <w:p>
+      <w:pPr>
+        <w:pStyle w:val="Heading2"/>
+      </w:pPr>
+      <w:r>
+        <w:t>15.6 Security &amp; Authentication</w:t>
       </w:r>
     </w:p>
     <w:p>
       <w:r>
+        <w:t>Authentication is handled by Flask-Login with passwords encrypted using Werkzeug's PBKDF2 hashing algorithm. Route decorators (`@login_required`) ensure unauthenticated users are redirected. Additionally, Flask-Limiter enforces rate limits (e.g., 1000 requests/hour) to prevent DDoS attacks.</w:t>
+      </w:r>
+    </w:p>
+    <w:p>
+      <w:pPr>
+        <w:jc w:val="center"/>
+      </w:pPr>
+      <w:r>
         <w:drawing>
           <wp:inline xmlns:a="http://schemas.openxmlformats.org/drawingml/2006/main" xmlns:pic="http://schemas.openxmlformats.org/drawingml/2006/picture">
-            <wp:extent cx="5486400" cy="3429000"/>
-            <wp:docPr id="6" name="Picture 6"/>
+            <wp:extent cx="4572000" cy="2857500"/>
+            <wp:docPr id="9" name="Picture 9"/>
             <wp:cNvGraphicFramePr>
               <a:graphicFrameLocks noChangeAspect="1"/>
             </wp:cNvGraphicFramePr>
@@ -1159,7 +2558,7 @@
                     <pic:cNvPicPr/>
                   </pic:nvPicPr>
                   <pic:blipFill>
-                    <a:blip r:embed="rId14"/>
+                    <a:blip r:embed="rId18"/>
                     <a:stretch>
                       <a:fillRect/>
                     </a:stretch>
@@ -1167,7 +2566,7 @@
                   <pic:spPr>
                     <a:xfrm>
                       <a:off x="0" y="0"/>
-                      <a:ext cx="5486400" cy="3429000"/>
+                      <a:ext cx="4572000" cy="2857500"/>
                     </a:xfrm>
                     <a:prstGeom prst="rect"/>
                   </pic:spPr>
@@ -1184,43 +2583,28 @@
         <w:jc w:val="center"/>
       </w:pPr>
       <w:r>
-        <w:t>Figure 6: Secure Login Screen</w:t>
+        <w:t xml:space="preserve">Figure </w:t>
+        <w:fldChar w:fldCharType="begin"/>
+        <w:instrText xml:space="preserve">SEQ Figure \* ARABIC</w:instrText>
+        <w:fldChar w:fldCharType="separate"/>
+        <w:t>9</w:t>
+        <w:fldChar w:fldCharType="end"/>
+      </w:r>
+      <w:r>
+        <w:t>: Secure Login &amp; Authentication Module</w:t>
+      </w:r>
+    </w:p>
+    <w:p>
+      <w:pPr>
+        <w:pStyle w:val="Heading1"/>
+      </w:pPr>
+      <w:r>
+        <w:t>16. Testing &amp; Validation</w:t>
       </w:r>
     </w:p>
     <w:p>
       <w:r>
-        <w:drawing>
-          <wp:inline xmlns:a="http://schemas.openxmlformats.org/drawingml/2006/main" xmlns:pic="http://schemas.openxmlformats.org/drawingml/2006/picture">
-            <wp:extent cx="5486400" cy="3429000"/>
-            <wp:docPr id="7" name="Picture 7"/>
-            <wp:cNvGraphicFramePr>
-              <a:graphicFrameLocks noChangeAspect="1"/>
-            </wp:cNvGraphicFramePr>
-            <a:graphic>
-              <a:graphicData uri="http://schemas.openxmlformats.org/drawingml/2006/picture">
-                <pic:pic>
-                  <pic:nvPicPr>
-                    <pic:cNvPr id="0" name="08-history.png"/>
-                    <pic:cNvPicPr/>
-                  </pic:nvPicPr>
-                  <pic:blipFill>
-                    <a:blip r:embed="rId15"/>
-                    <a:stretch>
-                      <a:fillRect/>
-                    </a:stretch>
-                  </pic:blipFill>
-                  <pic:spPr>
-                    <a:xfrm>
-                      <a:off x="0" y="0"/>
-                      <a:ext cx="5486400" cy="3429000"/>
-                    </a:xfrm>
-                    <a:prstGeom prst="rect"/>
-                  </pic:spPr>
-                </pic:pic>
-              </a:graphicData>
-            </a:graphic>
-          </wp:inline>
-        </w:drawing>
+        <w:t>Rigorous testing was conducted to ensure the reliability of the system under industrial conditions.</w:t>
       </w:r>
     </w:p>
     <w:p>
@@ -1229,43 +2613,223 @@
         <w:jc w:val="center"/>
       </w:pPr>
       <w:r>
-        <w:t>Figure 7: Inspection History Table with Filters</w:t>
+        <w:t xml:space="preserve">Table </w:t>
+        <w:fldChar w:fldCharType="begin"/>
+        <w:instrText xml:space="preserve">SEQ Table \* ARABIC</w:instrText>
+        <w:fldChar w:fldCharType="separate"/>
+        <w:t>6</w:t>
+        <w:fldChar w:fldCharType="end"/>
+      </w:r>
+      <w:r>
+        <w:t>: System Testing Results</w:t>
+      </w:r>
+    </w:p>
+    <w:tbl>
+      <w:tblPr>
+        <w:tblStyle w:val="TableGrid"/>
+        <w:tblW w:type="auto" w:w="0"/>
+        <w:tblLayout w:type="autofit"/>
+        <w:tblLook w:firstColumn="1" w:firstRow="1" w:lastColumn="0" w:lastRow="0" w:noHBand="0" w:noVBand="1" w:val="04A0"/>
+      </w:tblPr>
+      <w:tblGrid>
+        <w:gridCol w:w="4320"/>
+        <w:gridCol w:w="4320"/>
+      </w:tblGrid>
+      <w:tr>
+        <w:tc>
+          <w:tcPr>
+            <w:tcW w:type="dxa" w:w="4320"/>
+          </w:tcPr>
+          <w:p>
+            <w:r>
+              <w:rPr>
+                <w:b/>
+              </w:rPr>
+              <w:t>Test Category</w:t>
+            </w:r>
+          </w:p>
+        </w:tc>
+        <w:tc>
+          <w:tcPr>
+            <w:tcW w:type="dxa" w:w="4320"/>
+          </w:tcPr>
+          <w:p>
+            <w:r>
+              <w:rPr>
+                <w:b/>
+              </w:rPr>
+              <w:t>Result</w:t>
+            </w:r>
+          </w:p>
+        </w:tc>
+      </w:tr>
+      <w:tr>
+        <w:tc>
+          <w:tcPr>
+            <w:tcW w:type="dxa" w:w="4320"/>
+          </w:tcPr>
+          <w:p>
+            <w:r>
+              <w:t>Secure Login &amp; Session Management</w:t>
+            </w:r>
+          </w:p>
+        </w:tc>
+        <w:tc>
+          <w:tcPr>
+            <w:tcW w:type="dxa" w:w="4320"/>
+          </w:tcPr>
+          <w:p>
+            <w:r>
+              <w:t>Passed</w:t>
+            </w:r>
+          </w:p>
+        </w:tc>
+      </w:tr>
+      <w:tr>
+        <w:tc>
+          <w:tcPr>
+            <w:tcW w:type="dxa" w:w="4320"/>
+          </w:tcPr>
+          <w:p>
+            <w:r>
+              <w:t>Single Image Upload Inference</w:t>
+            </w:r>
+          </w:p>
+        </w:tc>
+        <w:tc>
+          <w:tcPr>
+            <w:tcW w:type="dxa" w:w="4320"/>
+          </w:tcPr>
+          <w:p>
+            <w:r>
+              <w:t>Passed</w:t>
+            </w:r>
+          </w:p>
+        </w:tc>
+      </w:tr>
+      <w:tr>
+        <w:tc>
+          <w:tcPr>
+            <w:tcW w:type="dxa" w:w="4320"/>
+          </w:tcPr>
+          <w:p>
+            <w:r>
+              <w:t>Continuous Webcam Streaming</w:t>
+            </w:r>
+          </w:p>
+        </w:tc>
+        <w:tc>
+          <w:tcPr>
+            <w:tcW w:type="dxa" w:w="4320"/>
+          </w:tcPr>
+          <w:p>
+            <w:r>
+              <w:t>Passed</w:t>
+            </w:r>
+          </w:p>
+        </w:tc>
+      </w:tr>
+      <w:tr>
+        <w:tc>
+          <w:tcPr>
+            <w:tcW w:type="dxa" w:w="4320"/>
+          </w:tcPr>
+          <w:p>
+            <w:r>
+              <w:t>AI Prediction Accuracy &amp; Boundaries</w:t>
+            </w:r>
+          </w:p>
+        </w:tc>
+        <w:tc>
+          <w:tcPr>
+            <w:tcW w:type="dxa" w:w="4320"/>
+          </w:tcPr>
+          <w:p>
+            <w:r>
+              <w:t>Passed</w:t>
+            </w:r>
+          </w:p>
+        </w:tc>
+      </w:tr>
+      <w:tr>
+        <w:tc>
+          <w:tcPr>
+            <w:tcW w:type="dxa" w:w="4320"/>
+          </w:tcPr>
+          <w:p>
+            <w:r>
+              <w:t>Database Telemetry Logging</w:t>
+            </w:r>
+          </w:p>
+        </w:tc>
+        <w:tc>
+          <w:tcPr>
+            <w:tcW w:type="dxa" w:w="4320"/>
+          </w:tcPr>
+          <w:p>
+            <w:r>
+              <w:t>Passed</w:t>
+            </w:r>
+          </w:p>
+        </w:tc>
+      </w:tr>
+      <w:tr>
+        <w:tc>
+          <w:tcPr>
+            <w:tcW w:type="dxa" w:w="4320"/>
+          </w:tcPr>
+          <w:p>
+            <w:r>
+              <w:t>CSV / PDF Report Generation</w:t>
+            </w:r>
+          </w:p>
+        </w:tc>
+        <w:tc>
+          <w:tcPr>
+            <w:tcW w:type="dxa" w:w="4320"/>
+          </w:tcPr>
+          <w:p>
+            <w:r>
+              <w:t>Passed</w:t>
+            </w:r>
+          </w:p>
+        </w:tc>
+      </w:tr>
+      <w:tr>
+        <w:tc>
+          <w:tcPr>
+            <w:tcW w:type="dxa" w:w="4320"/>
+          </w:tcPr>
+          <w:p>
+            <w:r>
+              <w:t>Rate Limiting &amp; Security Defenses</w:t>
+            </w:r>
+          </w:p>
+        </w:tc>
+        <w:tc>
+          <w:tcPr>
+            <w:tcW w:type="dxa" w:w="4320"/>
+          </w:tcPr>
+          <w:p>
+            <w:r>
+              <w:t>Passed</w:t>
+            </w:r>
+          </w:p>
+        </w:tc>
+      </w:tr>
+    </w:tbl>
+    <w:p/>
+    <w:p>
+      <w:pPr>
+        <w:pStyle w:val="Heading1"/>
+      </w:pPr>
+      <w:r>
+        <w:t>17. Performance Analysis</w:t>
       </w:r>
     </w:p>
     <w:p>
       <w:r>
-        <w:drawing>
-          <wp:inline xmlns:a="http://schemas.openxmlformats.org/drawingml/2006/main" xmlns:pic="http://schemas.openxmlformats.org/drawingml/2006/picture">
-            <wp:extent cx="5486400" cy="3086100"/>
-            <wp:docPr id="8" name="Picture 8"/>
-            <wp:cNvGraphicFramePr>
-              <a:graphicFrameLocks noChangeAspect="1"/>
-            </wp:cNvGraphicFramePr>
-            <a:graphic>
-              <a:graphicData uri="http://schemas.openxmlformats.org/drawingml/2006/picture">
-                <pic:pic>
-                  <pic:nvPicPr>
-                    <pic:cNvPr id="0" name="14-dark-mode.png"/>
-                    <pic:cNvPicPr/>
-                  </pic:nvPicPr>
-                  <pic:blipFill>
-                    <a:blip r:embed="rId16"/>
-                    <a:stretch>
-                      <a:fillRect/>
-                    </a:stretch>
-                  </pic:blipFill>
-                  <pic:spPr>
-                    <a:xfrm>
-                      <a:off x="0" y="0"/>
-                      <a:ext cx="5486400" cy="3086100"/>
-                    </a:xfrm>
-                    <a:prstGeom prst="rect"/>
-                  </pic:spPr>
-                </pic:pic>
-              </a:graphicData>
-            </a:graphic>
-          </wp:inline>
-        </w:drawing>
+        <w:t>The system was benchmarked for speed and efficiency to ensure it can match physical conveyor belt throughput.</w:t>
       </w:r>
     </w:p>
     <w:p>
@@ -1274,20 +2838,265 @@
         <w:jc w:val="center"/>
       </w:pPr>
       <w:r>
-        <w:t>Figure 8: System Dark Mode Configuration</w:t>
+        <w:t xml:space="preserve">Table </w:t>
+        <w:fldChar w:fldCharType="begin"/>
+        <w:instrText xml:space="preserve">SEQ Table \* ARABIC</w:instrText>
+        <w:fldChar w:fldCharType="separate"/>
+        <w:t>7</w:t>
+        <w:fldChar w:fldCharType="end"/>
+      </w:r>
+      <w:r>
+        <w:t>: System Performance Metrics</w:t>
+      </w:r>
+    </w:p>
+    <w:tbl>
+      <w:tblPr>
+        <w:tblStyle w:val="TableGrid"/>
+        <w:tblW w:type="auto" w:w="0"/>
+        <w:tblLayout w:type="autofit"/>
+        <w:tblLook w:firstColumn="1" w:firstRow="1" w:lastColumn="0" w:lastRow="0" w:noHBand="0" w:noVBand="1" w:val="04A0"/>
+      </w:tblPr>
+      <w:tblGrid>
+        <w:gridCol w:w="4320"/>
+        <w:gridCol w:w="4320"/>
+      </w:tblGrid>
+      <w:tr>
+        <w:tc>
+          <w:tcPr>
+            <w:tcW w:type="dxa" w:w="4320"/>
+          </w:tcPr>
+          <w:p>
+            <w:r>
+              <w:rPr>
+                <w:b/>
+              </w:rPr>
+              <w:t>Metric</w:t>
+            </w:r>
+          </w:p>
+        </w:tc>
+        <w:tc>
+          <w:tcPr>
+            <w:tcW w:type="dxa" w:w="4320"/>
+          </w:tcPr>
+          <w:p>
+            <w:r>
+              <w:rPr>
+                <w:b/>
+              </w:rPr>
+              <w:t>Value</w:t>
+            </w:r>
+          </w:p>
+        </w:tc>
+      </w:tr>
+      <w:tr>
+        <w:tc>
+          <w:tcPr>
+            <w:tcW w:type="dxa" w:w="4320"/>
+          </w:tcPr>
+          <w:p>
+            <w:r>
+              <w:t>Validation Accuracy</w:t>
+            </w:r>
+          </w:p>
+        </w:tc>
+        <w:tc>
+          <w:tcPr>
+            <w:tcW w:type="dxa" w:w="4320"/>
+          </w:tcPr>
+          <w:p>
+            <w:r>
+              <w:t>99.82%</w:t>
+            </w:r>
+          </w:p>
+        </w:tc>
+      </w:tr>
+      <w:tr>
+        <w:tc>
+          <w:tcPr>
+            <w:tcW w:type="dxa" w:w="4320"/>
+          </w:tcPr>
+          <w:p>
+            <w:r>
+              <w:t>Validation Loss</w:t>
+            </w:r>
+          </w:p>
+        </w:tc>
+        <w:tc>
+          <w:tcPr>
+            <w:tcW w:type="dxa" w:w="4320"/>
+          </w:tcPr>
+          <w:p>
+            <w:r>
+              <w:t>0.0076</w:t>
+            </w:r>
+          </w:p>
+        </w:tc>
+      </w:tr>
+      <w:tr>
+        <w:tc>
+          <w:tcPr>
+            <w:tcW w:type="dxa" w:w="4320"/>
+          </w:tcPr>
+          <w:p>
+            <w:r>
+              <w:t>Testing GPU</w:t>
+            </w:r>
+          </w:p>
+        </w:tc>
+        <w:tc>
+          <w:tcPr>
+            <w:tcW w:type="dxa" w:w="4320"/>
+          </w:tcPr>
+          <w:p>
+            <w:r>
+              <w:t>NVIDIA GeForce RTX 3050</w:t>
+            </w:r>
+          </w:p>
+        </w:tc>
+      </w:tr>
+      <w:tr>
+        <w:tc>
+          <w:tcPr>
+            <w:tcW w:type="dxa" w:w="4320"/>
+          </w:tcPr>
+          <w:p>
+            <w:r>
+              <w:t>Avg GPU Inference Time</w:t>
+            </w:r>
+          </w:p>
+        </w:tc>
+        <w:tc>
+          <w:tcPr>
+            <w:tcW w:type="dxa" w:w="4320"/>
+          </w:tcPr>
+          <w:p>
+            <w:r>
+              <w:t>45 ms (Sub-second)</w:t>
+            </w:r>
+          </w:p>
+        </w:tc>
+      </w:tr>
+      <w:tr>
+        <w:tc>
+          <w:tcPr>
+            <w:tcW w:type="dxa" w:w="4320"/>
+          </w:tcPr>
+          <w:p>
+            <w:r>
+              <w:t>Avg CPU Inference Time</w:t>
+            </w:r>
+          </w:p>
+        </w:tc>
+        <w:tc>
+          <w:tcPr>
+            <w:tcW w:type="dxa" w:w="4320"/>
+          </w:tcPr>
+          <w:p>
+            <w:r>
+              <w:t>95 ms</w:t>
+            </w:r>
+          </w:p>
+        </w:tc>
+      </w:tr>
+      <w:tr>
+        <w:tc>
+          <w:tcPr>
+            <w:tcW w:type="dxa" w:w="4320"/>
+          </w:tcPr>
+          <w:p>
+            <w:r>
+              <w:t>Peak RAM Usage</w:t>
+            </w:r>
+          </w:p>
+        </w:tc>
+        <w:tc>
+          <w:tcPr>
+            <w:tcW w:type="dxa" w:w="4320"/>
+          </w:tcPr>
+          <w:p>
+            <w:r>
+              <w:t>273.52 MB</w:t>
+            </w:r>
+          </w:p>
+        </w:tc>
+      </w:tr>
+    </w:tbl>
+    <w:p/>
+    <w:p>
+      <w:pPr>
+        <w:pStyle w:val="Heading1"/>
+      </w:pPr>
+      <w:r>
+        <w:t>18. Project Timeline &amp; Challenges</w:t>
       </w:r>
     </w:p>
     <w:p>
       <w:pPr>
-        <w:pStyle w:val="Heading1"/>
+        <w:pStyle w:val="Heading2"/>
       </w:pPr>
       <w:r>
-        <w:t>21. API Workflow</w:t>
+        <w:t>18.1 Timeline</w:t>
+      </w:r>
+    </w:p>
+    <w:p>
+      <w:pPr>
+        <w:pStyle w:val="ListBullet"/>
+      </w:pPr>
+      <w:r>
+        <w:t>Phase 1: Dataset Collection &amp; Data Augmentation</w:t>
+      </w:r>
+    </w:p>
+    <w:p>
+      <w:pPr>
+        <w:pStyle w:val="ListBullet"/>
+      </w:pPr>
+      <w:r>
+        <w:t>Phase 2: Deep Learning Model Training (EfficientNetV2B0)</w:t>
+      </w:r>
+    </w:p>
+    <w:p>
+      <w:pPr>
+        <w:pStyle w:val="ListBullet"/>
+      </w:pPr>
+      <w:r>
+        <w:t>Phase 3: Flask Backend &amp; SQLite Database Construction</w:t>
+      </w:r>
+    </w:p>
+    <w:p>
+      <w:pPr>
+        <w:pStyle w:val="ListBullet"/>
+      </w:pPr>
+      <w:r>
+        <w:t>Phase 4: UI/UX Design &amp; Dashboard Integration</w:t>
+      </w:r>
+    </w:p>
+    <w:p>
+      <w:pPr>
+        <w:pStyle w:val="ListBullet"/>
+      </w:pPr>
+      <w:r>
+        <w:t>Phase 5: WebSocket Telemetry &amp; Grad-CAM Implementation</w:t>
+      </w:r>
+    </w:p>
+    <w:p>
+      <w:pPr>
+        <w:pStyle w:val="ListBullet"/>
+      </w:pPr>
+      <w:r>
+        <w:t>Phase 6: Testing, Optimization, and Documentation</w:t>
+      </w:r>
+    </w:p>
+    <w:p>
+      <w:pPr>
+        <w:pStyle w:val="Heading2"/>
+      </w:pPr>
+      <w:r>
+        <w:t>18.2 Challenges Faced</w:t>
       </w:r>
     </w:p>
     <w:p>
       <w:r>
-        <w:t>REST APIs power the dynamic nature of the app. For example, when a user searches the telemetry data, the JS fetches `/api/history?q=query`. The backend parses this, queries the SQLite database with SQL LIKE operators, and returns a JSON payload which the frontend maps into DOM elements dynamically.</w:t>
+        <w:t>One of the most significant challenges was deploying TensorFlow in a threaded Flask environment. High concurrency requests to the AI model often caused Out-of-Memory (OOM) errors on the GPU. This was mitigated by implementing connection pooling, strict rate limits, and forcing TensorFlow to release memory tensors aggressively after each inference.</w:t>
       </w:r>
     </w:p>
     <w:p>
@@ -1295,267 +3104,208 @@
         <w:pStyle w:val="Heading1"/>
       </w:pPr>
       <w:r>
-        <w:t>22. Authentication</w:t>
+        <w:t>19. Industrial Applications</w:t>
       </w:r>
     </w:p>
     <w:p>
       <w:r>
-        <w:t>Authentication is handled by Flask-Login. Passwords are encrypted using Werkzeug's PBKDF2 hashing algorithm. Route decorators (`@login_required`) ensure that unauthenticated users are redirected to the login page.</w:t>
+        <w:t>While this prototype focuses on agricultural produce (fresh vs. rotten), the MVC and Deep Learning architecture is highly scalable. By simply swapping the underlying `.keras` model, QualiVision AI can be instantly repurposed for:</w:t>
       </w:r>
     </w:p>
     <w:p>
       <w:pPr>
+        <w:pStyle w:val="ListBullet"/>
+      </w:pPr>
+      <w:r>
+        <w:t>Manufacturing: Detecting scratches, dents, or misalignments in metal parts.</w:t>
+      </w:r>
+    </w:p>
+    <w:p>
+      <w:pPr>
+        <w:pStyle w:val="ListBullet"/>
+      </w:pPr>
+      <w:r>
+        <w:t>Textiles: Identifying tears or mis-stitching in fabrics.</w:t>
+      </w:r>
+    </w:p>
+    <w:p>
+      <w:pPr>
+        <w:pStyle w:val="ListBullet"/>
+      </w:pPr>
+      <w:r>
+        <w:t>Pharmaceuticals: Ensuring pill integrity and blister pack sealing.</w:t>
+      </w:r>
+    </w:p>
+    <w:p>
+      <w:pPr>
+        <w:pStyle w:val="ListBullet"/>
+      </w:pPr>
+      <w:r>
+        <w:t>Logistics: Verifying barcode placement and package damage.</w:t>
+      </w:r>
+    </w:p>
+    <w:p>
+      <w:pPr>
         <w:pStyle w:val="Heading1"/>
       </w:pPr>
       <w:r>
-        <w:t>23. Security</w:t>
+        <w:t>20. Future Scope</w:t>
       </w:r>
     </w:p>
     <w:p>
       <w:r>
-        <w:t>• Rate Limiting: Flask-Limiter prevents DDoS attacks on the API endpoints.</w:t>
+        <w:t>To elevate QualiVision AI from an edge-server prototype to a true Enterprise IoT solution, the following enhancements are planned:</w:t>
+      </w:r>
+    </w:p>
+    <w:p>
+      <w:pPr>
+        <w:pStyle w:val="ListBullet"/>
+      </w:pPr>
+      <w:r>
+        <w:t>• Multi-Camera Swarm Support: Implementing WebRTC to handle concurrent streams from dozens of IP cameras across the factory floor.</w:t>
+      </w:r>
+    </w:p>
+    <w:p>
+      <w:pPr>
+        <w:pStyle w:val="ListBullet"/>
+      </w:pPr>
+      <w:r>
+        <w:t>• PLC Hardware Integration: Writing drivers to communicate with Programmable Logic Controllers (PLCs) via MQTT or Modbus. This would allow the AI to physically trigger pneumatic arms to knock defective items off the belt.</w:t>
+      </w:r>
+    </w:p>
+    <w:p>
+      <w:pPr>
+        <w:pStyle w:val="ListBullet"/>
+      </w:pPr>
+      <w:r>
+        <w:t>• Cloud Native Orchestration: Containerizing the backend with Docker and deploying via Kubernetes for automatic horizontal scaling during peak production hours.</w:t>
+      </w:r>
+    </w:p>
+    <w:p>
+      <w:pPr>
+        <w:pStyle w:val="ListBullet"/>
+      </w:pPr>
+      <w:r>
+        <w:t>• Mobile Companion App: Developing a React Native application that pushes real-time anomaly alerts via push notifications to floor managers on the go.</w:t>
+      </w:r>
+    </w:p>
+    <w:p>
+      <w:pPr>
+        <w:pStyle w:val="Heading1"/>
+      </w:pPr>
+      <w:r>
+        <w:t>21. Conclusion</w:t>
       </w:r>
     </w:p>
     <w:p>
       <w:r>
-        <w:t>• Input Sanitization: All SQL queries use parameterized inputs to prevent SQL Injection.</w:t>
+        <w:t>QualiVision AI successfully demonstrates how enterprise-grade Deep Learning can be practically deployed into an industrial environment using Python web frameworks. It bridges the gap between raw AI model training and user-friendly software that factory operators can trust and use daily. By automating quality control, it offers a fast, accurate, and cost-effective alternative to manual inspection.</w:t>
+      </w:r>
+    </w:p>
+    <w:p>
+      <w:pPr>
+        <w:pStyle w:val="Heading1"/>
+      </w:pPr>
+      <w:r>
+        <w:t>22. References</w:t>
+      </w:r>
+    </w:p>
+    <w:p>
+      <w:pPr>
+        <w:pStyle w:val="ListBullet"/>
+      </w:pPr>
+      <w:r>
+        <w:t>[1] Abadi, M., et al. (2016). TensorFlow: A system for large-scale machine learning. OSDI '16.</w:t>
+      </w:r>
+    </w:p>
+    <w:p>
+      <w:pPr>
+        <w:pStyle w:val="ListBullet"/>
+      </w:pPr>
+      <w:r>
+        <w:t>[2] Tan, M., &amp; Le, Q. (2021). EfficientNetV2: Smaller Models and Faster Training. ICML 2021.</w:t>
+      </w:r>
+    </w:p>
+    <w:p>
+      <w:pPr>
+        <w:pStyle w:val="ListBullet"/>
+      </w:pPr>
+      <w:r>
+        <w:t>[3] Selvaraju, R. R., et al. (2017). Grad-CAM: Visual Explanations from Deep Networks via Gradient-based Localization. ICCV.</w:t>
+      </w:r>
+    </w:p>
+    <w:p>
+      <w:pPr>
+        <w:pStyle w:val="ListBullet"/>
+      </w:pPr>
+      <w:r>
+        <w:t>[4] Grinberg, M. (2018). Flask Web Development: Developing Web Applications with Python. O'Reilly Media.</w:t>
+      </w:r>
+    </w:p>
+    <w:p>
+      <w:pPr>
+        <w:pStyle w:val="ListBullet"/>
+      </w:pPr>
+      <w:r>
+        <w:t>[5] Bradski, G. (2000). The OpenCV Library. Dr. Dobb's Journal of Software Tools.</w:t>
+      </w:r>
+    </w:p>
+    <w:p>
+      <w:pPr>
+        <w:pStyle w:val="Heading1"/>
+      </w:pPr>
+      <w:r>
+        <w:t>23. Appendix</w:t>
+      </w:r>
+    </w:p>
+    <w:p>
+      <w:pPr>
+        <w:pStyle w:val="Heading2"/>
+      </w:pPr>
+      <w:r>
+        <w:t>23.1 Folder Structure</w:t>
       </w:r>
     </w:p>
     <w:p>
       <w:r>
-        <w:t>• Safe Paths: `werkzeug.utils.secure_filename` is used before saving uploaded files to prevent directory traversal attacks.</w:t>
+        <w:t>qualivision-ai/</w:t>
+        <w:br/>
+        <w:t>├── app/</w:t>
+        <w:br/>
+        <w:t>│   ├── routes/</w:t>
+        <w:br/>
+        <w:t>│   ├── services/</w:t>
+        <w:br/>
+        <w:t>│   ├── static/</w:t>
+        <w:br/>
+        <w:t>│   └── templates/</w:t>
+        <w:br/>
+        <w:t>├── dataset/</w:t>
+        <w:br/>
+        <w:t>├── docs/</w:t>
+        <w:br/>
+        <w:t>├── models/</w:t>
+        <w:br/>
+        <w:t>├── reports/</w:t>
+        <w:br/>
+        <w:t>├── training/</w:t>
+        <w:br/>
+        <w:t>├── app.py</w:t>
+        <w:br/>
+        <w:t>└── requirements.txt</w:t>
       </w:r>
     </w:p>
     <w:p>
       <w:pPr>
-        <w:pStyle w:val="Heading1"/>
+        <w:pStyle w:val="Heading2"/>
       </w:pPr>
       <w:r>
-        <w:t>24. Testing</w:t>
+        <w:t>23.2 Code Availability</w:t>
       </w:r>
     </w:p>
     <w:p>
       <w:r>
-        <w:t>• Functional Testing: Ensured all routes load correctly and buttons perform their intended actions.</w:t>
-      </w:r>
-    </w:p>
-    <w:p>
-      <w:r>
-        <w:t>• Integration Testing: Verified that the Flask backend communicates seamlessly with the TensorFlow service.</w:t>
-      </w:r>
-    </w:p>
-    <w:p>
-      <w:r>
-        <w:t>• Validation: The AI model was tested against a hidden validation set, ensuring generalizability.</w:t>
-      </w:r>
-    </w:p>
-    <w:p>
-      <w:pPr>
-        <w:pStyle w:val="Heading1"/>
-      </w:pPr>
-      <w:r>
-        <w:t>25. Performance Analysis</w:t>
-      </w:r>
-    </w:p>
-    <w:p>
-      <w:r>
-        <w:t>• Accuracy: 99.82%</w:t>
-      </w:r>
-    </w:p>
-    <w:p>
-      <w:r>
-        <w:t>• Loss: 0.0076</w:t>
-      </w:r>
-    </w:p>
-    <w:p>
-      <w:r>
-        <w:t>• Inference Time: Average ~95ms on CPU; ~45ms on GPU.</w:t>
-      </w:r>
-    </w:p>
-    <w:p>
-      <w:r>
-        <w:t>• CPU/RAM: Peak RAM usage during prediction is ~273 MB. Memory is effectively managed by releasing Tensors after inference.</w:t>
-      </w:r>
-    </w:p>
-    <w:p>
-      <w:pPr>
-        <w:pStyle w:val="Heading1"/>
-      </w:pPr>
-      <w:r>
-        <w:t>26. Results</w:t>
-      </w:r>
-    </w:p>
-    <w:p>
-      <w:r>
-        <w:t>The system successfully classified items with near-perfect accuracy in the lab environment. The Grad-CAM heatmaps accurately highlighted the rotting spots on the defective items, proving that the model learned the correct features rather than background noise.</w:t>
-      </w:r>
-    </w:p>
-    <w:p>
-      <w:r>
-        <w:drawing>
-          <wp:inline xmlns:a="http://schemas.openxmlformats.org/drawingml/2006/main" xmlns:pic="http://schemas.openxmlformats.org/drawingml/2006/picture">
-            <wp:extent cx="5486400" cy="3429000"/>
-            <wp:docPr id="9" name="Picture 9"/>
-            <wp:cNvGraphicFramePr>
-              <a:graphicFrameLocks noChangeAspect="1"/>
-            </wp:cNvGraphicFramePr>
-            <a:graphic>
-              <a:graphicData uri="http://schemas.openxmlformats.org/drawingml/2006/picture">
-                <pic:pic>
-                  <pic:nvPicPr>
-                    <pic:cNvPr id="0" name="07-analytics.png"/>
-                    <pic:cNvPicPr/>
-                  </pic:nvPicPr>
-                  <pic:blipFill>
-                    <a:blip r:embed="rId17"/>
-                    <a:stretch>
-                      <a:fillRect/>
-                    </a:stretch>
-                  </pic:blipFill>
-                  <pic:spPr>
-                    <a:xfrm>
-                      <a:off x="0" y="0"/>
-                      <a:ext cx="5486400" cy="3429000"/>
-                    </a:xfrm>
-                    <a:prstGeom prst="rect"/>
-                  </pic:spPr>
-                </pic:pic>
-              </a:graphicData>
-            </a:graphic>
-          </wp:inline>
-        </w:drawing>
-      </w:r>
-    </w:p>
-    <w:p>
-      <w:pPr>
-        <w:pStyle w:val="Caption"/>
-        <w:jc w:val="center"/>
-      </w:pPr>
-      <w:r>
-        <w:t>Figure 9: Performance Analytics Charts</w:t>
-      </w:r>
-    </w:p>
-    <w:p>
-      <w:pPr>
-        <w:pStyle w:val="Heading1"/>
-      </w:pPr>
-      <w:r>
-        <w:t>27. Advantages</w:t>
-      </w:r>
-    </w:p>
-    <w:p>
-      <w:r>
-        <w:t>• Sub-second processing speed.</w:t>
-      </w:r>
-    </w:p>
-    <w:p>
-      <w:r>
-        <w:t>• High accuracy and explainability.</w:t>
-      </w:r>
-    </w:p>
-    <w:p>
-      <w:r>
-        <w:t>• Fully automated digital record-keeping (eliminates paper logs).</w:t>
-      </w:r>
-    </w:p>
-    <w:p>
-      <w:r>
-        <w:t>• Highly scalable modular architecture.</w:t>
-      </w:r>
-    </w:p>
-    <w:p>
-      <w:pPr>
-        <w:pStyle w:val="Heading1"/>
-      </w:pPr>
-      <w:r>
-        <w:t>28. Limitations</w:t>
-      </w:r>
-    </w:p>
-    <w:p>
-      <w:r>
-        <w:t>• TensorFlow has high VRAM requirements, meaning multi-camera concurrent inference requires significant GPU hardware.</w:t>
-      </w:r>
-    </w:p>
-    <w:p>
-      <w:r>
-        <w:t>• Model is trained on specific lighting conditions; extreme shadows or glare may affect accuracy without further dataset augmentation.</w:t>
-      </w:r>
-    </w:p>
-    <w:p>
-      <w:pPr>
-        <w:pStyle w:val="Heading1"/>
-      </w:pPr>
-      <w:r>
-        <w:t>29. Future Enhancements</w:t>
-      </w:r>
-    </w:p>
-    <w:p>
-      <w:r>
-        <w:t>• Multi-camera concurrent streaming via WebRTC.</w:t>
-      </w:r>
-    </w:p>
-    <w:p>
-      <w:r>
-        <w:t>• Cloud native deployment using Docker Swarm or Kubernetes.</w:t>
-      </w:r>
-    </w:p>
-    <w:p>
-      <w:r>
-        <w:t>• Integration directly with PLC hardware (Programmable Logic Controllers) to physically eject rejected items off the conveyor belt.</w:t>
-      </w:r>
-    </w:p>
-    <w:p>
-      <w:pPr>
-        <w:pStyle w:val="Heading1"/>
-      </w:pPr>
-      <w:r>
-        <w:t>30. Conclusion</w:t>
-      </w:r>
-    </w:p>
-    <w:p>
-      <w:r>
-        <w:t>QualiVision AI successfully demonstrates how enterprise-grade Deep Learning can be deployed into an industrial environment using Python web frameworks. It bridges the gap between raw AI model training and practical, user-friendly software that factory operators can trust and use daily.</w:t>
-      </w:r>
-    </w:p>
-    <w:p>
-      <w:pPr>
-        <w:pStyle w:val="Heading1"/>
-      </w:pPr>
-      <w:r>
-        <w:t>31. References</w:t>
-      </w:r>
-    </w:p>
-    <w:p>
-      <w:r>
-        <w:t>[1] TensorFlow Documentation: https://www.tensorflow.org/</w:t>
-      </w:r>
-    </w:p>
-    <w:p>
-      <w:r>
-        <w:t>[2] Flask Framework: https://flask.palletsprojects.com/</w:t>
-      </w:r>
-    </w:p>
-    <w:p>
-      <w:r>
-        <w:t>[3] OpenCV Library: https://opencv.org/</w:t>
-      </w:r>
-    </w:p>
-    <w:p>
-      <w:r>
-        <w:t>[4] EfficientNetV2 Paper: https://arxiv.org/abs/2104.00298</w:t>
-      </w:r>
-    </w:p>
-    <w:p>
-      <w:pPr>
-        <w:pStyle w:val="Heading1"/>
-      </w:pPr>
-      <w:r>
-        <w:t>32. Appendix</w:t>
-      </w:r>
-    </w:p>
-    <w:p>
-      <w:r>
-        <w:t>Refer to the project repository for complete source code, configuration files (`config.py`), and installation instructions:</w:t>
+        <w:t>Refer to the project repository for complete source code, configuration files, and installation instructions:</w:t>
       </w:r>
     </w:p>
     <w:p>
@@ -1564,6 +3314,8 @@
       </w:r>
     </w:p>
     <w:sectPr>
+      <w:headerReference w:type="default" r:id="rId9"/>
+      <w:footerReference w:type="default" r:id="rId10"/>
       <w:pgSz w:w="12240" w:h="15840"/>
       <w:pgMar w:top="1440" w:right="1800" w:bottom="1440" w:left="1800" w:header="720" w:footer="720" w:gutter="0"/>
       <w:cols w:space="720"/>
@@ -1571,6 +3323,38 @@
     </w:sectPr>
   </w:body>
 </w:document>
+</file>
+
+<file path=word/footer1.xml><?xml version="1.0" encoding="utf-8"?>
+<w:ftr xmlns:m="http://schemas.openxmlformats.org/officeDocument/2006/math" xmlns:mc="http://schemas.openxmlformats.org/markup-compatibility/2006" xmlns:mo="http://schemas.microsoft.com/office/mac/office/2008/main" xmlns:mv="urn:schemas-microsoft-com:mac:vml" xmlns:o="urn:schemas-microsoft-com:office:office" xmlns:r="http://schemas.openxmlformats.org/officeDocument/2006/relationships" xmlns:v="urn:schemas-microsoft-com:vml" xmlns:w10="urn:schemas-microsoft-com:office:word" xmlns:w14="http://schemas.microsoft.com/office/word/2010/wordml" xmlns:w="http://schemas.openxmlformats.org/wordprocessingml/2006/main" xmlns:wne="http://schemas.microsoft.com/office/word/2006/wordml" xmlns:wp14="http://schemas.microsoft.com/office/word/2010/wordprocessingDrawing" xmlns:wp="http://schemas.openxmlformats.org/drawingml/2006/wordprocessingDrawing" xmlns:wpc="http://schemas.microsoft.com/office/word/2010/wordprocessingCanvas" xmlns:wpg="http://schemas.microsoft.com/office/word/2010/wordprocessingGroup" xmlns:wpi="http://schemas.microsoft.com/office/word/2010/wordprocessingInk" xmlns:wps="http://schemas.microsoft.com/office/word/2010/wordprocessingShape" mc:Ignorable="w14 wp14">
+  <w:p>
+    <w:pPr>
+      <w:pStyle w:val="Footer"/>
+      <w:jc w:val="center"/>
+    </w:pPr>
+    <w:r>
+      <w:t xml:space="preserve">Page </w:t>
+      <w:fldChar w:fldCharType="begin"/>
+      <w:instrText xml:space="preserve">PAGE</w:instrText>
+      <w:fldChar w:fldCharType="separate"/>
+      <w:fldChar w:fldCharType="end"/>
+    </w:r>
+  </w:p>
+</w:ftr>
+</file>
+
+<file path=word/header1.xml><?xml version="1.0" encoding="utf-8"?>
+<w:hdr xmlns:m="http://schemas.openxmlformats.org/officeDocument/2006/math" xmlns:mc="http://schemas.openxmlformats.org/markup-compatibility/2006" xmlns:mo="http://schemas.microsoft.com/office/mac/office/2008/main" xmlns:mv="urn:schemas-microsoft-com:mac:vml" xmlns:o="urn:schemas-microsoft-com:office:office" xmlns:r="http://schemas.openxmlformats.org/officeDocument/2006/relationships" xmlns:v="urn:schemas-microsoft-com:vml" xmlns:w10="urn:schemas-microsoft-com:office:word" xmlns:w14="http://schemas.microsoft.com/office/word/2010/wordml" xmlns:w="http://schemas.openxmlformats.org/wordprocessingml/2006/main" xmlns:wne="http://schemas.microsoft.com/office/word/2006/wordml" xmlns:wp14="http://schemas.microsoft.com/office/word/2010/wordprocessingDrawing" xmlns:wp="http://schemas.openxmlformats.org/drawingml/2006/wordprocessingDrawing" xmlns:wpc="http://schemas.microsoft.com/office/word/2010/wordprocessingCanvas" xmlns:wpg="http://schemas.microsoft.com/office/word/2010/wordprocessingGroup" xmlns:wpi="http://schemas.microsoft.com/office/word/2010/wordprocessingInk" xmlns:wps="http://schemas.microsoft.com/office/word/2010/wordprocessingShape" mc:Ignorable="w14 wp14">
+  <w:p>
+    <w:pPr>
+      <w:pStyle w:val="Header"/>
+      <w:jc w:val="right"/>
+    </w:pPr>
+    <w:r>
+      <w:t>QualiVision AI – Industrial Quality Control System</w:t>
+    </w:r>
+  </w:p>
+</w:hdr>
 </file>
 
 <file path=word/numbering.xml><?xml version="1.0" encoding="utf-8"?>
@@ -1936,8 +3720,12 @@
     <w:name w:val="Normal"/>
     <w:qFormat/>
     <w:rsid w:val="00FC693F"/>
+    <w:pPr>
+      <w:spacing w:after="200" w:line="276" w:lineRule="auto"/>
+      <w:jc w:val="both"/>
+    </w:pPr>
     <w:rPr>
-      <w:rFonts w:ascii="Arial" w:hAnsi="Arial"/>
+      <w:rFonts w:ascii="Courier New" w:hAnsi="Courier New"/>
       <w:sz w:val="22"/>
     </w:rPr>
   </w:style>
@@ -1955,6 +3743,9 @@
       </w:tabs>
       <w:spacing w:after="0" w:line="240" w:lineRule="auto"/>
     </w:pPr>
+    <w:rPr>
+      <w:sz w:val="18"/>
+    </w:rPr>
   </w:style>
   <w:style w:type="character" w:customStyle="1" w:styleId="HeaderChar">
     <w:name w:val="Header Char"/>

</xml_diff>

<commit_message>
docs: update QualiVision AI project report details
</commit_message>
<xml_diff>
--- a/QualiVision_AI_Project_Report.docx
+++ b/QualiVision_AI_Project_Report.docx
@@ -994,172 +994,9 @@
         <w:jc w:val="center"/>
       </w:pPr>
       <w:r>
-        <w:rPr>
-          <w:b/>
-        </w:rPr>
-        <w:t>Camera</w:t>
-      </w:r>
-    </w:p>
-    <w:p>
-      <w:pPr>
-        <w:jc w:val="center"/>
-      </w:pPr>
-      <w:r>
-        <w:t>↓</w:t>
-      </w:r>
-    </w:p>
-    <w:p>
-      <w:pPr>
-        <w:jc w:val="center"/>
-      </w:pPr>
-      <w:r>
-        <w:rPr>
-          <w:b/>
-        </w:rPr>
-        <w:t>OpenCV</w:t>
-      </w:r>
-    </w:p>
-    <w:p>
-      <w:pPr>
-        <w:jc w:val="center"/>
-      </w:pPr>
-      <w:r>
-        <w:t>↓</w:t>
-      </w:r>
-    </w:p>
-    <w:p>
-      <w:pPr>
-        <w:jc w:val="center"/>
-      </w:pPr>
-      <w:r>
-        <w:rPr>
-          <w:b/>
-        </w:rPr>
-        <w:t>Preprocessing</w:t>
-      </w:r>
-    </w:p>
-    <w:p>
-      <w:pPr>
-        <w:jc w:val="center"/>
-      </w:pPr>
-      <w:r>
-        <w:t>↓</w:t>
-      </w:r>
-    </w:p>
-    <w:p>
-      <w:pPr>
-        <w:jc w:val="center"/>
-      </w:pPr>
-      <w:r>
-        <w:rPr>
-          <w:b/>
-        </w:rPr>
-        <w:t>TensorFlow Model</w:t>
-      </w:r>
-    </w:p>
-    <w:p>
-      <w:pPr>
-        <w:jc w:val="center"/>
-      </w:pPr>
-      <w:r>
-        <w:t>↓</w:t>
-      </w:r>
-    </w:p>
-    <w:p>
-      <w:pPr>
-        <w:jc w:val="center"/>
-      </w:pPr>
-      <w:r>
-        <w:rPr>
-          <w:b/>
-        </w:rPr>
-        <w:t>Prediction</w:t>
-      </w:r>
-    </w:p>
-    <w:p>
-      <w:pPr>
-        <w:jc w:val="center"/>
-      </w:pPr>
-      <w:r>
-        <w:t>↓</w:t>
-      </w:r>
-    </w:p>
-    <w:p>
-      <w:pPr>
-        <w:jc w:val="center"/>
-      </w:pPr>
-      <w:r>
-        <w:rPr>
-          <w:b/>
-        </w:rPr>
-        <w:t>GradCAM</w:t>
-      </w:r>
-    </w:p>
-    <w:p>
-      <w:pPr>
-        <w:jc w:val="center"/>
-      </w:pPr>
-      <w:r>
-        <w:t>↓</w:t>
-      </w:r>
-    </w:p>
-    <w:p>
-      <w:pPr>
-        <w:jc w:val="center"/>
-      </w:pPr>
-      <w:r>
-        <w:rPr>
-          <w:b/>
-        </w:rPr>
-        <w:t>SQLite</w:t>
-      </w:r>
-    </w:p>
-    <w:p>
-      <w:pPr>
-        <w:jc w:val="center"/>
-      </w:pPr>
-      <w:r>
-        <w:t>↓</w:t>
-      </w:r>
-    </w:p>
-    <w:p>
-      <w:pPr>
-        <w:jc w:val="center"/>
-      </w:pPr>
-      <w:r>
-        <w:rPr>
-          <w:b/>
-        </w:rPr>
-        <w:t>Flask API</w:t>
-      </w:r>
-    </w:p>
-    <w:p>
-      <w:pPr>
-        <w:jc w:val="center"/>
-      </w:pPr>
-      <w:r>
-        <w:t>↓</w:t>
-      </w:r>
-    </w:p>
-    <w:p>
-      <w:pPr>
-        <w:jc w:val="center"/>
-      </w:pPr>
-      <w:r>
-        <w:rPr>
-          <w:b/>
-        </w:rPr>
-        <w:t>Dashboard</w:t>
-      </w:r>
-    </w:p>
-    <w:p>
-      <w:pPr>
-        <w:jc w:val="center"/>
-      </w:pPr>
-      <w:r>
         <w:drawing>
           <wp:inline xmlns:a="http://schemas.openxmlformats.org/drawingml/2006/main" xmlns:pic="http://schemas.openxmlformats.org/drawingml/2006/picture">
-            <wp:extent cx="4572000" cy="3695700"/>
+            <wp:extent cx="3657600" cy="4793844"/>
             <wp:docPr id="1" name="Picture 1"/>
             <wp:cNvGraphicFramePr>
               <a:graphicFrameLocks noChangeAspect="1"/>
@@ -1168,7 +1005,7 @@
               <a:graphicData uri="http://schemas.openxmlformats.org/drawingml/2006/picture">
                 <pic:pic>
                   <pic:nvPicPr>
-                    <pic:cNvPr id="0" name="02-dashboard.png"/>
+                    <pic:cNvPr id="0" name="architecture.png"/>
                     <pic:cNvPicPr/>
                   </pic:nvPicPr>
                   <pic:blipFill>
@@ -1180,7 +1017,7 @@
                   <pic:spPr>
                     <a:xfrm>
                       <a:off x="0" y="0"/>
-                      <a:ext cx="4572000" cy="3695700"/>
+                      <a:ext cx="3657600" cy="4793844"/>
                     </a:xfrm>
                     <a:prstGeom prst="rect"/>
                   </pic:spPr>
@@ -1205,7 +1042,7 @@
         <w:fldChar w:fldCharType="end"/>
       </w:r>
       <w:r>
-        <w:t>: Executive Dashboard Overview</w:t>
+        <w:t>: System Architecture Block Diagram</w:t>
       </w:r>
     </w:p>
     <w:p>
@@ -1222,52 +1059,44 @@
       </w:r>
     </w:p>
     <w:p>
-      <w:pPr>
-        <w:jc w:val="center"/>
-      </w:pPr>
       <w:r>
-        <w:rPr>
-          <w:b/>
-        </w:rPr>
-        <w:t>Users (Authentication &amp; RBAC)</w:t>
-      </w:r>
-    </w:p>
-    <w:p>
-      <w:pPr>
-        <w:jc w:val="center"/>
-      </w:pPr>
-      <w:r>
-        <w:t>↓</w:t>
-      </w:r>
-    </w:p>
-    <w:p>
-      <w:pPr>
-        <w:jc w:val="center"/>
-      </w:pPr>
-      <w:r>
-        <w:rPr>
-          <w:b/>
-        </w:rPr>
-        <w:t>Predictions (Inspection Logs &amp; Metrics)</w:t>
-      </w:r>
-    </w:p>
-    <w:p>
-      <w:pPr>
-        <w:jc w:val="center"/>
-      </w:pPr>
-      <w:r>
-        <w:t>↓</w:t>
-      </w:r>
-    </w:p>
-    <w:p>
-      <w:pPr>
-        <w:jc w:val="center"/>
-      </w:pPr>
-      <w:r>
-        <w:rPr>
-          <w:b/>
-        </w:rPr>
-        <w:t>Settings (Global Configurations)</w:t>
+        <w:t>Users</w:t>
+        <w:br/>
+        <w:t xml:space="preserve"> ├── id</w:t>
+        <w:br/>
+        <w:t xml:space="preserve"> ├── username</w:t>
+        <w:br/>
+        <w:t xml:space="preserve"> └── role</w:t>
+        <w:br/>
+        <w:br/>
+        <w:t xml:space="preserve">        │</w:t>
+        <w:br/>
+        <w:t xml:space="preserve">        │ 1:N</w:t>
+        <w:br/>
+        <w:t xml:space="preserve">        ▼</w:t>
+        <w:br/>
+        <w:br/>
+        <w:t>Predictions</w:t>
+        <w:br/>
+        <w:t xml:space="preserve"> ├── id</w:t>
+        <w:br/>
+        <w:t xml:space="preserve"> ├── timestamp</w:t>
+        <w:br/>
+        <w:t xml:space="preserve"> ├── prediction</w:t>
+        <w:br/>
+        <w:t xml:space="preserve"> ├── confidence</w:t>
+        <w:br/>
+        <w:t xml:space="preserve"> └── image</w:t>
+        <w:br/>
+        <w:br/>
+        <w:t xml:space="preserve">        │</w:t>
+        <w:br/>
+        <w:t xml:space="preserve">        │ </w:t>
+        <w:br/>
+        <w:t xml:space="preserve">        ▼</w:t>
+        <w:br/>
+        <w:br/>
+        <w:t>Settings</w:t>
       </w:r>
     </w:p>
     <w:p>
@@ -1284,6 +1113,13 @@
       </w:r>
     </w:p>
     <w:p>
+      <w:r>
+        <w:t>Dataset Sources: Aggregated from Roboflow and Kaggle open datasets.</w:t>
+        <w:br/>
+        <w:t>Augmentation techniques: Random rotation, horizontal flipping, contrast adjustments, and zooming to prevent model overfitting.</w:t>
+      </w:r>
+    </w:p>
+    <w:p>
       <w:pPr>
         <w:pStyle w:val="Caption"/>
         <w:jc w:val="center"/>
@@ -1297,7 +1133,7 @@
         <w:fldChar w:fldCharType="end"/>
       </w:r>
       <w:r>
-        <w:t>: Dataset Class Distribution</w:t>
+        <w:t>: Dataset Train / Validation / Test Split</w:t>
       </w:r>
     </w:p>
     <w:tbl>
@@ -1321,7 +1157,7 @@
               <w:rPr>
                 <w:b/>
               </w:rPr>
-              <w:t>Class</w:t>
+              <w:t>Split</w:t>
             </w:r>
           </w:p>
         </w:tc>
@@ -1346,7 +1182,7 @@
           </w:tcPr>
           <w:p>
             <w:r>
-              <w:t>Fresh Item</w:t>
+              <w:t>Train</w:t>
             </w:r>
           </w:p>
         </w:tc>
@@ -1356,7 +1192,7 @@
           </w:tcPr>
           <w:p>
             <w:r>
-              <w:t>3,950</w:t>
+              <w:t>5530</w:t>
             </w:r>
           </w:p>
         </w:tc>
@@ -1368,7 +1204,7 @@
           </w:tcPr>
           <w:p>
             <w:r>
-              <w:t>Rotten Item</w:t>
+              <w:t>Validation</w:t>
             </w:r>
           </w:p>
         </w:tc>
@@ -1378,7 +1214,29 @@
           </w:tcPr>
           <w:p>
             <w:r>
-              <w:t>3,950</w:t>
+              <w:t>1185</w:t>
+            </w:r>
+          </w:p>
+        </w:tc>
+      </w:tr>
+      <w:tr>
+        <w:tc>
+          <w:tcPr>
+            <w:tcW w:type="dxa" w:w="4320"/>
+          </w:tcPr>
+          <w:p>
+            <w:r>
+              <w:t>Test</w:t>
+            </w:r>
+          </w:p>
+        </w:tc>
+        <w:tc>
+          <w:tcPr>
+            <w:tcW w:type="dxa" w:w="4320"/>
+          </w:tcPr>
+          <w:p>
+            <w:r>
+              <w:t>1185</w:t>
             </w:r>
           </w:p>
         </w:tc>
@@ -1400,69 +1258,13 @@
           </w:tcPr>
           <w:p>
             <w:r>
-              <w:t>7,900</w:t>
+              <w:t>7900</w:t>
             </w:r>
           </w:p>
         </w:tc>
       </w:tr>
     </w:tbl>
     <w:p/>
-    <w:p>
-      <w:pPr>
-        <w:jc w:val="center"/>
-      </w:pPr>
-      <w:r>
-        <w:drawing>
-          <wp:inline xmlns:a="http://schemas.openxmlformats.org/drawingml/2006/main" xmlns:pic="http://schemas.openxmlformats.org/drawingml/2006/picture">
-            <wp:extent cx="4572000" cy="2857500"/>
-            <wp:docPr id="2" name="Picture 2"/>
-            <wp:cNvGraphicFramePr>
-              <a:graphicFrameLocks noChangeAspect="1"/>
-            </wp:cNvGraphicFramePr>
-            <a:graphic>
-              <a:graphicData uri="http://schemas.openxmlformats.org/drawingml/2006/picture">
-                <pic:pic>
-                  <pic:nvPicPr>
-                    <pic:cNvPr id="0" name="10-dataset.png"/>
-                    <pic:cNvPicPr/>
-                  </pic:nvPicPr>
-                  <pic:blipFill>
-                    <a:blip r:embed="rId12"/>
-                    <a:stretch>
-                      <a:fillRect/>
-                    </a:stretch>
-                  </pic:blipFill>
-                  <pic:spPr>
-                    <a:xfrm>
-                      <a:off x="0" y="0"/>
-                      <a:ext cx="4572000" cy="2857500"/>
-                    </a:xfrm>
-                    <a:prstGeom prst="rect"/>
-                  </pic:spPr>
-                </pic:pic>
-              </a:graphicData>
-            </a:graphic>
-          </wp:inline>
-        </w:drawing>
-      </w:r>
-    </w:p>
-    <w:p>
-      <w:pPr>
-        <w:pStyle w:val="Caption"/>
-        <w:jc w:val="center"/>
-      </w:pPr>
-      <w:r>
-        <w:t xml:space="preserve">Figure </w:t>
-        <w:fldChar w:fldCharType="begin"/>
-        <w:instrText xml:space="preserve">SEQ Figure \* ARABIC</w:instrText>
-        <w:fldChar w:fldCharType="separate"/>
-        <w:t>2</w:t>
-        <w:fldChar w:fldCharType="end"/>
-      </w:r>
-      <w:r>
-        <w:t>: Dataset Repository User Interface</w:t>
-      </w:r>
-    </w:p>
     <w:p>
       <w:pPr>
         <w:pStyle w:val="Heading1"/>
@@ -1528,6 +1330,94 @@
                 <w:b/>
               </w:rPr>
               <w:t>Value</w:t>
+            </w:r>
+          </w:p>
+        </w:tc>
+      </w:tr>
+      <w:tr>
+        <w:tc>
+          <w:tcPr>
+            <w:tcW w:type="dxa" w:w="4320"/>
+          </w:tcPr>
+          <w:p>
+            <w:r>
+              <w:t>Model Summary</w:t>
+            </w:r>
+          </w:p>
+        </w:tc>
+        <w:tc>
+          <w:tcPr>
+            <w:tcW w:type="dxa" w:w="4320"/>
+          </w:tcPr>
+          <w:p>
+            <w:r>
+              <w:t>EfficientNetV2B0 Feature Extractor + Dense Head</w:t>
+            </w:r>
+          </w:p>
+        </w:tc>
+      </w:tr>
+      <w:tr>
+        <w:tc>
+          <w:tcPr>
+            <w:tcW w:type="dxa" w:w="4320"/>
+          </w:tcPr>
+          <w:p>
+            <w:r>
+              <w:t>Number of Parameters</w:t>
+            </w:r>
+          </w:p>
+        </w:tc>
+        <w:tc>
+          <w:tcPr>
+            <w:tcW w:type="dxa" w:w="4320"/>
+          </w:tcPr>
+          <w:p>
+            <w:r>
+              <w:t>7,189,235</w:t>
+            </w:r>
+          </w:p>
+        </w:tc>
+      </w:tr>
+      <w:tr>
+        <w:tc>
+          <w:tcPr>
+            <w:tcW w:type="dxa" w:w="4320"/>
+          </w:tcPr>
+          <w:p>
+            <w:r>
+              <w:t>Frozen Layers</w:t>
+            </w:r>
+          </w:p>
+        </w:tc>
+        <w:tc>
+          <w:tcPr>
+            <w:tcW w:type="dxa" w:w="4320"/>
+          </w:tcPr>
+          <w:p>
+            <w:r>
+              <w:t>260</w:t>
+            </w:r>
+          </w:p>
+        </w:tc>
+      </w:tr>
+      <w:tr>
+        <w:tc>
+          <w:tcPr>
+            <w:tcW w:type="dxa" w:w="4320"/>
+          </w:tcPr>
+          <w:p>
+            <w:r>
+              <w:t>Trainable Layers</w:t>
+            </w:r>
+          </w:p>
+        </w:tc>
+        <w:tc>
+          <w:tcPr>
+            <w:tcW w:type="dxa" w:w="4320"/>
+          </w:tcPr>
+          <w:p>
+            <w:r>
+              <w:t>8 (Dense and BatchNormalization)</w:t>
             </w:r>
           </w:p>
         </w:tc>
@@ -1734,13 +1624,21 @@
     <w:p/>
     <w:p>
       <w:pPr>
+        <w:pStyle w:val="Heading1"/>
+      </w:pPr>
+      <w:r>
+        <w:t>13. Prediction Pipeline Workflow</w:t>
+      </w:r>
+    </w:p>
+    <w:p>
+      <w:pPr>
         <w:jc w:val="center"/>
       </w:pPr>
       <w:r>
         <w:drawing>
           <wp:inline xmlns:a="http://schemas.openxmlformats.org/drawingml/2006/main" xmlns:pic="http://schemas.openxmlformats.org/drawingml/2006/picture">
-            <wp:extent cx="4572000" cy="3565525"/>
-            <wp:docPr id="3" name="Picture 3"/>
+            <wp:extent cx="3657600" cy="5377049"/>
+            <wp:docPr id="2" name="Picture 2"/>
             <wp:cNvGraphicFramePr>
               <a:graphicFrameLocks noChangeAspect="1"/>
             </wp:cNvGraphicFramePr>
@@ -1748,11 +1646,11 @@
               <a:graphicData uri="http://schemas.openxmlformats.org/drawingml/2006/picture">
                 <pic:pic>
                   <pic:nvPicPr>
-                    <pic:cNvPr id="0" name="11-model-manager.png"/>
+                    <pic:cNvPr id="0" name="workflow.png"/>
                     <pic:cNvPicPr/>
                   </pic:nvPicPr>
                   <pic:blipFill>
-                    <a:blip r:embed="rId13"/>
+                    <a:blip r:embed="rId12"/>
                     <a:stretch>
                       <a:fillRect/>
                     </a:stretch>
@@ -1760,7 +1658,7 @@
                   <pic:spPr>
                     <a:xfrm>
                       <a:off x="0" y="0"/>
-                      <a:ext cx="4572000" cy="3565525"/>
+                      <a:ext cx="3657600" cy="5377049"/>
                     </a:xfrm>
                     <a:prstGeom prst="rect"/>
                   </pic:spPr>
@@ -1781,182 +1679,11 @@
         <w:fldChar w:fldCharType="begin"/>
         <w:instrText xml:space="preserve">SEQ Figure \* ARABIC</w:instrText>
         <w:fldChar w:fldCharType="separate"/>
-        <w:t>3</w:t>
+        <w:t>2</w:t>
         <w:fldChar w:fldCharType="end"/>
       </w:r>
       <w:r>
-        <w:t>: Model Management Interface</w:t>
-      </w:r>
-    </w:p>
-    <w:p>
-      <w:pPr>
-        <w:pStyle w:val="Heading1"/>
-      </w:pPr>
-      <w:r>
-        <w:t>13. Prediction Pipeline Workflow</w:t>
-      </w:r>
-    </w:p>
-    <w:p>
-      <w:pPr>
-        <w:jc w:val="center"/>
-      </w:pPr>
-      <w:r>
-        <w:rPr>
-          <w:b/>
-        </w:rPr>
-        <w:t>Start</w:t>
-      </w:r>
-    </w:p>
-    <w:p>
-      <w:pPr>
-        <w:jc w:val="center"/>
-      </w:pPr>
-      <w:r>
-        <w:t>↓</w:t>
-      </w:r>
-    </w:p>
-    <w:p>
-      <w:pPr>
-        <w:jc w:val="center"/>
-      </w:pPr>
-      <w:r>
-        <w:rPr>
-          <w:b/>
-        </w:rPr>
-        <w:t>Upload Image / Live Stream</w:t>
-      </w:r>
-    </w:p>
-    <w:p>
-      <w:pPr>
-        <w:jc w:val="center"/>
-      </w:pPr>
-      <w:r>
-        <w:t>↓</w:t>
-      </w:r>
-    </w:p>
-    <w:p>
-      <w:pPr>
-        <w:jc w:val="center"/>
-      </w:pPr>
-      <w:r>
-        <w:rPr>
-          <w:b/>
-        </w:rPr>
-        <w:t>Preprocessing &amp; Normalization</w:t>
-      </w:r>
-    </w:p>
-    <w:p>
-      <w:pPr>
-        <w:jc w:val="center"/>
-      </w:pPr>
-      <w:r>
-        <w:t>↓</w:t>
-      </w:r>
-    </w:p>
-    <w:p>
-      <w:pPr>
-        <w:jc w:val="center"/>
-      </w:pPr>
-      <w:r>
-        <w:rPr>
-          <w:b/>
-        </w:rPr>
-        <w:t>Prediction Inference</w:t>
-      </w:r>
-    </w:p>
-    <w:p>
-      <w:pPr>
-        <w:jc w:val="center"/>
-      </w:pPr>
-      <w:r>
-        <w:t>↓</w:t>
-      </w:r>
-    </w:p>
-    <w:p>
-      <w:pPr>
-        <w:jc w:val="center"/>
-      </w:pPr>
-      <w:r>
-        <w:rPr>
-          <w:b/>
-        </w:rPr>
-        <w:t>Confidence Threshold Check (&gt; 65%)</w:t>
-      </w:r>
-    </w:p>
-    <w:p>
-      <w:pPr>
-        <w:jc w:val="center"/>
-      </w:pPr>
-      <w:r>
-        <w:t>↓</w:t>
-      </w:r>
-    </w:p>
-    <w:p>
-      <w:pPr>
-        <w:jc w:val="center"/>
-      </w:pPr>
-      <w:r>
-        <w:rPr>
-          <w:b/>
-        </w:rPr>
-        <w:t>Result: Fresh / Rotten / Unknown</w:t>
-      </w:r>
-    </w:p>
-    <w:p>
-      <w:pPr>
-        <w:jc w:val="center"/>
-      </w:pPr>
-      <w:r>
-        <w:t>↓</w:t>
-      </w:r>
-    </w:p>
-    <w:p>
-      <w:pPr>
-        <w:jc w:val="center"/>
-      </w:pPr>
-      <w:r>
-        <w:rPr>
-          <w:b/>
-        </w:rPr>
-        <w:t>Generate Grad-CAM</w:t>
-      </w:r>
-    </w:p>
-    <w:p>
-      <w:pPr>
-        <w:jc w:val="center"/>
-      </w:pPr>
-      <w:r>
-        <w:t>↓</w:t>
-      </w:r>
-    </w:p>
-    <w:p>
-      <w:pPr>
-        <w:jc w:val="center"/>
-      </w:pPr>
-      <w:r>
-        <w:rPr>
-          <w:b/>
-        </w:rPr>
-        <w:t>Store Result in DB</w:t>
-      </w:r>
-    </w:p>
-    <w:p>
-      <w:pPr>
-        <w:jc w:val="center"/>
-      </w:pPr>
-      <w:r>
-        <w:t>↓</w:t>
-      </w:r>
-    </w:p>
-    <w:p>
-      <w:pPr>
-        <w:jc w:val="center"/>
-      </w:pPr>
-      <w:r>
-        <w:rPr>
-          <w:b/>
-        </w:rPr>
-        <w:t>Surface to Dashboard via WebSocket/API</w:t>
+        <w:t>: Prediction Pipeline Flowchart</w:t>
       </w:r>
     </w:p>
     <w:p>
@@ -2201,7 +1928,7 @@
         <w:drawing>
           <wp:inline xmlns:a="http://schemas.openxmlformats.org/drawingml/2006/main" xmlns:pic="http://schemas.openxmlformats.org/drawingml/2006/picture">
             <wp:extent cx="4572000" cy="3695700"/>
-            <wp:docPr id="4" name="Picture 4"/>
+            <wp:docPr id="3" name="Picture 3"/>
             <wp:cNvGraphicFramePr>
               <a:graphicFrameLocks noChangeAspect="1"/>
             </wp:cNvGraphicFramePr>
@@ -2213,7 +1940,7 @@
                     <pic:cNvPicPr/>
                   </pic:nvPicPr>
                   <pic:blipFill>
-                    <a:blip r:embed="rId11"/>
+                    <a:blip r:embed="rId13"/>
                     <a:stretch>
                       <a:fillRect/>
                     </a:stretch>
@@ -2242,7 +1969,7 @@
         <w:fldChar w:fldCharType="begin"/>
         <w:instrText xml:space="preserve">SEQ Figure \* ARABIC</w:instrText>
         <w:fldChar w:fldCharType="separate"/>
-        <w:t>4</w:t>
+        <w:t>3</w:t>
         <w:fldChar w:fldCharType="end"/>
       </w:r>
       <w:r>
@@ -2270,7 +1997,7 @@
         <w:drawing>
           <wp:inline xmlns:a="http://schemas.openxmlformats.org/drawingml/2006/main" xmlns:pic="http://schemas.openxmlformats.org/drawingml/2006/picture">
             <wp:extent cx="4572000" cy="2857500"/>
-            <wp:docPr id="5" name="Picture 5"/>
+            <wp:docPr id="4" name="Picture 4"/>
             <wp:cNvGraphicFramePr>
               <a:graphicFrameLocks noChangeAspect="1"/>
             </wp:cNvGraphicFramePr>
@@ -2311,7 +2038,7 @@
         <w:fldChar w:fldCharType="begin"/>
         <w:instrText xml:space="preserve">SEQ Figure \* ARABIC</w:instrText>
         <w:fldChar w:fldCharType="separate"/>
-        <w:t>5</w:t>
+        <w:t>4</w:t>
         <w:fldChar w:fldCharType="end"/>
       </w:r>
       <w:r>
@@ -2339,7 +2066,7 @@
         <w:drawing>
           <wp:inline xmlns:a="http://schemas.openxmlformats.org/drawingml/2006/main" xmlns:pic="http://schemas.openxmlformats.org/drawingml/2006/picture">
             <wp:extent cx="4572000" cy="4667250"/>
-            <wp:docPr id="6" name="Picture 6"/>
+            <wp:docPr id="5" name="Picture 5"/>
             <wp:cNvGraphicFramePr>
               <a:graphicFrameLocks noChangeAspect="1"/>
             </wp:cNvGraphicFramePr>
@@ -2380,7 +2107,7 @@
         <w:fldChar w:fldCharType="begin"/>
         <w:instrText xml:space="preserve">SEQ Figure \* ARABIC</w:instrText>
         <w:fldChar w:fldCharType="separate"/>
-        <w:t>6</w:t>
+        <w:t>5</w:t>
         <w:fldChar w:fldCharType="end"/>
       </w:r>
       <w:r>
@@ -2388,16 +2115,77 @@
       </w:r>
     </w:p>
     <w:p>
+      <w:r>
+        <w:t>Below is another view of the inspection output emphasizing the Unknown Detection boundaries when an out-of-distribution image is provided.</w:t>
+      </w:r>
+    </w:p>
+    <w:p>
+      <w:pPr>
+        <w:jc w:val="center"/>
+      </w:pPr>
+      <w:r>
+        <w:drawing>
+          <wp:inline xmlns:a="http://schemas.openxmlformats.org/drawingml/2006/main" xmlns:pic="http://schemas.openxmlformats.org/drawingml/2006/picture">
+            <wp:extent cx="4572000" cy="2571750"/>
+            <wp:docPr id="6" name="Picture 6"/>
+            <wp:cNvGraphicFramePr>
+              <a:graphicFrameLocks noChangeAspect="1"/>
+            </wp:cNvGraphicFramePr>
+            <a:graphic>
+              <a:graphicData uri="http://schemas.openxmlformats.org/drawingml/2006/picture">
+                <pic:pic>
+                  <pic:nvPicPr>
+                    <pic:cNvPr id="0" name="14-dark-mode.png"/>
+                    <pic:cNvPicPr/>
+                  </pic:nvPicPr>
+                  <pic:blipFill>
+                    <a:blip r:embed="rId16"/>
+                    <a:stretch>
+                      <a:fillRect/>
+                    </a:stretch>
+                  </pic:blipFill>
+                  <pic:spPr>
+                    <a:xfrm>
+                      <a:off x="0" y="0"/>
+                      <a:ext cx="4572000" cy="2571750"/>
+                    </a:xfrm>
+                    <a:prstGeom prst="rect"/>
+                  </pic:spPr>
+                </pic:pic>
+              </a:graphicData>
+            </a:graphic>
+          </wp:inline>
+        </w:drawing>
+      </w:r>
+    </w:p>
+    <w:p>
+      <w:pPr>
+        <w:pStyle w:val="Caption"/>
+        <w:jc w:val="center"/>
+      </w:pPr>
+      <w:r>
+        <w:t xml:space="preserve">Figure </w:t>
+        <w:fldChar w:fldCharType="begin"/>
+        <w:instrText xml:space="preserve">SEQ Figure \* ARABIC</w:instrText>
+        <w:fldChar w:fldCharType="separate"/>
+        <w:t>6</w:t>
+        <w:fldChar w:fldCharType="end"/>
+      </w:r>
+      <w:r>
+        <w:t>: System Dark Mode and Out-of-Distribution Views</w:t>
+      </w:r>
+    </w:p>
+    <w:p>
       <w:pPr>
         <w:pStyle w:val="Heading2"/>
       </w:pPr>
       <w:r>
-        <w:t>15.4 Analytics &amp; Reports</w:t>
+        <w:t>15.4 Analytics</w:t>
       </w:r>
     </w:p>
     <w:p>
       <w:r>
-        <w:t>Data collected over time is aggregated into the Analytics module, which uses Chart.js to visualize trends, daily throughput, and defect rates over time. Managers can easily identify periods of low quality. The Reports tab allows users to generate PDF and CSV documents containing raw telemetry for auditing purposes.</w:t>
+        <w:t>Data collected over time is aggregated into the Analytics module, which uses Chart.js to visualize trends, daily throughput, and defect rates over time. Managers can easily identify periods of low quality.</w:t>
       </w:r>
     </w:p>
     <w:p>
@@ -2420,7 +2208,7 @@
                     <pic:cNvPicPr/>
                   </pic:nvPicPr>
                   <pic:blipFill>
-                    <a:blip r:embed="rId16"/>
+                    <a:blip r:embed="rId17"/>
                     <a:stretch>
                       <a:fillRect/>
                     </a:stretch>
@@ -2461,12 +2249,12 @@
         <w:pStyle w:val="Heading2"/>
       </w:pPr>
       <w:r>
-        <w:t>15.5 Inspection History</w:t>
+        <w:t>15.5 Intelligent Reporting</w:t>
       </w:r>
     </w:p>
     <w:p>
       <w:r>
-        <w:t>Every inference is securely logged into the SQLite database and presented in the History module. It features a robust, dynamic data table with Global Search capabilities, date range filters, and prediction status filters. Operators can review past decisions, verify the Grad-CAM thumbnail, and delete erroneous entries if authorized.</w:t>
+        <w:t>The Reports module enables supervisors to extract insights automatically. It generates detailed PDF and CSV documents containing raw telemetry for auditing purposes, bridging the gap between factory floor operations and executive review.</w:t>
       </w:r>
     </w:p>
     <w:p>
@@ -2476,7 +2264,7 @@
       <w:r>
         <w:drawing>
           <wp:inline xmlns:a="http://schemas.openxmlformats.org/drawingml/2006/main" xmlns:pic="http://schemas.openxmlformats.org/drawingml/2006/picture">
-            <wp:extent cx="4572000" cy="2857500"/>
+            <wp:extent cx="4572000" cy="2571750"/>
             <wp:docPr id="8" name="Picture 8"/>
             <wp:cNvGraphicFramePr>
               <a:graphicFrameLocks noChangeAspect="1"/>
@@ -2485,11 +2273,11 @@
               <a:graphicData uri="http://schemas.openxmlformats.org/drawingml/2006/picture">
                 <pic:pic>
                   <pic:nvPicPr>
-                    <pic:cNvPr id="0" name="08-history.png"/>
+                    <pic:cNvPr id="0" name="09-reports.png"/>
                     <pic:cNvPicPr/>
                   </pic:nvPicPr>
                   <pic:blipFill>
-                    <a:blip r:embed="rId17"/>
+                    <a:blip r:embed="rId18"/>
                     <a:stretch>
                       <a:fillRect/>
                     </a:stretch>
@@ -2497,7 +2285,7 @@
                   <pic:spPr>
                     <a:xfrm>
                       <a:off x="0" y="0"/>
-                      <a:ext cx="4572000" cy="2857500"/>
+                      <a:ext cx="4572000" cy="2571750"/>
                     </a:xfrm>
                     <a:prstGeom prst="rect"/>
                   </pic:spPr>
@@ -2522,7 +2310,7 @@
         <w:fldChar w:fldCharType="end"/>
       </w:r>
       <w:r>
-        <w:t>: Inspection History and Log Search</w:t>
+        <w:t>: Intelligent Reporting Module</w:t>
       </w:r>
     </w:p>
     <w:p>
@@ -2530,12 +2318,12 @@
         <w:pStyle w:val="Heading2"/>
       </w:pPr>
       <w:r>
-        <w:t>15.6 Security &amp; Authentication</w:t>
+        <w:t>15.6 Inspection History</w:t>
       </w:r>
     </w:p>
     <w:p>
       <w:r>
-        <w:t>Authentication is handled by Flask-Login with passwords encrypted using Werkzeug's PBKDF2 hashing algorithm. Route decorators (`@login_required`) ensure unauthenticated users are redirected. Additionally, Flask-Limiter enforces rate limits (e.g., 1000 requests/hour) to prevent DDoS attacks.</w:t>
+        <w:t>Every inference is securely logged into the SQLite database and presented in the History module. It features a robust, dynamic data table with Global Search capabilities, date range filters, and prediction status filters. Operators can review past decisions, verify the Grad-CAM thumbnail, and delete erroneous entries if authorized.</w:t>
       </w:r>
     </w:p>
     <w:p>
@@ -2554,11 +2342,11 @@
               <a:graphicData uri="http://schemas.openxmlformats.org/drawingml/2006/picture">
                 <pic:pic>
                   <pic:nvPicPr>
-                    <pic:cNvPr id="0" name="01-login.png"/>
+                    <pic:cNvPr id="0" name="08-history.png"/>
                     <pic:cNvPicPr/>
                   </pic:nvPicPr>
                   <pic:blipFill>
-                    <a:blip r:embed="rId18"/>
+                    <a:blip r:embed="rId19"/>
                     <a:stretch>
                       <a:fillRect/>
                     </a:stretch>
@@ -2591,7 +2379,283 @@
         <w:fldChar w:fldCharType="end"/>
       </w:r>
       <w:r>
-        <w:t>: Secure Login &amp; Authentication Module</w:t>
+        <w:t>: Inspection History and Log Search</w:t>
+      </w:r>
+    </w:p>
+    <w:p>
+      <w:pPr>
+        <w:pStyle w:val="Heading2"/>
+      </w:pPr>
+      <w:r>
+        <w:t>15.7 Dataset Repository</w:t>
+      </w:r>
+    </w:p>
+    <w:p>
+      <w:r>
+        <w:t>The Dataset Repository module allows administrators to view, audit, and manage the training data from within the platform. This guarantees data provenance and allows for continuous learning pipelines by identifying misclassified images.</w:t>
+      </w:r>
+    </w:p>
+    <w:p>
+      <w:pPr>
+        <w:jc w:val="center"/>
+      </w:pPr>
+      <w:r>
+        <w:drawing>
+          <wp:inline xmlns:a="http://schemas.openxmlformats.org/drawingml/2006/main" xmlns:pic="http://schemas.openxmlformats.org/drawingml/2006/picture">
+            <wp:extent cx="4572000" cy="2857500"/>
+            <wp:docPr id="10" name="Picture 10"/>
+            <wp:cNvGraphicFramePr>
+              <a:graphicFrameLocks noChangeAspect="1"/>
+            </wp:cNvGraphicFramePr>
+            <a:graphic>
+              <a:graphicData uri="http://schemas.openxmlformats.org/drawingml/2006/picture">
+                <pic:pic>
+                  <pic:nvPicPr>
+                    <pic:cNvPr id="0" name="10-dataset.png"/>
+                    <pic:cNvPicPr/>
+                  </pic:nvPicPr>
+                  <pic:blipFill>
+                    <a:blip r:embed="rId20"/>
+                    <a:stretch>
+                      <a:fillRect/>
+                    </a:stretch>
+                  </pic:blipFill>
+                  <pic:spPr>
+                    <a:xfrm>
+                      <a:off x="0" y="0"/>
+                      <a:ext cx="4572000" cy="2857500"/>
+                    </a:xfrm>
+                    <a:prstGeom prst="rect"/>
+                  </pic:spPr>
+                </pic:pic>
+              </a:graphicData>
+            </a:graphic>
+          </wp:inline>
+        </w:drawing>
+      </w:r>
+    </w:p>
+    <w:p>
+      <w:pPr>
+        <w:pStyle w:val="Caption"/>
+        <w:jc w:val="center"/>
+      </w:pPr>
+      <w:r>
+        <w:t xml:space="preserve">Figure </w:t>
+        <w:fldChar w:fldCharType="begin"/>
+        <w:instrText xml:space="preserve">SEQ Figure \* ARABIC</w:instrText>
+        <w:fldChar w:fldCharType="separate"/>
+        <w:t>10</w:t>
+        <w:fldChar w:fldCharType="end"/>
+      </w:r>
+      <w:r>
+        <w:t>: Dataset Repository Management</w:t>
+      </w:r>
+    </w:p>
+    <w:p>
+      <w:pPr>
+        <w:pStyle w:val="Heading2"/>
+      </w:pPr>
+      <w:r>
+        <w:t>15.8 Model Management</w:t>
+      </w:r>
+    </w:p>
+    <w:p>
+      <w:r>
+        <w:t>Administrators can manage the lifecycle of the AI models. This interface tracks the performance metrics, validation loss, and epochs of current models, and allows hot-swapping to newer model iterations without downtime.</w:t>
+      </w:r>
+    </w:p>
+    <w:p>
+      <w:pPr>
+        <w:jc w:val="center"/>
+      </w:pPr>
+      <w:r>
+        <w:drawing>
+          <wp:inline xmlns:a="http://schemas.openxmlformats.org/drawingml/2006/main" xmlns:pic="http://schemas.openxmlformats.org/drawingml/2006/picture">
+            <wp:extent cx="4572000" cy="3565525"/>
+            <wp:docPr id="11" name="Picture 11"/>
+            <wp:cNvGraphicFramePr>
+              <a:graphicFrameLocks noChangeAspect="1"/>
+            </wp:cNvGraphicFramePr>
+            <a:graphic>
+              <a:graphicData uri="http://schemas.openxmlformats.org/drawingml/2006/picture">
+                <pic:pic>
+                  <pic:nvPicPr>
+                    <pic:cNvPr id="0" name="11-model-manager.png"/>
+                    <pic:cNvPicPr/>
+                  </pic:nvPicPr>
+                  <pic:blipFill>
+                    <a:blip r:embed="rId21"/>
+                    <a:stretch>
+                      <a:fillRect/>
+                    </a:stretch>
+                  </pic:blipFill>
+                  <pic:spPr>
+                    <a:xfrm>
+                      <a:off x="0" y="0"/>
+                      <a:ext cx="4572000" cy="3565525"/>
+                    </a:xfrm>
+                    <a:prstGeom prst="rect"/>
+                  </pic:spPr>
+                </pic:pic>
+              </a:graphicData>
+            </a:graphic>
+          </wp:inline>
+        </w:drawing>
+      </w:r>
+    </w:p>
+    <w:p>
+      <w:pPr>
+        <w:pStyle w:val="Caption"/>
+        <w:jc w:val="center"/>
+      </w:pPr>
+      <w:r>
+        <w:t xml:space="preserve">Figure </w:t>
+        <w:fldChar w:fldCharType="begin"/>
+        <w:instrText xml:space="preserve">SEQ Figure \* ARABIC</w:instrText>
+        <w:fldChar w:fldCharType="separate"/>
+        <w:t>11</w:t>
+        <w:fldChar w:fldCharType="end"/>
+      </w:r>
+      <w:r>
+        <w:t>: AI Model Management</w:t>
+      </w:r>
+    </w:p>
+    <w:p>
+      <w:pPr>
+        <w:pStyle w:val="Heading2"/>
+      </w:pPr>
+      <w:r>
+        <w:t>15.9 Knowledge Center</w:t>
+      </w:r>
+    </w:p>
+    <w:p>
+      <w:r>
+        <w:t>The Knowledge Center is an interactive built-in documentation suite. It educates operators on how to interpret Grad-CAM heatmaps, outlines system limitations, and provides standard operating procedures (SOPs).</w:t>
+      </w:r>
+    </w:p>
+    <w:p>
+      <w:pPr>
+        <w:jc w:val="center"/>
+      </w:pPr>
+      <w:r>
+        <w:drawing>
+          <wp:inline xmlns:a="http://schemas.openxmlformats.org/drawingml/2006/main" xmlns:pic="http://schemas.openxmlformats.org/drawingml/2006/picture">
+            <wp:extent cx="4572000" cy="2571750"/>
+            <wp:docPr id="12" name="Picture 12"/>
+            <wp:cNvGraphicFramePr>
+              <a:graphicFrameLocks noChangeAspect="1"/>
+            </wp:cNvGraphicFramePr>
+            <a:graphic>
+              <a:graphicData uri="http://schemas.openxmlformats.org/drawingml/2006/picture">
+                <pic:pic>
+                  <pic:nvPicPr>
+                    <pic:cNvPr id="0" name="13-knowledge-center.png"/>
+                    <pic:cNvPicPr/>
+                  </pic:nvPicPr>
+                  <pic:blipFill>
+                    <a:blip r:embed="rId22"/>
+                    <a:stretch>
+                      <a:fillRect/>
+                    </a:stretch>
+                  </pic:blipFill>
+                  <pic:spPr>
+                    <a:xfrm>
+                      <a:off x="0" y="0"/>
+                      <a:ext cx="4572000" cy="2571750"/>
+                    </a:xfrm>
+                    <a:prstGeom prst="rect"/>
+                  </pic:spPr>
+                </pic:pic>
+              </a:graphicData>
+            </a:graphic>
+          </wp:inline>
+        </w:drawing>
+      </w:r>
+    </w:p>
+    <w:p>
+      <w:pPr>
+        <w:pStyle w:val="Caption"/>
+        <w:jc w:val="center"/>
+      </w:pPr>
+      <w:r>
+        <w:t xml:space="preserve">Figure </w:t>
+        <w:fldChar w:fldCharType="begin"/>
+        <w:instrText xml:space="preserve">SEQ Figure \* ARABIC</w:instrText>
+        <w:fldChar w:fldCharType="separate"/>
+        <w:t>12</w:t>
+        <w:fldChar w:fldCharType="end"/>
+      </w:r>
+      <w:r>
+        <w:t>: Knowledge Center Documentation</w:t>
+      </w:r>
+    </w:p>
+    <w:p>
+      <w:pPr>
+        <w:pStyle w:val="Heading2"/>
+      </w:pPr>
+      <w:r>
+        <w:t>15.10 Settings</w:t>
+      </w:r>
+    </w:p>
+    <w:p>
+      <w:r>
+        <w:t>The Settings page manages global configurations, including theming, user role provisioning, API rate limits, and threshold adjustments for the model's confidence required to pass a quality check.</w:t>
+      </w:r>
+    </w:p>
+    <w:p>
+      <w:pPr>
+        <w:jc w:val="center"/>
+      </w:pPr>
+      <w:r>
+        <w:drawing>
+          <wp:inline xmlns:a="http://schemas.openxmlformats.org/drawingml/2006/main" xmlns:pic="http://schemas.openxmlformats.org/drawingml/2006/picture">
+            <wp:extent cx="4572000" cy="2571750"/>
+            <wp:docPr id="13" name="Picture 13"/>
+            <wp:cNvGraphicFramePr>
+              <a:graphicFrameLocks noChangeAspect="1"/>
+            </wp:cNvGraphicFramePr>
+            <a:graphic>
+              <a:graphicData uri="http://schemas.openxmlformats.org/drawingml/2006/picture">
+                <pic:pic>
+                  <pic:nvPicPr>
+                    <pic:cNvPr id="0" name="12-settings.png"/>
+                    <pic:cNvPicPr/>
+                  </pic:nvPicPr>
+                  <pic:blipFill>
+                    <a:blip r:embed="rId23"/>
+                    <a:stretch>
+                      <a:fillRect/>
+                    </a:stretch>
+                  </pic:blipFill>
+                  <pic:spPr>
+                    <a:xfrm>
+                      <a:off x="0" y="0"/>
+                      <a:ext cx="4572000" cy="2571750"/>
+                    </a:xfrm>
+                    <a:prstGeom prst="rect"/>
+                  </pic:spPr>
+                </pic:pic>
+              </a:graphicData>
+            </a:graphic>
+          </wp:inline>
+        </w:drawing>
+      </w:r>
+    </w:p>
+    <w:p>
+      <w:pPr>
+        <w:pStyle w:val="Caption"/>
+        <w:jc w:val="center"/>
+      </w:pPr>
+      <w:r>
+        <w:t xml:space="preserve">Figure </w:t>
+        <w:fldChar w:fldCharType="begin"/>
+        <w:instrText xml:space="preserve">SEQ Figure \* ARABIC</w:instrText>
+        <w:fldChar w:fldCharType="separate"/>
+        <w:t>13</w:t>
+        <w:fldChar w:fldCharType="end"/>
+      </w:r>
+      <w:r>
+        <w:t>: Global Settings and Configuration</w:t>
       </w:r>
     </w:p>
     <w:p>
@@ -2645,7 +2709,7 @@
               <w:rPr>
                 <w:b/>
               </w:rPr>
-              <w:t>Test Category</w:t>
+              <w:t>Test</w:t>
             </w:r>
           </w:p>
         </w:tc>
@@ -2670,7 +2734,7 @@
           </w:tcPr>
           <w:p>
             <w:r>
-              <w:t>Secure Login &amp; Session Management</w:t>
+              <w:t>Login</w:t>
             </w:r>
           </w:p>
         </w:tc>
@@ -2692,7 +2756,7 @@
           </w:tcPr>
           <w:p>
             <w:r>
-              <w:t>Single Image Upload Inference</w:t>
+              <w:t>Upload</w:t>
             </w:r>
           </w:p>
         </w:tc>
@@ -2714,7 +2778,7 @@
           </w:tcPr>
           <w:p>
             <w:r>
-              <w:t>Continuous Webcam Streaming</w:t>
+              <w:t>Webcam</w:t>
             </w:r>
           </w:p>
         </w:tc>
@@ -2736,7 +2800,7 @@
           </w:tcPr>
           <w:p>
             <w:r>
-              <w:t>AI Prediction Accuracy &amp; Boundaries</w:t>
+              <w:t>Prediction</w:t>
             </w:r>
           </w:p>
         </w:tc>
@@ -2758,7 +2822,7 @@
           </w:tcPr>
           <w:p>
             <w:r>
-              <w:t>Database Telemetry Logging</w:t>
+              <w:t>Database</w:t>
             </w:r>
           </w:p>
         </w:tc>
@@ -2780,29 +2844,7 @@
           </w:tcPr>
           <w:p>
             <w:r>
-              <w:t>CSV / PDF Report Generation</w:t>
-            </w:r>
-          </w:p>
-        </w:tc>
-        <w:tc>
-          <w:tcPr>
-            <w:tcW w:type="dxa" w:w="4320"/>
-          </w:tcPr>
-          <w:p>
-            <w:r>
-              <w:t>Passed</w:t>
-            </w:r>
-          </w:p>
-        </w:tc>
-      </w:tr>
-      <w:tr>
-        <w:tc>
-          <w:tcPr>
-            <w:tcW w:type="dxa" w:w="4320"/>
-          </w:tcPr>
-          <w:p>
-            <w:r>
-              <w:t>Rate Limiting &amp; Security Defenses</w:t>
+              <w:t>Reports</w:t>
             </w:r>
           </w:p>
         </w:tc>
@@ -2895,7 +2937,7 @@
           </w:tcPr>
           <w:p>
             <w:r>
-              <w:t>Validation Accuracy</w:t>
+              <w:t>Accuracy</w:t>
             </w:r>
           </w:p>
         </w:tc>
@@ -2917,7 +2959,7 @@
           </w:tcPr>
           <w:p>
             <w:r>
-              <w:t>Validation Loss</w:t>
+              <w:t>Loss</w:t>
             </w:r>
           </w:p>
         </w:tc>
@@ -2939,7 +2981,7 @@
           </w:tcPr>
           <w:p>
             <w:r>
-              <w:t>Testing GPU</w:t>
+              <w:t>GPU</w:t>
             </w:r>
           </w:p>
         </w:tc>
@@ -2949,7 +2991,7 @@
           </w:tcPr>
           <w:p>
             <w:r>
-              <w:t>NVIDIA GeForce RTX 3050</w:t>
+              <w:t>RTX 3050</w:t>
             </w:r>
           </w:p>
         </w:tc>
@@ -2961,7 +3003,7 @@
           </w:tcPr>
           <w:p>
             <w:r>
-              <w:t>Avg GPU Inference Time</w:t>
+              <w:t>Inference Time</w:t>
             </w:r>
           </w:p>
         </w:tc>
@@ -2971,7 +3013,7 @@
           </w:tcPr>
           <w:p>
             <w:r>
-              <w:t>45 ms (Sub-second)</w:t>
+              <w:t>45 ms</w:t>
             </w:r>
           </w:p>
         </w:tc>
@@ -2983,7 +3025,7 @@
           </w:tcPr>
           <w:p>
             <w:r>
-              <w:t>Avg CPU Inference Time</w:t>
+              <w:t>CPU Time</w:t>
             </w:r>
           </w:p>
         </w:tc>
@@ -2998,30 +3040,64 @@
           </w:p>
         </w:tc>
       </w:tr>
-      <w:tr>
-        <w:tc>
-          <w:tcPr>
-            <w:tcW w:type="dxa" w:w="4320"/>
-          </w:tcPr>
-          <w:p>
-            <w:r>
-              <w:t>Peak RAM Usage</w:t>
-            </w:r>
-          </w:p>
-        </w:tc>
-        <w:tc>
-          <w:tcPr>
-            <w:tcW w:type="dxa" w:w="4320"/>
-          </w:tcPr>
-          <w:p>
-            <w:r>
-              <w:t>273.52 MB</w:t>
-            </w:r>
-          </w:p>
-        </w:tc>
-      </w:tr>
     </w:tbl>
     <w:p/>
+    <w:p>
+      <w:pPr>
+        <w:jc w:val="center"/>
+      </w:pPr>
+      <w:r>
+        <w:drawing>
+          <wp:inline xmlns:a="http://schemas.openxmlformats.org/drawingml/2006/main" xmlns:pic="http://schemas.openxmlformats.org/drawingml/2006/picture">
+            <wp:extent cx="5486400" cy="2956174"/>
+            <wp:docPr id="14" name="Picture 14"/>
+            <wp:cNvGraphicFramePr>
+              <a:graphicFrameLocks noChangeAspect="1"/>
+            </wp:cNvGraphicFramePr>
+            <a:graphic>
+              <a:graphicData uri="http://schemas.openxmlformats.org/drawingml/2006/picture">
+                <pic:pic>
+                  <pic:nvPicPr>
+                    <pic:cNvPr id="0" name="performance_chart.png"/>
+                    <pic:cNvPicPr/>
+                  </pic:nvPicPr>
+                  <pic:blipFill>
+                    <a:blip r:embed="rId24"/>
+                    <a:stretch>
+                      <a:fillRect/>
+                    </a:stretch>
+                  </pic:blipFill>
+                  <pic:spPr>
+                    <a:xfrm>
+                      <a:off x="0" y="0"/>
+                      <a:ext cx="5486400" cy="2956174"/>
+                    </a:xfrm>
+                    <a:prstGeom prst="rect"/>
+                  </pic:spPr>
+                </pic:pic>
+              </a:graphicData>
+            </a:graphic>
+          </wp:inline>
+        </w:drawing>
+      </w:r>
+    </w:p>
+    <w:p>
+      <w:pPr>
+        <w:pStyle w:val="Caption"/>
+        <w:jc w:val="center"/>
+      </w:pPr>
+      <w:r>
+        <w:t xml:space="preserve">Figure </w:t>
+        <w:fldChar w:fldCharType="begin"/>
+        <w:instrText xml:space="preserve">SEQ Figure \* ARABIC</w:instrText>
+        <w:fldChar w:fldCharType="separate"/>
+        <w:t>14</w:t>
+        <w:fldChar w:fldCharType="end"/>
+      </w:r>
+      <w:r>
+        <w:t>: Training Performance over 25 Epochs</w:t>
+      </w:r>
+    </w:p>
     <w:p>
       <w:pPr>
         <w:pStyle w:val="Heading1"/>

</xml_diff>

<commit_message>
docs: update project report and add architectural and repository screenshots
</commit_message>
<xml_diff>
--- a/QualiVision_AI_Project_Report.docx
+++ b/QualiVision_AI_Project_Report.docx
@@ -2,11 +2,11 @@
 <file path=word/document.xml><?xml version="1.0" encoding="utf-8"?>
 <w:document xmlns:wpc="http://schemas.microsoft.com/office/word/2010/wordprocessingCanvas" xmlns:mo="http://schemas.microsoft.com/office/mac/office/2008/main" xmlns:mc="http://schemas.openxmlformats.org/markup-compatibility/2006" xmlns:mv="urn:schemas-microsoft-com:mac:vml" xmlns:o="urn:schemas-microsoft-com:office:office" xmlns:r="http://schemas.openxmlformats.org/officeDocument/2006/relationships" xmlns:m="http://schemas.openxmlformats.org/officeDocument/2006/math" xmlns:v="urn:schemas-microsoft-com:vml" xmlns:wp14="http://schemas.microsoft.com/office/word/2010/wordprocessingDrawing" xmlns:wp="http://schemas.openxmlformats.org/drawingml/2006/wordprocessingDrawing" xmlns:w10="urn:schemas-microsoft-com:office:word" xmlns:w="http://schemas.openxmlformats.org/wordprocessingml/2006/main" xmlns:w14="http://schemas.microsoft.com/office/word/2010/wordml" xmlns:wpg="http://schemas.microsoft.com/office/word/2010/wordprocessingGroup" xmlns:wpi="http://schemas.microsoft.com/office/word/2010/wordprocessingInk" xmlns:wne="http://schemas.microsoft.com/office/word/2006/wordml" xmlns:wps="http://schemas.microsoft.com/office/word/2010/wordprocessingShape" mc:Ignorable="w14 wp14">
   <w:body>
-    <w:p/>
-    <w:p/>
-    <w:p/>
-    <w:p/>
-    <w:p/>
+    <w:p>
+      <w:pPr>
+        <w:jc w:val="both"/>
+      </w:pPr>
+    </w:p>
     <w:p>
       <w:pPr>
         <w:pStyle w:val="Title"/>
@@ -23,7 +23,6 @@
       </w:pPr>
       <w:r>
         <w:t>AI-Powered Industrial Quality Control System</w:t>
-        <w:br/>
       </w:r>
     </w:p>
     <w:p>
@@ -33,8 +32,6 @@
       </w:pPr>
       <w:r>
         <w:t>A Final Project Report</w:t>
-        <w:br/>
-        <w:br/>
       </w:r>
     </w:p>
     <w:p>
@@ -50,7 +47,6 @@
           <w:b/>
         </w:rPr>
         <w:t>Jiphin George</w:t>
-        <w:br/>
       </w:r>
     </w:p>
     <w:p>
@@ -66,8 +62,6 @@
           <w:b/>
         </w:rPr>
         <w:t>Master of Computer Applications (MCA)</w:t>
-        <w:br/>
-        <w:br/>
       </w:r>
     </w:p>
     <w:p>
@@ -83,8 +77,6 @@
           <w:b/>
         </w:rPr>
         <w:t>Nestsoft Technomaster</w:t>
-        <w:br/>
-        <w:br/>
       </w:r>
     </w:p>
     <w:p>
@@ -100,8 +92,45 @@
           <w:b/>
         </w:rPr>
         <w:t>https://github.com/JiphinGeorge/SmartCam-AI---Industrial-Quality-Control-System</w:t>
-        <w:br/>
-        <w:br/>
+      </w:r>
+    </w:p>
+    <w:p>
+      <w:pPr>
+        <w:jc w:val="center"/>
+      </w:pPr>
+      <w:r>
+        <w:drawing>
+          <wp:inline xmlns:a="http://schemas.openxmlformats.org/drawingml/2006/main" xmlns:pic="http://schemas.openxmlformats.org/drawingml/2006/picture">
+            <wp:extent cx="1097280" cy="1097280"/>
+            <wp:docPr id="1" name="Picture 1"/>
+            <wp:cNvGraphicFramePr>
+              <a:graphicFrameLocks noChangeAspect="1"/>
+            </wp:cNvGraphicFramePr>
+            <a:graphic>
+              <a:graphicData uri="http://schemas.openxmlformats.org/drawingml/2006/picture">
+                <pic:pic>
+                  <pic:nvPicPr>
+                    <pic:cNvPr id="0" name="github_qr.png"/>
+                    <pic:cNvPicPr/>
+                  </pic:nvPicPr>
+                  <pic:blipFill>
+                    <a:blip r:embed="rId11"/>
+                    <a:stretch>
+                      <a:fillRect/>
+                    </a:stretch>
+                  </pic:blipFill>
+                  <pic:spPr>
+                    <a:xfrm>
+                      <a:off x="0" y="0"/>
+                      <a:ext cx="1097280" cy="1097280"/>
+                    </a:xfrm>
+                    <a:prstGeom prst="rect"/>
+                  </pic:spPr>
+                </pic:pic>
+              </a:graphicData>
+            </a:graphic>
+          </wp:inline>
+        </w:drawing>
       </w:r>
     </w:p>
     <w:p>
@@ -113,6 +142,9 @@
       </w:r>
     </w:p>
     <w:p>
+      <w:pPr>
+        <w:jc w:val="both"/>
+      </w:pPr>
       <w:r>
         <w:br w:type="page"/>
       </w:r>
@@ -122,15 +154,79 @@
         <w:pStyle w:val="Heading1"/>
       </w:pPr>
       <w:r>
+        <w:t>Declaration</w:t>
+      </w:r>
+    </w:p>
+    <w:p>
+      <w:pPr>
+        <w:jc w:val="both"/>
+      </w:pPr>
+      <w:r>
+        <w:t>I hereby declare that this project report entitled "QualiVision AI – Industrial Quality Control System" submitted in partial fulfillment of the requirements for the Master of Computer Applications (MCA) is an authentic record of my own original work carried out during my internship at Nestsoft Technomaster.</w:t>
+      </w:r>
+    </w:p>
+    <w:p>
+      <w:pPr>
+        <w:jc w:val="both"/>
+      </w:pPr>
+      <w:r>
+        <w:t>The matter embodied in this report has not been submitted by me for the award of any other degree or diploma to any other University or Institution.</w:t>
+      </w:r>
+    </w:p>
+    <w:p>
+      <w:pPr>
+        <w:jc w:val="both"/>
+      </w:pPr>
+      <w:r>
+        <w:t>Place: Ernakulam, Kerala</w:t>
+      </w:r>
+    </w:p>
+    <w:p>
+      <w:pPr>
+        <w:jc w:val="both"/>
+      </w:pPr>
+      <w:r>
+        <w:t>Date: July 2026</w:t>
+      </w:r>
+    </w:p>
+    <w:p>
+      <w:pPr>
+        <w:jc w:val="both"/>
+      </w:pPr>
+      <w:r>
+        <w:t>Signature: ______________________</w:t>
+        <w:br/>
+        <w:t>(Jiphin George)</w:t>
+      </w:r>
+    </w:p>
+    <w:p>
+      <w:pPr>
+        <w:jc w:val="both"/>
+      </w:pPr>
+      <w:r>
+        <w:br w:type="page"/>
+      </w:r>
+    </w:p>
+    <w:p>
+      <w:pPr>
+        <w:pStyle w:val="Heading1"/>
+      </w:pPr>
+      <w:r>
         <w:t>Acknowledgement</w:t>
       </w:r>
     </w:p>
     <w:p>
+      <w:pPr>
+        <w:jc w:val="both"/>
+      </w:pPr>
       <w:r>
         <w:t>I would like to express my deepest gratitude to Nestsoft Technomaster for providing the opportunity to work on this capstone internship project. I am also grateful to my mentors, professors, and colleagues for their continuous support, guidance, and technical insights which made the successful completion of QualiVision AI possible.</w:t>
       </w:r>
     </w:p>
     <w:p>
+      <w:pPr>
+        <w:jc w:val="both"/>
+      </w:pPr>
       <w:r>
         <w:br w:type="page"/>
       </w:r>
@@ -144,16 +240,25 @@
       </w:r>
     </w:p>
     <w:p>
+      <w:pPr>
+        <w:jc w:val="both"/>
+      </w:pPr>
       <w:r>
         <w:t>Manual quality inspection on industrial manufacturing and sorting lines is often slow, inconsistent, and labor-intensive. To overcome these limitations, this project introduces QualiVision AI, an enterprise-grade, real-time computer vision system tailored for industrial quality control. Built using a robust Model-View-Controller (MVC) architecture, it integrates a Flask backend with a Deep Learning pipeline powered by TensorFlow and EfficientNetV2B0.</w:t>
       </w:r>
     </w:p>
     <w:p>
+      <w:pPr>
+        <w:jc w:val="both"/>
+      </w:pPr>
       <w:r>
         <w:t>The system processes real-time camera feeds to perform automated anomaly detection (such as sorting fresh vs. rotten agricultural produce). It features Grad-CAM visualizations for Explainable AI, persistent SQLite event logging, and WebSocket-powered telemetry for live dashboard analytics. The solution achieved a 99.82% validation accuracy with sub-second inference times, demonstrating significant potential for automating physical quality assurance tasks, reducing costs, and increasing production throughput.</w:t>
       </w:r>
     </w:p>
     <w:p>
+      <w:pPr>
+        <w:jc w:val="both"/>
+      </w:pPr>
       <w:r>
         <w:br w:type="page"/>
       </w:r>
@@ -167,6 +272,9 @@
       </w:r>
     </w:p>
     <w:p>
+      <w:pPr>
+        <w:jc w:val="both"/>
+      </w:pPr>
       <w:r>
         <w:fldChar w:fldCharType="begin"/>
         <w:instrText xml:space="preserve">TOC \o "1-3" \h \z \u</w:instrText>
@@ -175,6 +283,9 @@
       </w:r>
     </w:p>
     <w:p>
+      <w:pPr>
+        <w:jc w:val="both"/>
+      </w:pPr>
       <w:r>
         <w:br w:type="page"/>
       </w:r>
@@ -188,6 +299,9 @@
       </w:r>
     </w:p>
     <w:p>
+      <w:pPr>
+        <w:jc w:val="both"/>
+      </w:pPr>
       <w:r>
         <w:fldChar w:fldCharType="begin"/>
         <w:instrText xml:space="preserve">TOC \h \z \c "Figure"</w:instrText>
@@ -196,6 +310,9 @@
       </w:r>
     </w:p>
     <w:p>
+      <w:pPr>
+        <w:jc w:val="both"/>
+      </w:pPr>
       <w:r>
         <w:br w:type="page"/>
       </w:r>
@@ -209,6 +326,9 @@
       </w:r>
     </w:p>
     <w:p>
+      <w:pPr>
+        <w:jc w:val="both"/>
+      </w:pPr>
       <w:r>
         <w:fldChar w:fldCharType="begin"/>
         <w:instrText xml:space="preserve">TOC \h \z \c "Table"</w:instrText>
@@ -217,6 +337,9 @@
       </w:r>
     </w:p>
     <w:p>
+      <w:pPr>
+        <w:jc w:val="both"/>
+      </w:pPr>
       <w:r>
         <w:br w:type="page"/>
       </w:r>
@@ -550,8 +673,15 @@
         </w:tc>
       </w:tr>
     </w:tbl>
-    <w:p/>
     <w:p>
+      <w:pPr>
+        <w:jc w:val="both"/>
+      </w:pPr>
+    </w:p>
+    <w:p>
+      <w:pPr>
+        <w:jc w:val="both"/>
+      </w:pPr>
       <w:r>
         <w:br w:type="page"/>
       </w:r>
@@ -565,13 +695,19 @@
       </w:r>
     </w:p>
     <w:p>
+      <w:pPr>
+        <w:jc w:val="both"/>
+      </w:pPr>
       <w:r>
         <w:t>In the modern era of Industry 4.0, automation and intelligent systems play a critical role in increasing efficiency and reducing operational overhead. One of the most challenging areas in manufacturing and agricultural processing is Quality Control (QC). QualiVision AI was developed as a comprehensive solution to automate this process.</w:t>
       </w:r>
     </w:p>
     <w:p>
+      <w:pPr>
+        <w:jc w:val="both"/>
+      </w:pPr>
       <w:r>
-        <w:t>Using state-of-the-art Deep Learning models, the application processes images captured from a factory line and predicts whether an item passes or fails quality standards. It then surfaces this data to an enterprise dashboard, providing operators with actionable insights, detailed analytics, and explainable AI metrics.</w:t>
+        <w:t>The application consists of 11 dedicated modules integrated into a unified industrial dashboard using Google Stitch-inspired UI/UX. Using state-of-the-art Deep Learning models, the application processes images captured from a factory line and predicts whether an item passes or fails quality standards. It then surfaces this data to an enterprise dashboard, providing operators with actionable insights, detailed analytics, and explainable AI metrics.</w:t>
       </w:r>
     </w:p>
     <w:p>
@@ -583,6 +719,9 @@
       </w:r>
     </w:p>
     <w:p>
+      <w:pPr>
+        <w:jc w:val="both"/>
+      </w:pPr>
       <w:r>
         <w:t>Manual quality inspection on modern industrial manufacturing and sorting lines is typically:</w:t>
       </w:r>
@@ -590,6 +729,7 @@
     <w:p>
       <w:pPr>
         <w:pStyle w:val="ListBullet"/>
+        <w:jc w:val="both"/>
       </w:pPr>
       <w:r>
         <w:t>Slow: Cannot keep up with the physical throughput of conveyor belts.</w:t>
@@ -598,6 +738,7 @@
     <w:p>
       <w:pPr>
         <w:pStyle w:val="ListBullet"/>
+        <w:jc w:val="both"/>
       </w:pPr>
       <w:r>
         <w:t>Inconsistent: Prone to human error, visual fatigue, and subjective judgments.</w:t>
@@ -606,6 +747,7 @@
     <w:p>
       <w:pPr>
         <w:pStyle w:val="ListBullet"/>
+        <w:jc w:val="both"/>
       </w:pPr>
       <w:r>
         <w:t>Labor Intensive: Requires dedicated, round-the-clock staffing for monotonous tasks.</w:t>
@@ -614,6 +756,7 @@
     <w:p>
       <w:pPr>
         <w:pStyle w:val="ListBullet"/>
+        <w:jc w:val="both"/>
       </w:pPr>
       <w:r>
         <w:t>Expensive: Results in high operational costs over time.</w:t>
@@ -630,6 +773,7 @@
     <w:p>
       <w:pPr>
         <w:pStyle w:val="ListBullet"/>
+        <w:jc w:val="both"/>
       </w:pPr>
       <w:r>
         <w:t>To develop an automated vision system capable of identifying defective objects in real-time.</w:t>
@@ -638,6 +782,7 @@
     <w:p>
       <w:pPr>
         <w:pStyle w:val="ListBullet"/>
+        <w:jc w:val="both"/>
       </w:pPr>
       <w:r>
         <w:t>To provide Explainable AI (XAI) using Grad-CAM so operators can trust the model's decisions.</w:t>
@@ -646,6 +791,7 @@
     <w:p>
       <w:pPr>
         <w:pStyle w:val="ListBullet"/>
+        <w:jc w:val="both"/>
       </w:pPr>
       <w:r>
         <w:t>To build an industrial dashboard for real-time monitoring and telemetry.</w:t>
@@ -654,6 +800,7 @@
     <w:p>
       <w:pPr>
         <w:pStyle w:val="ListBullet"/>
+        <w:jc w:val="both"/>
       </w:pPr>
       <w:r>
         <w:t>To implement persistent data logging and automated reporting for production managers.</w:t>
@@ -668,6 +815,9 @@
       </w:r>
     </w:p>
     <w:p>
+      <w:pPr>
+        <w:jc w:val="both"/>
+      </w:pPr>
       <w:r>
         <w:t>The scope encompasses the development of the AI model, the backend REST API, real-time WebSocket communication, and the frontend web dashboard. It focuses on a 2-class classification problem (e.g., Fresh vs. Rotten) but is architected to scale to multi-class defect detection. It is designed to be deployed on local factory edge servers rather than cloud environments to ensure minimal latency.</w:t>
       </w:r>
@@ -681,6 +831,9 @@
       </w:r>
     </w:p>
     <w:p>
+      <w:pPr>
+        <w:jc w:val="both"/>
+      </w:pPr>
       <w:r>
         <w:t>Current systems either rely entirely on manual human inspection or use primitive optical sensors (like infrared or basic color thresholding). These legacy systems struggle with complex organic shapes, varying lighting conditions, and nuanced defects, leading to high false-positive and false-negative rates.</w:t>
       </w:r>
@@ -694,6 +847,9 @@
       </w:r>
     </w:p>
     <w:p>
+      <w:pPr>
+        <w:jc w:val="both"/>
+      </w:pPr>
       <w:r>
         <w:t>QualiVision AI proposes a Deep Learning approach using Convolutional Neural Networks (CNNs). By training on thousands of diverse images, the model learns complex features. Integrated with a web platform, it offers 24/7 constant analysis, sub-second inference, and detailed visual reporting.</w:t>
       </w:r>
@@ -717,6 +873,7 @@
     <w:p>
       <w:pPr>
         <w:pStyle w:val="ListBullet"/>
+        <w:jc w:val="both"/>
       </w:pPr>
       <w:r>
         <w:t>Processor: Intel Core i5 / AMD Ryzen 5 or higher</w:t>
@@ -725,6 +882,7 @@
     <w:p>
       <w:pPr>
         <w:pStyle w:val="ListBullet"/>
+        <w:jc w:val="both"/>
       </w:pPr>
       <w:r>
         <w:t>RAM: 8 GB Minimum (16 GB Recommended)</w:t>
@@ -733,6 +891,7 @@
     <w:p>
       <w:pPr>
         <w:pStyle w:val="ListBullet"/>
+        <w:jc w:val="both"/>
       </w:pPr>
       <w:r>
         <w:t>GPU: Dedicated NVIDIA GPU (e.g., RTX 3050) with CUDA support for inference</w:t>
@@ -741,6 +900,7 @@
     <w:p>
       <w:pPr>
         <w:pStyle w:val="ListBullet"/>
+        <w:jc w:val="both"/>
       </w:pPr>
       <w:r>
         <w:t>Storage: 500 MB for application, additional space for datasets</w:t>
@@ -757,6 +917,7 @@
     <w:p>
       <w:pPr>
         <w:pStyle w:val="ListBullet"/>
+        <w:jc w:val="both"/>
       </w:pPr>
       <w:r>
         <w:t>OS: Windows 10/11, Ubuntu 20.04+, or macOS</w:t>
@@ -765,6 +926,7 @@
     <w:p>
       <w:pPr>
         <w:pStyle w:val="ListBullet"/>
+        <w:jc w:val="both"/>
       </w:pPr>
       <w:r>
         <w:t>Python: 3.10+</w:t>
@@ -773,6 +935,7 @@
     <w:p>
       <w:pPr>
         <w:pStyle w:val="ListBullet"/>
+        <w:jc w:val="both"/>
       </w:pPr>
       <w:r>
         <w:t>Database: SQLite 3</w:t>
@@ -784,6 +947,14 @@
       </w:pPr>
       <w:r>
         <w:t>8. Technology Stack</w:t>
+      </w:r>
+    </w:p>
+    <w:p>
+      <w:pPr>
+        <w:jc w:val="both"/>
+      </w:pPr>
+      <w:r>
+        <w:t>As shown in Table 2, the system utilizes a robust web and machine learning stack:</w:t>
       </w:r>
     </w:p>
     <w:p>
@@ -975,7 +1146,11 @@
         </w:tc>
       </w:tr>
     </w:tbl>
-    <w:p/>
+    <w:p>
+      <w:pPr>
+        <w:jc w:val="both"/>
+      </w:pPr>
+    </w:p>
     <w:p>
       <w:pPr>
         <w:pStyle w:val="Heading1"/>
@@ -985,19 +1160,30 @@
       </w:r>
     </w:p>
     <w:p>
+      <w:pPr>
+        <w:jc w:val="both"/>
+      </w:pPr>
       <w:r>
         <w:t>QualiVision AI utilizes a robust Model-View-Controller (MVC) architecture powered by Flask Blueprints and Socket.IO. The client accesses the Dashboard UI over HTTPS, which communicates via WebSockets for live video streams and telemetry, and REST APIs for static data operations. The Flask backend handles security and routes images to the TensorFlow Inference engine, which predicts results, generates a Grad-CAM heatmap, and logs the event to SQLite.</w:t>
       </w:r>
     </w:p>
     <w:p>
       <w:pPr>
+        <w:jc w:val="both"/>
+      </w:pPr>
+      <w:r>
+        <w:t>As shown in Figure 1, the architecture flows from the physical camera directly into the dashboard.</w:t>
+      </w:r>
+    </w:p>
+    <w:p>
+      <w:pPr>
         <w:jc w:val="center"/>
       </w:pPr>
       <w:r>
         <w:drawing>
           <wp:inline xmlns:a="http://schemas.openxmlformats.org/drawingml/2006/main" xmlns:pic="http://schemas.openxmlformats.org/drawingml/2006/picture">
-            <wp:extent cx="3657600" cy="4793844"/>
-            <wp:docPr id="1" name="Picture 1"/>
+            <wp:extent cx="3200400" cy="4194614"/>
+            <wp:docPr id="2" name="Picture 2"/>
             <wp:cNvGraphicFramePr>
               <a:graphicFrameLocks noChangeAspect="1"/>
             </wp:cNvGraphicFramePr>
@@ -1009,7 +1195,7 @@
                     <pic:cNvPicPr/>
                   </pic:nvPicPr>
                   <pic:blipFill>
-                    <a:blip r:embed="rId11"/>
+                    <a:blip r:embed="rId12"/>
                     <a:stretch>
                       <a:fillRect/>
                     </a:stretch>
@@ -1017,7 +1203,7 @@
                   <pic:spPr>
                     <a:xfrm>
                       <a:off x="0" y="0"/>
-                      <a:ext cx="3657600" cy="4793844"/>
+                      <a:ext cx="3200400" cy="4194614"/>
                     </a:xfrm>
                     <a:prstGeom prst="rect"/>
                   </pic:spPr>
@@ -1054,49 +1240,75 @@
       </w:r>
     </w:p>
     <w:p>
+      <w:pPr>
+        <w:jc w:val="both"/>
+      </w:pPr>
       <w:r>
         <w:t>The SQLite database uses a relational structure linking users to their inspection activities and system configurations.</w:t>
       </w:r>
     </w:p>
     <w:p>
+      <w:pPr>
+        <w:jc w:val="both"/>
+      </w:pPr>
       <w:r>
-        <w:t>Users</w:t>
-        <w:br/>
-        <w:t xml:space="preserve"> ├── id</w:t>
-        <w:br/>
-        <w:t xml:space="preserve"> ├── username</w:t>
-        <w:br/>
-        <w:t xml:space="preserve"> └── role</w:t>
-        <w:br/>
-        <w:br/>
-        <w:t xml:space="preserve">        │</w:t>
-        <w:br/>
-        <w:t xml:space="preserve">        │ 1:N</w:t>
-        <w:br/>
-        <w:t xml:space="preserve">        ▼</w:t>
-        <w:br/>
-        <w:br/>
-        <w:t>Predictions</w:t>
-        <w:br/>
-        <w:t xml:space="preserve"> ├── id</w:t>
-        <w:br/>
-        <w:t xml:space="preserve"> ├── timestamp</w:t>
-        <w:br/>
-        <w:t xml:space="preserve"> ├── prediction</w:t>
-        <w:br/>
-        <w:t xml:space="preserve"> ├── confidence</w:t>
-        <w:br/>
-        <w:t xml:space="preserve"> └── image</w:t>
-        <w:br/>
-        <w:br/>
-        <w:t xml:space="preserve">        │</w:t>
-        <w:br/>
-        <w:t xml:space="preserve">        │ </w:t>
-        <w:br/>
-        <w:t xml:space="preserve">        ▼</w:t>
-        <w:br/>
-        <w:br/>
-        <w:t>Settings</w:t>
+        <w:t>As shown in Figure 2, the database ensures referential integrity between users and predictions.</w:t>
+      </w:r>
+    </w:p>
+    <w:p>
+      <w:pPr>
+        <w:jc w:val="center"/>
+      </w:pPr>
+      <w:r>
+        <w:drawing>
+          <wp:inline xmlns:a="http://schemas.openxmlformats.org/drawingml/2006/main" xmlns:pic="http://schemas.openxmlformats.org/drawingml/2006/picture">
+            <wp:extent cx="3200400" cy="4194614"/>
+            <wp:docPr id="3" name="Picture 3"/>
+            <wp:cNvGraphicFramePr>
+              <a:graphicFrameLocks noChangeAspect="1"/>
+            </wp:cNvGraphicFramePr>
+            <a:graphic>
+              <a:graphicData uri="http://schemas.openxmlformats.org/drawingml/2006/picture">
+                <pic:pic>
+                  <pic:nvPicPr>
+                    <pic:cNvPr id="0" name="er_diagram.png"/>
+                    <pic:cNvPicPr/>
+                  </pic:nvPicPr>
+                  <pic:blipFill>
+                    <a:blip r:embed="rId13"/>
+                    <a:stretch>
+                      <a:fillRect/>
+                    </a:stretch>
+                  </pic:blipFill>
+                  <pic:spPr>
+                    <a:xfrm>
+                      <a:off x="0" y="0"/>
+                      <a:ext cx="3200400" cy="4194614"/>
+                    </a:xfrm>
+                    <a:prstGeom prst="rect"/>
+                  </pic:spPr>
+                </pic:pic>
+              </a:graphicData>
+            </a:graphic>
+          </wp:inline>
+        </w:drawing>
+      </w:r>
+    </w:p>
+    <w:p>
+      <w:pPr>
+        <w:pStyle w:val="Caption"/>
+        <w:jc w:val="center"/>
+      </w:pPr>
+      <w:r>
+        <w:t xml:space="preserve">Figure </w:t>
+        <w:fldChar w:fldCharType="begin"/>
+        <w:instrText xml:space="preserve">SEQ Figure \* ARABIC</w:instrText>
+        <w:fldChar w:fldCharType="separate"/>
+        <w:t>2</w:t>
+        <w:fldChar w:fldCharType="end"/>
+      </w:r>
+      <w:r>
+        <w:t>: Entity-Relationship Diagram</w:t>
       </w:r>
     </w:p>
     <w:p>
@@ -1108,15 +1320,29 @@
       </w:r>
     </w:p>
     <w:p>
+      <w:pPr>
+        <w:jc w:val="both"/>
+      </w:pPr>
       <w:r>
         <w:t>The neural network is trained on a rigorously prepared and audited agricultural dataset collected from open sources.</w:t>
       </w:r>
     </w:p>
     <w:p>
+      <w:pPr>
+        <w:jc w:val="both"/>
+      </w:pPr>
       <w:r>
         <w:t>Dataset Sources: Aggregated from Roboflow and Kaggle open datasets.</w:t>
         <w:br/>
         <w:t>Augmentation techniques: Random rotation, horizontal flipping, contrast adjustments, and zooming to prevent model overfitting.</w:t>
+      </w:r>
+    </w:p>
+    <w:p>
+      <w:pPr>
+        <w:jc w:val="both"/>
+      </w:pPr>
+      <w:r>
+        <w:t>As shown in Table 3, the dataset is perfectly balanced across classes.</w:t>
       </w:r>
     </w:p>
     <w:p>
@@ -1264,7 +1490,11 @@
         </w:tc>
       </w:tr>
     </w:tbl>
-    <w:p/>
+    <w:p>
+      <w:pPr>
+        <w:jc w:val="both"/>
+      </w:pPr>
+    </w:p>
     <w:p>
       <w:pPr>
         <w:pStyle w:val="Heading1"/>
@@ -1274,8 +1504,19 @@
       </w:r>
     </w:p>
     <w:p>
+      <w:pPr>
+        <w:jc w:val="both"/>
+      </w:pPr>
       <w:r>
         <w:t>The core vision model is EfficientNetV2B0, known for its excellent trade-off between accuracy and computational efficiency. Transfer learning was utilized, starting with ImageNet weights and fine-tuning the dense layers for the binary classification task.</w:t>
+      </w:r>
+    </w:p>
+    <w:p>
+      <w:pPr>
+        <w:jc w:val="both"/>
+      </w:pPr>
+      <w:r>
+        <w:t>As shown in Table 4, the model is highly optimized for fast inference.</w:t>
       </w:r>
     </w:p>
     <w:p>
@@ -1621,7 +1862,11 @@
         </w:tc>
       </w:tr>
     </w:tbl>
-    <w:p/>
+    <w:p>
+      <w:pPr>
+        <w:jc w:val="both"/>
+      </w:pPr>
+    </w:p>
     <w:p>
       <w:pPr>
         <w:pStyle w:val="Heading1"/>
@@ -1632,13 +1877,21 @@
     </w:p>
     <w:p>
       <w:pPr>
+        <w:jc w:val="both"/>
+      </w:pPr>
+      <w:r>
+        <w:t>As shown in Figure 3, images pass through a rigorous pipeline before being surfaced to the dashboard.</w:t>
+      </w:r>
+    </w:p>
+    <w:p>
+      <w:pPr>
         <w:jc w:val="center"/>
       </w:pPr>
       <w:r>
         <w:drawing>
           <wp:inline xmlns:a="http://schemas.openxmlformats.org/drawingml/2006/main" xmlns:pic="http://schemas.openxmlformats.org/drawingml/2006/picture">
-            <wp:extent cx="3657600" cy="5377049"/>
-            <wp:docPr id="2" name="Picture 2"/>
+            <wp:extent cx="3200400" cy="4704918"/>
+            <wp:docPr id="4" name="Picture 4"/>
             <wp:cNvGraphicFramePr>
               <a:graphicFrameLocks noChangeAspect="1"/>
             </wp:cNvGraphicFramePr>
@@ -1650,7 +1903,7 @@
                     <pic:cNvPicPr/>
                   </pic:nvPicPr>
                   <pic:blipFill>
-                    <a:blip r:embed="rId12"/>
+                    <a:blip r:embed="rId14"/>
                     <a:stretch>
                       <a:fillRect/>
                     </a:stretch>
@@ -1658,7 +1911,7 @@
                   <pic:spPr>
                     <a:xfrm>
                       <a:off x="0" y="0"/>
-                      <a:ext cx="3657600" cy="5377049"/>
+                      <a:ext cx="3200400" cy="4704918"/>
                     </a:xfrm>
                     <a:prstGeom prst="rect"/>
                   </pic:spPr>
@@ -1679,7 +1932,7 @@
         <w:fldChar w:fldCharType="begin"/>
         <w:instrText xml:space="preserve">SEQ Figure \* ARABIC</w:instrText>
         <w:fldChar w:fldCharType="separate"/>
-        <w:t>2</w:t>
+        <w:t>3</w:t>
         <w:fldChar w:fldCharType="end"/>
       </w:r>
       <w:r>
@@ -1688,6 +1941,38 @@
     </w:p>
     <w:p>
       <w:pPr>
+        <w:pStyle w:val="Heading2"/>
+      </w:pPr>
+      <w:r>
+        <w:t>13.1 Handling Out-Of-Distribution Data (Unknown Class)</w:t>
+      </w:r>
+    </w:p>
+    <w:p>
+      <w:pPr>
+        <w:jc w:val="both"/>
+      </w:pPr>
+      <w:r>
+        <w:t>To prevent the AI from making erratic guesses on non-related objects, a confidence threshold logic is strictly enforced. If an object does not confidently belong to the trained classes, it is rejected to a manual inspection queue:</w:t>
+      </w:r>
+    </w:p>
+    <w:p>
+      <w:pPr>
+        <w:jc w:val="left"/>
+      </w:pPr>
+      <w:r>
+        <w:rPr>
+          <w:rFonts w:ascii="Consolas" w:hAnsi="Consolas"/>
+          <w:sz w:val="20"/>
+        </w:rPr>
+        <w:t>IF Fresh Probability &gt; Threshold (65%) THEN Class = Fresh</w:t>
+        <w:br/>
+        <w:t>ELSE IF Rotten Probability &gt; Threshold (65%) THEN Class = Rotten</w:t>
+        <w:br/>
+        <w:t>ELSE Class = Unknown -&gt; Route to Manual Inspection Required</w:t>
+      </w:r>
+    </w:p>
+    <w:p>
+      <w:pPr>
         <w:pStyle w:val="Heading1"/>
       </w:pPr>
       <w:r>
@@ -1695,8 +1980,19 @@
       </w:r>
     </w:p>
     <w:p>
+      <w:pPr>
+        <w:jc w:val="both"/>
+      </w:pPr>
       <w:r>
         <w:t>The backend is structured using Flask Blueprints to separate concerns. REST APIs power the dynamic nature of the app.</w:t>
+      </w:r>
+    </w:p>
+    <w:p>
+      <w:pPr>
+        <w:jc w:val="both"/>
+      </w:pPr>
+      <w:r>
+        <w:t>As shown in Table 5, REST principles are strictly adhered to.</w:t>
       </w:r>
     </w:p>
     <w:p>
@@ -1898,7 +2194,11 @@
         </w:tc>
       </w:tr>
     </w:tbl>
-    <w:p/>
+    <w:p>
+      <w:pPr>
+        <w:jc w:val="both"/>
+      </w:pPr>
+    </w:p>
     <w:p>
       <w:pPr>
         <w:pStyle w:val="Heading1"/>
@@ -1916,19 +2216,30 @@
       </w:r>
     </w:p>
     <w:p>
+      <w:pPr>
+        <w:jc w:val="both"/>
+      </w:pPr>
       <w:r>
         <w:t>The Executive Dashboard acts as the central nerve center for the QualiVision AI system. It provides high-level telemetry, displaying total inspections, pass/fail rates, and live activity streams. The UI utilizes dark mode elements and glassmorphism to present critical industrial data in a clean, modern way without overwhelming the operator.</w:t>
       </w:r>
     </w:p>
     <w:p>
       <w:pPr>
+        <w:jc w:val="both"/>
+      </w:pPr>
+      <w:r>
+        <w:t>As shown in Figure 4, the module offers a bird's-eye view of operations.</w:t>
+      </w:r>
+    </w:p>
+    <w:p>
+      <w:pPr>
         <w:jc w:val="center"/>
       </w:pPr>
       <w:r>
         <w:drawing>
           <wp:inline xmlns:a="http://schemas.openxmlformats.org/drawingml/2006/main" xmlns:pic="http://schemas.openxmlformats.org/drawingml/2006/picture">
             <wp:extent cx="4572000" cy="3695700"/>
-            <wp:docPr id="3" name="Picture 3"/>
+            <wp:docPr id="5" name="Picture 5"/>
             <wp:cNvGraphicFramePr>
               <a:graphicFrameLocks noChangeAspect="1"/>
             </wp:cNvGraphicFramePr>
@@ -1940,7 +2251,7 @@
                     <pic:cNvPicPr/>
                   </pic:nvPicPr>
                   <pic:blipFill>
-                    <a:blip r:embed="rId13"/>
+                    <a:blip r:embed="rId15"/>
                     <a:stretch>
                       <a:fillRect/>
                     </a:stretch>
@@ -1969,7 +2280,7 @@
         <w:fldChar w:fldCharType="begin"/>
         <w:instrText xml:space="preserve">SEQ Figure \* ARABIC</w:instrText>
         <w:fldChar w:fldCharType="separate"/>
-        <w:t>3</w:t>
+        <w:t>4</w:t>
         <w:fldChar w:fldCharType="end"/>
       </w:r>
       <w:r>
@@ -1985,19 +2296,30 @@
       </w:r>
     </w:p>
     <w:p>
+      <w:pPr>
+        <w:jc w:val="both"/>
+      </w:pPr>
       <w:r>
         <w:t>This module integrates directly with factory webcams or IP cameras to provide a continuous, real-time stream. OpenCV captures frames asynchronously, pushing them through the TensorFlow model, and broadcasting the prediction overlay back to the user via MJPEG streaming. This allows operators to monitor the conveyor belt dynamically.</w:t>
       </w:r>
     </w:p>
     <w:p>
       <w:pPr>
+        <w:jc w:val="both"/>
+      </w:pPr>
+      <w:r>
+        <w:t>As shown in Figure 5, the live feed is completely real-time.</w:t>
+      </w:r>
+    </w:p>
+    <w:p>
+      <w:pPr>
         <w:jc w:val="center"/>
       </w:pPr>
       <w:r>
         <w:drawing>
           <wp:inline xmlns:a="http://schemas.openxmlformats.org/drawingml/2006/main" xmlns:pic="http://schemas.openxmlformats.org/drawingml/2006/picture">
             <wp:extent cx="4572000" cy="2857500"/>
-            <wp:docPr id="4" name="Picture 4"/>
+            <wp:docPr id="6" name="Picture 6"/>
             <wp:cNvGraphicFramePr>
               <a:graphicFrameLocks noChangeAspect="1"/>
             </wp:cNvGraphicFramePr>
@@ -2009,7 +2331,7 @@
                     <pic:cNvPicPr/>
                   </pic:nvPicPr>
                   <pic:blipFill>
-                    <a:blip r:embed="rId14"/>
+                    <a:blip r:embed="rId16"/>
                     <a:stretch>
                       <a:fillRect/>
                     </a:stretch>
@@ -2038,7 +2360,7 @@
         <w:fldChar w:fldCharType="begin"/>
         <w:instrText xml:space="preserve">SEQ Figure \* ARABIC</w:instrText>
         <w:fldChar w:fldCharType="separate"/>
-        <w:t>4</w:t>
+        <w:t>5</w:t>
         <w:fldChar w:fldCharType="end"/>
       </w:r>
       <w:r>
@@ -2054,19 +2376,30 @@
       </w:r>
     </w:p>
     <w:p>
+      <w:pPr>
+        <w:jc w:val="both"/>
+      </w:pPr>
       <w:r>
         <w:t>The Inspection Studio provides a highly detailed, analytical view of individual inferences. Users can upload specific images for testing. Upon prediction, the module displays the raw probability tensors, the final classification, and an overlay of the Grad-CAM heatmap. The heatmap highlights the specific pixels that triggered the AI's decision, providing essential Explainable AI (XAI) capabilities.</w:t>
       </w:r>
     </w:p>
     <w:p>
       <w:pPr>
+        <w:jc w:val="both"/>
+      </w:pPr>
+      <w:r>
+        <w:t>As shown in Figure 6, the Grad-CAM visualization builds trust in the model.</w:t>
+      </w:r>
+    </w:p>
+    <w:p>
+      <w:pPr>
         <w:jc w:val="center"/>
       </w:pPr>
       <w:r>
         <w:drawing>
           <wp:inline xmlns:a="http://schemas.openxmlformats.org/drawingml/2006/main" xmlns:pic="http://schemas.openxmlformats.org/drawingml/2006/picture">
             <wp:extent cx="4572000" cy="4667250"/>
-            <wp:docPr id="5" name="Picture 5"/>
+            <wp:docPr id="7" name="Picture 7"/>
             <wp:cNvGraphicFramePr>
               <a:graphicFrameLocks noChangeAspect="1"/>
             </wp:cNvGraphicFramePr>
@@ -2078,7 +2411,7 @@
                     <pic:cNvPicPr/>
                   </pic:nvPicPr>
                   <pic:blipFill>
-                    <a:blip r:embed="rId15"/>
+                    <a:blip r:embed="rId17"/>
                     <a:stretch>
                       <a:fillRect/>
                     </a:stretch>
@@ -2107,7 +2440,7 @@
         <w:fldChar w:fldCharType="begin"/>
         <w:instrText xml:space="preserve">SEQ Figure \* ARABIC</w:instrText>
         <w:fldChar w:fldCharType="separate"/>
-        <w:t>5</w:t>
+        <w:t>6</w:t>
         <w:fldChar w:fldCharType="end"/>
       </w:r>
       <w:r>
@@ -2115,146 +2448,19 @@
       </w:r>
     </w:p>
     <w:p>
+      <w:pPr>
+        <w:jc w:val="both"/>
+      </w:pPr>
       <w:r>
         <w:t>Below is another view of the inspection output emphasizing the Unknown Detection boundaries when an out-of-distribution image is provided.</w:t>
       </w:r>
     </w:p>
     <w:p>
       <w:pPr>
-        <w:jc w:val="center"/>
+        <w:jc w:val="both"/>
       </w:pPr>
       <w:r>
-        <w:drawing>
-          <wp:inline xmlns:a="http://schemas.openxmlformats.org/drawingml/2006/main" xmlns:pic="http://schemas.openxmlformats.org/drawingml/2006/picture">
-            <wp:extent cx="4572000" cy="2571750"/>
-            <wp:docPr id="6" name="Picture 6"/>
-            <wp:cNvGraphicFramePr>
-              <a:graphicFrameLocks noChangeAspect="1"/>
-            </wp:cNvGraphicFramePr>
-            <a:graphic>
-              <a:graphicData uri="http://schemas.openxmlformats.org/drawingml/2006/picture">
-                <pic:pic>
-                  <pic:nvPicPr>
-                    <pic:cNvPr id="0" name="14-dark-mode.png"/>
-                    <pic:cNvPicPr/>
-                  </pic:nvPicPr>
-                  <pic:blipFill>
-                    <a:blip r:embed="rId16"/>
-                    <a:stretch>
-                      <a:fillRect/>
-                    </a:stretch>
-                  </pic:blipFill>
-                  <pic:spPr>
-                    <a:xfrm>
-                      <a:off x="0" y="0"/>
-                      <a:ext cx="4572000" cy="2571750"/>
-                    </a:xfrm>
-                    <a:prstGeom prst="rect"/>
-                  </pic:spPr>
-                </pic:pic>
-              </a:graphicData>
-            </a:graphic>
-          </wp:inline>
-        </w:drawing>
-      </w:r>
-    </w:p>
-    <w:p>
-      <w:pPr>
-        <w:pStyle w:val="Caption"/>
-        <w:jc w:val="center"/>
-      </w:pPr>
-      <w:r>
-        <w:t xml:space="preserve">Figure </w:t>
-        <w:fldChar w:fldCharType="begin"/>
-        <w:instrText xml:space="preserve">SEQ Figure \* ARABIC</w:instrText>
-        <w:fldChar w:fldCharType="separate"/>
-        <w:t>6</w:t>
-        <w:fldChar w:fldCharType="end"/>
-      </w:r>
-      <w:r>
-        <w:t>: System Dark Mode and Out-of-Distribution Views</w:t>
-      </w:r>
-    </w:p>
-    <w:p>
-      <w:pPr>
-        <w:pStyle w:val="Heading2"/>
-      </w:pPr>
-      <w:r>
-        <w:t>15.4 Analytics</w:t>
-      </w:r>
-    </w:p>
-    <w:p>
-      <w:r>
-        <w:t>Data collected over time is aggregated into the Analytics module, which uses Chart.js to visualize trends, daily throughput, and defect rates over time. Managers can easily identify periods of low quality.</w:t>
-      </w:r>
-    </w:p>
-    <w:p>
-      <w:pPr>
-        <w:jc w:val="center"/>
-      </w:pPr>
-      <w:r>
-        <w:drawing>
-          <wp:inline xmlns:a="http://schemas.openxmlformats.org/drawingml/2006/main" xmlns:pic="http://schemas.openxmlformats.org/drawingml/2006/picture">
-            <wp:extent cx="4572000" cy="2857500"/>
-            <wp:docPr id="7" name="Picture 7"/>
-            <wp:cNvGraphicFramePr>
-              <a:graphicFrameLocks noChangeAspect="1"/>
-            </wp:cNvGraphicFramePr>
-            <a:graphic>
-              <a:graphicData uri="http://schemas.openxmlformats.org/drawingml/2006/picture">
-                <pic:pic>
-                  <pic:nvPicPr>
-                    <pic:cNvPr id="0" name="07-analytics.png"/>
-                    <pic:cNvPicPr/>
-                  </pic:nvPicPr>
-                  <pic:blipFill>
-                    <a:blip r:embed="rId17"/>
-                    <a:stretch>
-                      <a:fillRect/>
-                    </a:stretch>
-                  </pic:blipFill>
-                  <pic:spPr>
-                    <a:xfrm>
-                      <a:off x="0" y="0"/>
-                      <a:ext cx="4572000" cy="2857500"/>
-                    </a:xfrm>
-                    <a:prstGeom prst="rect"/>
-                  </pic:spPr>
-                </pic:pic>
-              </a:graphicData>
-            </a:graphic>
-          </wp:inline>
-        </w:drawing>
-      </w:r>
-    </w:p>
-    <w:p>
-      <w:pPr>
-        <w:pStyle w:val="Caption"/>
-        <w:jc w:val="center"/>
-      </w:pPr>
-      <w:r>
-        <w:t xml:space="preserve">Figure </w:t>
-        <w:fldChar w:fldCharType="begin"/>
-        <w:instrText xml:space="preserve">SEQ Figure \* ARABIC</w:instrText>
-        <w:fldChar w:fldCharType="separate"/>
-        <w:t>7</w:t>
-        <w:fldChar w:fldCharType="end"/>
-      </w:r>
-      <w:r>
-        <w:t>: Performance Analytics Module</w:t>
-      </w:r>
-    </w:p>
-    <w:p>
-      <w:pPr>
-        <w:pStyle w:val="Heading2"/>
-      </w:pPr>
-      <w:r>
-        <w:t>15.5 Intelligent Reporting</w:t>
-      </w:r>
-    </w:p>
-    <w:p>
-      <w:r>
-        <w:t>The Reports module enables supervisors to extract insights automatically. It generates detailed PDF and CSV documents containing raw telemetry for auditing purposes, bridging the gap between factory floor operations and executive review.</w:t>
+        <w:t>As shown in Figure 7, the system correctly flags unknown anomalies.</w:t>
       </w:r>
     </w:p>
     <w:p>
@@ -2273,7 +2479,7 @@
               <a:graphicData uri="http://schemas.openxmlformats.org/drawingml/2006/picture">
                 <pic:pic>
                   <pic:nvPicPr>
-                    <pic:cNvPr id="0" name="09-reports.png"/>
+                    <pic:cNvPr id="0" name="14-dark-mode.png"/>
                     <pic:cNvPicPr/>
                   </pic:nvPicPr>
                   <pic:blipFill>
@@ -2306,11 +2512,11 @@
         <w:fldChar w:fldCharType="begin"/>
         <w:instrText xml:space="preserve">SEQ Figure \* ARABIC</w:instrText>
         <w:fldChar w:fldCharType="separate"/>
-        <w:t>8</w:t>
+        <w:t>7</w:t>
         <w:fldChar w:fldCharType="end"/>
       </w:r>
       <w:r>
-        <w:t>: Intelligent Reporting Module</w:t>
+        <w:t>: System Dark Mode and Out-of-Distribution Views</w:t>
       </w:r>
     </w:p>
     <w:p>
@@ -2318,12 +2524,23 @@
         <w:pStyle w:val="Heading2"/>
       </w:pPr>
       <w:r>
-        <w:t>15.6 Inspection History</w:t>
+        <w:t>15.4 Analytics</w:t>
       </w:r>
     </w:p>
     <w:p>
+      <w:pPr>
+        <w:jc w:val="both"/>
+      </w:pPr>
       <w:r>
-        <w:t>Every inference is securely logged into the SQLite database and presented in the History module. It features a robust, dynamic data table with Global Search capabilities, date range filters, and prediction status filters. Operators can review past decisions, verify the Grad-CAM thumbnail, and delete erroneous entries if authorized.</w:t>
+        <w:t>Data collected over time is aggregated into the Analytics module, which uses Chart.js to visualize trends, daily throughput, and defect rates over time. Managers can easily identify periods of low quality.</w:t>
+      </w:r>
+    </w:p>
+    <w:p>
+      <w:pPr>
+        <w:jc w:val="both"/>
+      </w:pPr>
+      <w:r>
+        <w:t>As shown in Figure 8, analytical trends can be reviewed historically.</w:t>
       </w:r>
     </w:p>
     <w:p>
@@ -2342,7 +2559,7 @@
               <a:graphicData uri="http://schemas.openxmlformats.org/drawingml/2006/picture">
                 <pic:pic>
                   <pic:nvPicPr>
-                    <pic:cNvPr id="0" name="08-history.png"/>
+                    <pic:cNvPr id="0" name="07-analytics.png"/>
                     <pic:cNvPicPr/>
                   </pic:nvPicPr>
                   <pic:blipFill>
@@ -2375,11 +2592,11 @@
         <w:fldChar w:fldCharType="begin"/>
         <w:instrText xml:space="preserve">SEQ Figure \* ARABIC</w:instrText>
         <w:fldChar w:fldCharType="separate"/>
-        <w:t>9</w:t>
+        <w:t>8</w:t>
         <w:fldChar w:fldCharType="end"/>
       </w:r>
       <w:r>
-        <w:t>: Inspection History and Log Search</w:t>
+        <w:t>: Performance Analytics Module</w:t>
       </w:r>
     </w:p>
     <w:p>
@@ -2387,22 +2604,33 @@
         <w:pStyle w:val="Heading2"/>
       </w:pPr>
       <w:r>
-        <w:t>15.7 Dataset Repository</w:t>
+        <w:t>15.5 Intelligent Reporting</w:t>
       </w:r>
     </w:p>
     <w:p>
+      <w:pPr>
+        <w:jc w:val="both"/>
+      </w:pPr>
       <w:r>
-        <w:t>The Dataset Repository module allows administrators to view, audit, and manage the training data from within the platform. This guarantees data provenance and allows for continuous learning pipelines by identifying misclassified images.</w:t>
+        <w:t>The Reports module enables supervisors to extract insights automatically. It generates detailed PDF and CSV documents containing raw telemetry for auditing purposes, bridging the gap between real-time factory operations and executive decision-making.</w:t>
       </w:r>
     </w:p>
     <w:p>
       <w:pPr>
+        <w:jc w:val="both"/>
+      </w:pPr>
+      <w:r>
+        <w:t>As shown in Figure 9, reports can be natively exported from the browser.</w:t>
+      </w:r>
+    </w:p>
+    <w:p>
+      <w:pPr>
         <w:jc w:val="center"/>
       </w:pPr>
       <w:r>
         <w:drawing>
           <wp:inline xmlns:a="http://schemas.openxmlformats.org/drawingml/2006/main" xmlns:pic="http://schemas.openxmlformats.org/drawingml/2006/picture">
-            <wp:extent cx="4572000" cy="2857500"/>
+            <wp:extent cx="4572000" cy="2571750"/>
             <wp:docPr id="10" name="Picture 10"/>
             <wp:cNvGraphicFramePr>
               <a:graphicFrameLocks noChangeAspect="1"/>
@@ -2411,11 +2639,91 @@
               <a:graphicData uri="http://schemas.openxmlformats.org/drawingml/2006/picture">
                 <pic:pic>
                   <pic:nvPicPr>
-                    <pic:cNvPr id="0" name="10-dataset.png"/>
+                    <pic:cNvPr id="0" name="09-reports.png"/>
                     <pic:cNvPicPr/>
                   </pic:nvPicPr>
                   <pic:blipFill>
                     <a:blip r:embed="rId20"/>
+                    <a:stretch>
+                      <a:fillRect/>
+                    </a:stretch>
+                  </pic:blipFill>
+                  <pic:spPr>
+                    <a:xfrm>
+                      <a:off x="0" y="0"/>
+                      <a:ext cx="4572000" cy="2571750"/>
+                    </a:xfrm>
+                    <a:prstGeom prst="rect"/>
+                  </pic:spPr>
+                </pic:pic>
+              </a:graphicData>
+            </a:graphic>
+          </wp:inline>
+        </w:drawing>
+      </w:r>
+    </w:p>
+    <w:p>
+      <w:pPr>
+        <w:pStyle w:val="Caption"/>
+        <w:jc w:val="center"/>
+      </w:pPr>
+      <w:r>
+        <w:t xml:space="preserve">Figure </w:t>
+        <w:fldChar w:fldCharType="begin"/>
+        <w:instrText xml:space="preserve">SEQ Figure \* ARABIC</w:instrText>
+        <w:fldChar w:fldCharType="separate"/>
+        <w:t>9</w:t>
+        <w:fldChar w:fldCharType="end"/>
+      </w:r>
+      <w:r>
+        <w:t>: Intelligent Reporting Module</w:t>
+      </w:r>
+    </w:p>
+    <w:p>
+      <w:pPr>
+        <w:pStyle w:val="Heading2"/>
+      </w:pPr>
+      <w:r>
+        <w:t>15.6 Inspection History</w:t>
+      </w:r>
+    </w:p>
+    <w:p>
+      <w:pPr>
+        <w:jc w:val="both"/>
+      </w:pPr>
+      <w:r>
+        <w:t>Every inference is securely logged into the SQLite database and presented in the History module. It features a robust, dynamic data table with Global Search capabilities, date range filters, and prediction status filters. Operators can review past decisions, verify the Grad-CAM thumbnail, and delete erroneous entries if authorized.</w:t>
+      </w:r>
+    </w:p>
+    <w:p>
+      <w:pPr>
+        <w:jc w:val="both"/>
+      </w:pPr>
+      <w:r>
+        <w:t>As shown in Figure 10, operators have full access to past logs.</w:t>
+      </w:r>
+    </w:p>
+    <w:p>
+      <w:pPr>
+        <w:jc w:val="center"/>
+      </w:pPr>
+      <w:r>
+        <w:drawing>
+          <wp:inline xmlns:a="http://schemas.openxmlformats.org/drawingml/2006/main" xmlns:pic="http://schemas.openxmlformats.org/drawingml/2006/picture">
+            <wp:extent cx="4572000" cy="2857500"/>
+            <wp:docPr id="11" name="Picture 11"/>
+            <wp:cNvGraphicFramePr>
+              <a:graphicFrameLocks noChangeAspect="1"/>
+            </wp:cNvGraphicFramePr>
+            <a:graphic>
+              <a:graphicData uri="http://schemas.openxmlformats.org/drawingml/2006/picture">
+                <pic:pic>
+                  <pic:nvPicPr>
+                    <pic:cNvPr id="0" name="08-history.png"/>
+                    <pic:cNvPicPr/>
+                  </pic:nvPicPr>
+                  <pic:blipFill>
+                    <a:blip r:embed="rId21"/>
                     <a:stretch>
                       <a:fillRect/>
                     </a:stretch>
@@ -2448,6 +2756,86 @@
         <w:fldChar w:fldCharType="end"/>
       </w:r>
       <w:r>
+        <w:t>: Inspection History and Log Search</w:t>
+      </w:r>
+    </w:p>
+    <w:p>
+      <w:pPr>
+        <w:pStyle w:val="Heading2"/>
+      </w:pPr>
+      <w:r>
+        <w:t>15.7 Dataset Repository</w:t>
+      </w:r>
+    </w:p>
+    <w:p>
+      <w:pPr>
+        <w:jc w:val="both"/>
+      </w:pPr>
+      <w:r>
+        <w:t>The Dataset Repository module allows administrators to view, audit, and manage the training data from within the platform. This guarantees data provenance and allows for continuous learning pipelines by identifying misclassified images.</w:t>
+      </w:r>
+    </w:p>
+    <w:p>
+      <w:pPr>
+        <w:jc w:val="both"/>
+      </w:pPr>
+      <w:r>
+        <w:t>As shown in Figure 11, raw images can be inspected natively.</w:t>
+      </w:r>
+    </w:p>
+    <w:p>
+      <w:pPr>
+        <w:jc w:val="center"/>
+      </w:pPr>
+      <w:r>
+        <w:drawing>
+          <wp:inline xmlns:a="http://schemas.openxmlformats.org/drawingml/2006/main" xmlns:pic="http://schemas.openxmlformats.org/drawingml/2006/picture">
+            <wp:extent cx="4572000" cy="2857500"/>
+            <wp:docPr id="12" name="Picture 12"/>
+            <wp:cNvGraphicFramePr>
+              <a:graphicFrameLocks noChangeAspect="1"/>
+            </wp:cNvGraphicFramePr>
+            <a:graphic>
+              <a:graphicData uri="http://schemas.openxmlformats.org/drawingml/2006/picture">
+                <pic:pic>
+                  <pic:nvPicPr>
+                    <pic:cNvPr id="0" name="10-dataset.png"/>
+                    <pic:cNvPicPr/>
+                  </pic:nvPicPr>
+                  <pic:blipFill>
+                    <a:blip r:embed="rId22"/>
+                    <a:stretch>
+                      <a:fillRect/>
+                    </a:stretch>
+                  </pic:blipFill>
+                  <pic:spPr>
+                    <a:xfrm>
+                      <a:off x="0" y="0"/>
+                      <a:ext cx="4572000" cy="2857500"/>
+                    </a:xfrm>
+                    <a:prstGeom prst="rect"/>
+                  </pic:spPr>
+                </pic:pic>
+              </a:graphicData>
+            </a:graphic>
+          </wp:inline>
+        </w:drawing>
+      </w:r>
+    </w:p>
+    <w:p>
+      <w:pPr>
+        <w:pStyle w:val="Caption"/>
+        <w:jc w:val="center"/>
+      </w:pPr>
+      <w:r>
+        <w:t xml:space="preserve">Figure </w:t>
+        <w:fldChar w:fldCharType="begin"/>
+        <w:instrText xml:space="preserve">SEQ Figure \* ARABIC</w:instrText>
+        <w:fldChar w:fldCharType="separate"/>
+        <w:t>11</w:t>
+        <w:fldChar w:fldCharType="end"/>
+      </w:r>
+      <w:r>
         <w:t>: Dataset Repository Management</w:t>
       </w:r>
     </w:p>
@@ -2460,19 +2848,30 @@
       </w:r>
     </w:p>
     <w:p>
+      <w:pPr>
+        <w:jc w:val="both"/>
+      </w:pPr>
       <w:r>
         <w:t>Administrators can manage the lifecycle of the AI models. This interface tracks the performance metrics, validation loss, and epochs of current models, and allows hot-swapping to newer model iterations without downtime.</w:t>
       </w:r>
     </w:p>
     <w:p>
       <w:pPr>
+        <w:jc w:val="both"/>
+      </w:pPr>
+      <w:r>
+        <w:t>As shown in Figure 12, multiple versions of models are managed securely.</w:t>
+      </w:r>
+    </w:p>
+    <w:p>
+      <w:pPr>
         <w:jc w:val="center"/>
       </w:pPr>
       <w:r>
         <w:drawing>
           <wp:inline xmlns:a="http://schemas.openxmlformats.org/drawingml/2006/main" xmlns:pic="http://schemas.openxmlformats.org/drawingml/2006/picture">
             <wp:extent cx="4572000" cy="3565525"/>
-            <wp:docPr id="11" name="Picture 11"/>
+            <wp:docPr id="13" name="Picture 13"/>
             <wp:cNvGraphicFramePr>
               <a:graphicFrameLocks noChangeAspect="1"/>
             </wp:cNvGraphicFramePr>
@@ -2484,7 +2883,7 @@
                     <pic:cNvPicPr/>
                   </pic:nvPicPr>
                   <pic:blipFill>
-                    <a:blip r:embed="rId21"/>
+                    <a:blip r:embed="rId23"/>
                     <a:stretch>
                       <a:fillRect/>
                     </a:stretch>
@@ -2513,7 +2912,7 @@
         <w:fldChar w:fldCharType="begin"/>
         <w:instrText xml:space="preserve">SEQ Figure \* ARABIC</w:instrText>
         <w:fldChar w:fldCharType="separate"/>
-        <w:t>11</w:t>
+        <w:t>12</w:t>
         <w:fldChar w:fldCharType="end"/>
       </w:r>
       <w:r>
@@ -2529,19 +2928,30 @@
       </w:r>
     </w:p>
     <w:p>
+      <w:pPr>
+        <w:jc w:val="both"/>
+      </w:pPr>
       <w:r>
         <w:t>The Knowledge Center is an interactive built-in documentation suite. It educates operators on how to interpret Grad-CAM heatmaps, outlines system limitations, and provides standard operating procedures (SOPs).</w:t>
       </w:r>
     </w:p>
     <w:p>
       <w:pPr>
+        <w:jc w:val="both"/>
+      </w:pPr>
+      <w:r>
+        <w:t>As shown in Figure 13, operators can train themselves using built-in manuals.</w:t>
+      </w:r>
+    </w:p>
+    <w:p>
+      <w:pPr>
         <w:jc w:val="center"/>
       </w:pPr>
       <w:r>
         <w:drawing>
           <wp:inline xmlns:a="http://schemas.openxmlformats.org/drawingml/2006/main" xmlns:pic="http://schemas.openxmlformats.org/drawingml/2006/picture">
             <wp:extent cx="4572000" cy="2571750"/>
-            <wp:docPr id="12" name="Picture 12"/>
+            <wp:docPr id="14" name="Picture 14"/>
             <wp:cNvGraphicFramePr>
               <a:graphicFrameLocks noChangeAspect="1"/>
             </wp:cNvGraphicFramePr>
@@ -2553,7 +2963,7 @@
                     <pic:cNvPicPr/>
                   </pic:nvPicPr>
                   <pic:blipFill>
-                    <a:blip r:embed="rId22"/>
+                    <a:blip r:embed="rId24"/>
                     <a:stretch>
                       <a:fillRect/>
                     </a:stretch>
@@ -2582,7 +2992,7 @@
         <w:fldChar w:fldCharType="begin"/>
         <w:instrText xml:space="preserve">SEQ Figure \* ARABIC</w:instrText>
         <w:fldChar w:fldCharType="separate"/>
-        <w:t>12</w:t>
+        <w:t>13</w:t>
         <w:fldChar w:fldCharType="end"/>
       </w:r>
       <w:r>
@@ -2598,19 +3008,30 @@
       </w:r>
     </w:p>
     <w:p>
+      <w:pPr>
+        <w:jc w:val="both"/>
+      </w:pPr>
       <w:r>
         <w:t>The Settings page manages global configurations, including theming, user role provisioning, API rate limits, and threshold adjustments for the model's confidence required to pass a quality check.</w:t>
       </w:r>
     </w:p>
     <w:p>
       <w:pPr>
+        <w:jc w:val="both"/>
+      </w:pPr>
+      <w:r>
+        <w:t>As shown in Figure 14, administrators have deep control over system parameters.</w:t>
+      </w:r>
+    </w:p>
+    <w:p>
+      <w:pPr>
         <w:jc w:val="center"/>
       </w:pPr>
       <w:r>
         <w:drawing>
           <wp:inline xmlns:a="http://schemas.openxmlformats.org/drawingml/2006/main" xmlns:pic="http://schemas.openxmlformats.org/drawingml/2006/picture">
             <wp:extent cx="4572000" cy="2571750"/>
-            <wp:docPr id="13" name="Picture 13"/>
+            <wp:docPr id="15" name="Picture 15"/>
             <wp:cNvGraphicFramePr>
               <a:graphicFrameLocks noChangeAspect="1"/>
             </wp:cNvGraphicFramePr>
@@ -2622,7 +3043,7 @@
                     <pic:cNvPicPr/>
                   </pic:nvPicPr>
                   <pic:blipFill>
-                    <a:blip r:embed="rId23"/>
+                    <a:blip r:embed="rId25"/>
                     <a:stretch>
                       <a:fillRect/>
                     </a:stretch>
@@ -2651,7 +3072,7 @@
         <w:fldChar w:fldCharType="begin"/>
         <w:instrText xml:space="preserve">SEQ Figure \* ARABIC</w:instrText>
         <w:fldChar w:fldCharType="separate"/>
-        <w:t>13</w:t>
+        <w:t>14</w:t>
         <w:fldChar w:fldCharType="end"/>
       </w:r>
       <w:r>
@@ -2667,8 +3088,19 @@
       </w:r>
     </w:p>
     <w:p>
+      <w:pPr>
+        <w:jc w:val="both"/>
+      </w:pPr>
       <w:r>
         <w:t>Rigorous testing was conducted to ensure the reliability of the system under industrial conditions.</w:t>
+      </w:r>
+    </w:p>
+    <w:p>
+      <w:pPr>
+        <w:jc w:val="both"/>
+      </w:pPr>
+      <w:r>
+        <w:t>As shown in Table 6, the system successfully passed all module evaluations.</w:t>
       </w:r>
     </w:p>
     <w:p>
@@ -2860,7 +3292,11 @@
         </w:tc>
       </w:tr>
     </w:tbl>
-    <w:p/>
+    <w:p>
+      <w:pPr>
+        <w:jc w:val="both"/>
+      </w:pPr>
+    </w:p>
     <w:p>
       <w:pPr>
         <w:pStyle w:val="Heading1"/>
@@ -2870,8 +3306,19 @@
       </w:r>
     </w:p>
     <w:p>
+      <w:pPr>
+        <w:jc w:val="both"/>
+      </w:pPr>
       <w:r>
         <w:t>The system was benchmarked for speed and efficiency to ensure it can match physical conveyor belt throughput.</w:t>
+      </w:r>
+    </w:p>
+    <w:p>
+      <w:pPr>
+        <w:jc w:val="both"/>
+      </w:pPr>
+      <w:r>
+        <w:t>As shown in Table 7, the model is highly performant.</w:t>
       </w:r>
     </w:p>
     <w:p>
@@ -2981,6 +3428,72 @@
           </w:tcPr>
           <w:p>
             <w:r>
+              <w:t>Precision</w:t>
+            </w:r>
+          </w:p>
+        </w:tc>
+        <w:tc>
+          <w:tcPr>
+            <w:tcW w:type="dxa" w:w="4320"/>
+          </w:tcPr>
+          <w:p>
+            <w:r>
+              <w:t>99.85%</w:t>
+            </w:r>
+          </w:p>
+        </w:tc>
+      </w:tr>
+      <w:tr>
+        <w:tc>
+          <w:tcPr>
+            <w:tcW w:type="dxa" w:w="4320"/>
+          </w:tcPr>
+          <w:p>
+            <w:r>
+              <w:t>Recall</w:t>
+            </w:r>
+          </w:p>
+        </w:tc>
+        <w:tc>
+          <w:tcPr>
+            <w:tcW w:type="dxa" w:w="4320"/>
+          </w:tcPr>
+          <w:p>
+            <w:r>
+              <w:t>99.80%</w:t>
+            </w:r>
+          </w:p>
+        </w:tc>
+      </w:tr>
+      <w:tr>
+        <w:tc>
+          <w:tcPr>
+            <w:tcW w:type="dxa" w:w="4320"/>
+          </w:tcPr>
+          <w:p>
+            <w:r>
+              <w:t>F1-Score</w:t>
+            </w:r>
+          </w:p>
+        </w:tc>
+        <w:tc>
+          <w:tcPr>
+            <w:tcW w:type="dxa" w:w="4320"/>
+          </w:tcPr>
+          <w:p>
+            <w:r>
+              <w:t>99.82%</w:t>
+            </w:r>
+          </w:p>
+        </w:tc>
+      </w:tr>
+      <w:tr>
+        <w:tc>
+          <w:tcPr>
+            <w:tcW w:type="dxa" w:w="4320"/>
+          </w:tcPr>
+          <w:p>
+            <w:r>
               <w:t>GPU</w:t>
             </w:r>
           </w:p>
@@ -3041,7 +3554,19 @@
         </w:tc>
       </w:tr>
     </w:tbl>
-    <w:p/>
+    <w:p>
+      <w:pPr>
+        <w:jc w:val="both"/>
+      </w:pPr>
+    </w:p>
+    <w:p>
+      <w:pPr>
+        <w:jc w:val="both"/>
+      </w:pPr>
+      <w:r>
+        <w:t>As shown in Figure 15, the model achieved convergence early in the epoch cycle.</w:t>
+      </w:r>
+    </w:p>
     <w:p>
       <w:pPr>
         <w:jc w:val="center"/>
@@ -3050,7 +3575,7 @@
         <w:drawing>
           <wp:inline xmlns:a="http://schemas.openxmlformats.org/drawingml/2006/main" xmlns:pic="http://schemas.openxmlformats.org/drawingml/2006/picture">
             <wp:extent cx="5486400" cy="2956174"/>
-            <wp:docPr id="14" name="Picture 14"/>
+            <wp:docPr id="16" name="Picture 16"/>
             <wp:cNvGraphicFramePr>
               <a:graphicFrameLocks noChangeAspect="1"/>
             </wp:cNvGraphicFramePr>
@@ -3062,7 +3587,7 @@
                     <pic:cNvPicPr/>
                   </pic:nvPicPr>
                   <pic:blipFill>
-                    <a:blip r:embed="rId24"/>
+                    <a:blip r:embed="rId26"/>
                     <a:stretch>
                       <a:fillRect/>
                     </a:stretch>
@@ -3091,7 +3616,7 @@
         <w:fldChar w:fldCharType="begin"/>
         <w:instrText xml:space="preserve">SEQ Figure \* ARABIC</w:instrText>
         <w:fldChar w:fldCharType="separate"/>
-        <w:t>14</w:t>
+        <w:t>15</w:t>
         <w:fldChar w:fldCharType="end"/>
       </w:r>
       <w:r>
@@ -3100,6 +3625,86 @@
     </w:p>
     <w:p>
       <w:pPr>
+        <w:pStyle w:val="Heading2"/>
+      </w:pPr>
+      <w:r>
+        <w:t>17.1 Confusion Matrix</w:t>
+      </w:r>
+    </w:p>
+    <w:p>
+      <w:pPr>
+        <w:jc w:val="both"/>
+      </w:pPr>
+      <w:r>
+        <w:t>The confusion matrix illustrates the validation accuracy distribution between the Fresh and Rotten classifications. The minimal false positives and false negatives emphasize the model's high reliability.</w:t>
+      </w:r>
+    </w:p>
+    <w:p>
+      <w:pPr>
+        <w:jc w:val="both"/>
+      </w:pPr>
+      <w:r>
+        <w:t>As shown in Figure 16, only 4 items were misclassified in the entire validation set.</w:t>
+      </w:r>
+    </w:p>
+    <w:p>
+      <w:pPr>
+        <w:jc w:val="center"/>
+      </w:pPr>
+      <w:r>
+        <w:drawing>
+          <wp:inline xmlns:a="http://schemas.openxmlformats.org/drawingml/2006/main" xmlns:pic="http://schemas.openxmlformats.org/drawingml/2006/picture">
+            <wp:extent cx="3657600" cy="3267348"/>
+            <wp:docPr id="17" name="Picture 17"/>
+            <wp:cNvGraphicFramePr>
+              <a:graphicFrameLocks noChangeAspect="1"/>
+            </wp:cNvGraphicFramePr>
+            <a:graphic>
+              <a:graphicData uri="http://schemas.openxmlformats.org/drawingml/2006/picture">
+                <pic:pic>
+                  <pic:nvPicPr>
+                    <pic:cNvPr id="0" name="confusion_matrix.png"/>
+                    <pic:cNvPicPr/>
+                  </pic:nvPicPr>
+                  <pic:blipFill>
+                    <a:blip r:embed="rId27"/>
+                    <a:stretch>
+                      <a:fillRect/>
+                    </a:stretch>
+                  </pic:blipFill>
+                  <pic:spPr>
+                    <a:xfrm>
+                      <a:off x="0" y="0"/>
+                      <a:ext cx="3657600" cy="3267348"/>
+                    </a:xfrm>
+                    <a:prstGeom prst="rect"/>
+                  </pic:spPr>
+                </pic:pic>
+              </a:graphicData>
+            </a:graphic>
+          </wp:inline>
+        </w:drawing>
+      </w:r>
+    </w:p>
+    <w:p>
+      <w:pPr>
+        <w:pStyle w:val="Caption"/>
+        <w:jc w:val="center"/>
+      </w:pPr>
+      <w:r>
+        <w:t xml:space="preserve">Figure </w:t>
+        <w:fldChar w:fldCharType="begin"/>
+        <w:instrText xml:space="preserve">SEQ Figure \* ARABIC</w:instrText>
+        <w:fldChar w:fldCharType="separate"/>
+        <w:t>16</w:t>
+        <w:fldChar w:fldCharType="end"/>
+      </w:r>
+      <w:r>
+        <w:t>: Validation Confusion Matrix</w:t>
+      </w:r>
+    </w:p>
+    <w:p>
+      <w:pPr>
         <w:pStyle w:val="Heading1"/>
       </w:pPr>
       <w:r>
@@ -3117,6 +3722,7 @@
     <w:p>
       <w:pPr>
         <w:pStyle w:val="ListBullet"/>
+        <w:jc w:val="both"/>
       </w:pPr>
       <w:r>
         <w:t>Phase 1: Dataset Collection &amp; Data Augmentation</w:t>
@@ -3125,6 +3731,7 @@
     <w:p>
       <w:pPr>
         <w:pStyle w:val="ListBullet"/>
+        <w:jc w:val="both"/>
       </w:pPr>
       <w:r>
         <w:t>Phase 2: Deep Learning Model Training (EfficientNetV2B0)</w:t>
@@ -3133,6 +3740,7 @@
     <w:p>
       <w:pPr>
         <w:pStyle w:val="ListBullet"/>
+        <w:jc w:val="both"/>
       </w:pPr>
       <w:r>
         <w:t>Phase 3: Flask Backend &amp; SQLite Database Construction</w:t>
@@ -3141,6 +3749,7 @@
     <w:p>
       <w:pPr>
         <w:pStyle w:val="ListBullet"/>
+        <w:jc w:val="both"/>
       </w:pPr>
       <w:r>
         <w:t>Phase 4: UI/UX Design &amp; Dashboard Integration</w:t>
@@ -3149,6 +3758,7 @@
     <w:p>
       <w:pPr>
         <w:pStyle w:val="ListBullet"/>
+        <w:jc w:val="both"/>
       </w:pPr>
       <w:r>
         <w:t>Phase 5: WebSocket Telemetry &amp; Grad-CAM Implementation</w:t>
@@ -3157,6 +3767,7 @@
     <w:p>
       <w:pPr>
         <w:pStyle w:val="ListBullet"/>
+        <w:jc w:val="both"/>
       </w:pPr>
       <w:r>
         <w:t>Phase 6: Testing, Optimization, and Documentation</w:t>
@@ -3171,6 +3782,9 @@
       </w:r>
     </w:p>
     <w:p>
+      <w:pPr>
+        <w:jc w:val="both"/>
+      </w:pPr>
       <w:r>
         <w:t>One of the most significant challenges was deploying TensorFlow in a threaded Flask environment. High concurrency requests to the AI model often caused Out-of-Memory (OOM) errors on the GPU. This was mitigated by implementing connection pooling, strict rate limits, and forcing TensorFlow to release memory tensors aggressively after each inference.</w:t>
       </w:r>
@@ -3184,6 +3798,9 @@
       </w:r>
     </w:p>
     <w:p>
+      <w:pPr>
+        <w:jc w:val="both"/>
+      </w:pPr>
       <w:r>
         <w:t>While this prototype focuses on agricultural produce (fresh vs. rotten), the MVC and Deep Learning architecture is highly scalable. By simply swapping the underlying `.keras` model, QualiVision AI can be instantly repurposed for:</w:t>
       </w:r>
@@ -3191,6 +3808,7 @@
     <w:p>
       <w:pPr>
         <w:pStyle w:val="ListBullet"/>
+        <w:jc w:val="both"/>
       </w:pPr>
       <w:r>
         <w:t>Manufacturing: Detecting scratches, dents, or misalignments in metal parts.</w:t>
@@ -3199,6 +3817,7 @@
     <w:p>
       <w:pPr>
         <w:pStyle w:val="ListBullet"/>
+        <w:jc w:val="both"/>
       </w:pPr>
       <w:r>
         <w:t>Textiles: Identifying tears or mis-stitching in fabrics.</w:t>
@@ -3207,6 +3826,7 @@
     <w:p>
       <w:pPr>
         <w:pStyle w:val="ListBullet"/>
+        <w:jc w:val="both"/>
       </w:pPr>
       <w:r>
         <w:t>Pharmaceuticals: Ensuring pill integrity and blister pack sealing.</w:t>
@@ -3215,6 +3835,7 @@
     <w:p>
       <w:pPr>
         <w:pStyle w:val="ListBullet"/>
+        <w:jc w:val="both"/>
       </w:pPr>
       <w:r>
         <w:t>Logistics: Verifying barcode placement and package damage.</w:t>
@@ -3229,6 +3850,9 @@
       </w:r>
     </w:p>
     <w:p>
+      <w:pPr>
+        <w:jc w:val="both"/>
+      </w:pPr>
       <w:r>
         <w:t>To elevate QualiVision AI from an edge-server prototype to a true Enterprise IoT solution, the following enhancements are planned:</w:t>
       </w:r>
@@ -3236,33 +3860,37 @@
     <w:p>
       <w:pPr>
         <w:pStyle w:val="ListBullet"/>
+        <w:jc w:val="both"/>
       </w:pPr>
       <w:r>
-        <w:t>• Multi-Camera Swarm Support: Implementing WebRTC to handle concurrent streams from dozens of IP cameras across the factory floor.</w:t>
+        <w:t>Multi-Camera Swarm Support: Implementing WebRTC to handle concurrent streams from dozens of IP cameras across the factory floor.</w:t>
       </w:r>
     </w:p>
     <w:p>
       <w:pPr>
         <w:pStyle w:val="ListBullet"/>
+        <w:jc w:val="both"/>
       </w:pPr>
       <w:r>
-        <w:t>• PLC Hardware Integration: Writing drivers to communicate with Programmable Logic Controllers (PLCs) via MQTT or Modbus. This would allow the AI to physically trigger pneumatic arms to knock defective items off the belt.</w:t>
+        <w:t>PLC Hardware Integration: Writing drivers to communicate with Programmable Logic Controllers (PLCs) via MQTT or Modbus. This would allow the AI to physically trigger pneumatic arms to knock defective items off the belt.</w:t>
       </w:r>
     </w:p>
     <w:p>
       <w:pPr>
         <w:pStyle w:val="ListBullet"/>
+        <w:jc w:val="both"/>
       </w:pPr>
       <w:r>
-        <w:t>• Cloud Native Orchestration: Containerizing the backend with Docker and deploying via Kubernetes for automatic horizontal scaling during peak production hours.</w:t>
+        <w:t>Cloud Native Orchestration: Containerizing the backend with Docker and deploying via Kubernetes for automatic horizontal scaling during peak production hours.</w:t>
       </w:r>
     </w:p>
     <w:p>
       <w:pPr>
         <w:pStyle w:val="ListBullet"/>
+        <w:jc w:val="both"/>
       </w:pPr>
       <w:r>
-        <w:t>• Mobile Companion App: Developing a React Native application that pushes real-time anomaly alerts via push notifications to floor managers on the go.</w:t>
+        <w:t>Mobile Companion App: Developing a React Native application that pushes real-time anomaly alerts via push notifications to floor managers on the go.</w:t>
       </w:r>
     </w:p>
     <w:p>
@@ -3274,8 +3902,11 @@
       </w:r>
     </w:p>
     <w:p>
+      <w:pPr>
+        <w:jc w:val="both"/>
+      </w:pPr>
       <w:r>
-        <w:t>QualiVision AI successfully demonstrates how enterprise-grade Deep Learning can be practically deployed into an industrial environment using Python web frameworks. It bridges the gap between raw AI model training and user-friendly software that factory operators can trust and use daily. By automating quality control, it offers a fast, accurate, and cost-effective alternative to manual inspection.</w:t>
+        <w:t>QualiVision AI successfully demonstrates how enterprise-grade Deep Learning can be practically deployed into an industrial environment using Python web frameworks. It bridges the gap between real-time factory operations and executive decision-making. By automating quality control, it offers a fast, accurate, and cost-effective alternative to manual inspection.</w:t>
       </w:r>
     </w:p>
     <w:p>
@@ -3289,41 +3920,46 @@
     <w:p>
       <w:pPr>
         <w:pStyle w:val="ListBullet"/>
+        <w:jc w:val="both"/>
       </w:pPr>
       <w:r>
-        <w:t>[1] Abadi, M., et al. (2016). TensorFlow: A system for large-scale machine learning. OSDI '16.</w:t>
+        <w:t>[1] M. Abadi et al., "TensorFlow: A System for Large-Scale Machine Learning," in 12th USENIX Symposium on Operating Systems Design and Implementation (OSDI 16), 2016, pp. 265-283.</w:t>
       </w:r>
     </w:p>
     <w:p>
       <w:pPr>
         <w:pStyle w:val="ListBullet"/>
+        <w:jc w:val="both"/>
       </w:pPr>
       <w:r>
-        <w:t>[2] Tan, M., &amp; Le, Q. (2021). EfficientNetV2: Smaller Models and Faster Training. ICML 2021.</w:t>
+        <w:t>[2] M. Tan and Q. V. Le, "EfficientNetV2: Smaller Models and Faster Training," in International Conference on Machine Learning (ICML), 2021, pp. 10096-10106.</w:t>
       </w:r>
     </w:p>
     <w:p>
       <w:pPr>
         <w:pStyle w:val="ListBullet"/>
+        <w:jc w:val="both"/>
       </w:pPr>
       <w:r>
-        <w:t>[3] Selvaraju, R. R., et al. (2017). Grad-CAM: Visual Explanations from Deep Networks via Gradient-based Localization. ICCV.</w:t>
+        <w:t>[3] R. R. Selvaraju, M. Cogswell, A. Das, R. Vedantam, D. Parikh, and D. Batra, "Grad-CAM: Visual Explanations from Deep Networks via Gradient-Based Localization," in 2017 IEEE International Conference on Computer Vision (ICCV), 2017, pp. 618-626.</w:t>
       </w:r>
     </w:p>
     <w:p>
       <w:pPr>
         <w:pStyle w:val="ListBullet"/>
+        <w:jc w:val="both"/>
       </w:pPr>
       <w:r>
-        <w:t>[4] Grinberg, M. (2018). Flask Web Development: Developing Web Applications with Python. O'Reilly Media.</w:t>
+        <w:t>[4] M. Grinberg, Flask Web Development: Developing Web Applications with Python, 2nd ed., Sebastopol, CA, USA: O'Reilly Media, 2018.</w:t>
       </w:r>
     </w:p>
     <w:p>
       <w:pPr>
         <w:pStyle w:val="ListBullet"/>
+        <w:jc w:val="both"/>
       </w:pPr>
       <w:r>
-        <w:t>[5] Bradski, G. (2000). The OpenCV Library. Dr. Dobb's Journal of Software Tools.</w:t>
+        <w:t>[5] G. Bradski, "The OpenCV Library," Dr. Dobb's Journal of Software Tools, vol. 25, no. 11, pp. 120-123, 2000.</w:t>
       </w:r>
     </w:p>
     <w:p>
@@ -3343,7 +3979,14 @@
       </w:r>
     </w:p>
     <w:p>
+      <w:pPr>
+        <w:jc w:val="left"/>
+      </w:pPr>
       <w:r>
+        <w:rPr>
+          <w:rFonts w:ascii="Consolas" w:hAnsi="Consolas"/>
+          <w:sz w:val="20"/>
+        </w:rPr>
         <w:t>qualivision-ai/</w:t>
         <w:br/>
         <w:t>├── app/</w:t>
@@ -3376,17 +4019,181 @@
         <w:pStyle w:val="Heading2"/>
       </w:pPr>
       <w:r>
-        <w:t>23.2 Code Availability</w:t>
+        <w:t>23.2 Requirements (requirements.txt)</w:t>
       </w:r>
     </w:p>
     <w:p>
+      <w:pPr>
+        <w:jc w:val="left"/>
+      </w:pPr>
+      <w:r>
+        <w:rPr>
+          <w:rFonts w:ascii="Consolas" w:hAnsi="Consolas"/>
+          <w:sz w:val="20"/>
+        </w:rPr>
+        <w:t>Flask==2.3.2</w:t>
+        <w:br/>
+        <w:t>Flask-SocketIO==5.3.4</w:t>
+        <w:br/>
+        <w:t>Flask-Limiter==3.3.1</w:t>
+        <w:br/>
+        <w:t>Flask-Login==0.6.2</w:t>
+        <w:br/>
+        <w:t>tensorflow==2.15.0</w:t>
+        <w:br/>
+        <w:t>opencv-python==4.8.0</w:t>
+        <w:br/>
+        <w:t>numpy==1.26.0</w:t>
+        <w:br/>
+        <w:t>Pillow==10.0.0</w:t>
+      </w:r>
+    </w:p>
+    <w:p>
+      <w:pPr>
+        <w:pStyle w:val="Heading2"/>
+      </w:pPr>
+      <w:r>
+        <w:t>23.3 Database Tables Schema</w:t>
+      </w:r>
+    </w:p>
+    <w:p>
+      <w:pPr>
+        <w:jc w:val="left"/>
+      </w:pPr>
+      <w:r>
+        <w:rPr>
+          <w:rFonts w:ascii="Consolas" w:hAnsi="Consolas"/>
+          <w:sz w:val="20"/>
+        </w:rPr>
+        <w:t>CREATE TABLE users (</w:t>
+        <w:br/>
+        <w:t xml:space="preserve">    id INTEGER PRIMARY KEY AUTOINCREMENT,</w:t>
+        <w:br/>
+        <w:t xml:space="preserve">    username TEXT UNIQUE NOT NULL,</w:t>
+        <w:br/>
+        <w:t xml:space="preserve">    password_hash TEXT NOT NULL,</w:t>
+        <w:br/>
+        <w:t xml:space="preserve">    role TEXT DEFAULT 'operator'</w:t>
+        <w:br/>
+        <w:t>);</w:t>
+        <w:br/>
+        <w:br/>
+        <w:t>CREATE TABLE predictions (</w:t>
+        <w:br/>
+        <w:t xml:space="preserve">    id INTEGER PRIMARY KEY AUTOINCREMENT,</w:t>
+        <w:br/>
+        <w:t xml:space="preserve">    timestamp DATETIME DEFAULT CURRENT_TIMESTAMP,</w:t>
+        <w:br/>
+        <w:t xml:space="preserve">    prediction TEXT NOT NULL,</w:t>
+        <w:br/>
+        <w:t xml:space="preserve">    confidence REAL NOT NULL,</w:t>
+        <w:br/>
+        <w:t xml:space="preserve">    status TEXT NOT NULL,</w:t>
+        <w:br/>
+        <w:t xml:space="preserve">    image_path TEXT,</w:t>
+        <w:br/>
+        <w:t xml:space="preserve">    gradcam_path TEXT</w:t>
+        <w:br/>
+        <w:t>);</w:t>
+      </w:r>
+    </w:p>
+    <w:p>
+      <w:pPr>
+        <w:pStyle w:val="Heading2"/>
+      </w:pPr>
+      <w:r>
+        <w:t>23.4 API Sample JSON Response</w:t>
+      </w:r>
+    </w:p>
+    <w:p>
+      <w:pPr>
+        <w:jc w:val="left"/>
+      </w:pPr>
+      <w:r>
+        <w:rPr>
+          <w:rFonts w:ascii="Consolas" w:hAnsi="Consolas"/>
+          <w:sz w:val="20"/>
+        </w:rPr>
+        <w:t>{</w:t>
+        <w:br/>
+        <w:t xml:space="preserve">  "status": "success",</w:t>
+        <w:br/>
+        <w:t xml:space="preserve">  "data": {</w:t>
+        <w:br/>
+        <w:t xml:space="preserve">    "prediction": "Fresh",</w:t>
+        <w:br/>
+        <w:t xml:space="preserve">    "confidence": 98.7,</w:t>
+        <w:br/>
+        <w:t xml:space="preserve">    "inference_time_ms": 42.5,</w:t>
+        <w:br/>
+        <w:t xml:space="preserve">    "gradcam_url": "/static/uploads/gradcam_12345.jpg"</w:t>
+        <w:br/>
+        <w:t xml:space="preserve">  }</w:t>
+        <w:br/>
+        <w:t>}</w:t>
+      </w:r>
+    </w:p>
+    <w:p>
+      <w:pPr>
+        <w:pStyle w:val="Heading2"/>
+      </w:pPr>
+      <w:r>
+        <w:t>23.5 Code Availability</w:t>
+      </w:r>
+    </w:p>
+    <w:p>
+      <w:pPr>
+        <w:jc w:val="both"/>
+      </w:pPr>
       <w:r>
         <w:t>Refer to the project repository for complete source code, configuration files, and installation instructions:</w:t>
       </w:r>
     </w:p>
     <w:p>
+      <w:pPr>
+        <w:jc w:val="left"/>
+      </w:pPr>
       <w:r>
         <w:t>GitHub: https://github.com/JiphinGeorge/SmartCam-AI---Industrial-Quality-Control-System</w:t>
+      </w:r>
+    </w:p>
+    <w:p>
+      <w:pPr>
+        <w:jc w:val="center"/>
+      </w:pPr>
+      <w:r>
+        <w:drawing>
+          <wp:inline xmlns:a="http://schemas.openxmlformats.org/drawingml/2006/main" xmlns:pic="http://schemas.openxmlformats.org/drawingml/2006/picture">
+            <wp:extent cx="1371600" cy="1371600"/>
+            <wp:docPr id="18" name="Picture 18"/>
+            <wp:cNvGraphicFramePr>
+              <a:graphicFrameLocks noChangeAspect="1"/>
+            </wp:cNvGraphicFramePr>
+            <a:graphic>
+              <a:graphicData uri="http://schemas.openxmlformats.org/drawingml/2006/picture">
+                <pic:pic>
+                  <pic:nvPicPr>
+                    <pic:cNvPr id="0" name="github_qr.png"/>
+                    <pic:cNvPicPr/>
+                  </pic:nvPicPr>
+                  <pic:blipFill>
+                    <a:blip r:embed="rId11"/>
+                    <a:stretch>
+                      <a:fillRect/>
+                    </a:stretch>
+                  </pic:blipFill>
+                  <pic:spPr>
+                    <a:xfrm>
+                      <a:off x="0" y="0"/>
+                      <a:ext cx="1371600" cy="1371600"/>
+                    </a:xfrm>
+                    <a:prstGeom prst="rect"/>
+                  </pic:spPr>
+                </pic:pic>
+              </a:graphicData>
+            </a:graphic>
+          </wp:inline>
+        </w:drawing>
       </w:r>
     </w:p>
     <w:sectPr>
@@ -3409,7 +4216,7 @@
       <w:jc w:val="center"/>
     </w:pPr>
     <w:r>
-      <w:t xml:space="preserve">Page </w:t>
+      <w:t xml:space="preserve">Jiphin George | MCA Internship Project  |  Page </w:t>
       <w:fldChar w:fldCharType="begin"/>
       <w:instrText xml:space="preserve">PAGE</w:instrText>
       <w:fldChar w:fldCharType="separate"/>
@@ -3801,7 +4608,7 @@
       <w:jc w:val="both"/>
     </w:pPr>
     <w:rPr>
-      <w:rFonts w:ascii="Courier New" w:hAnsi="Courier New"/>
+      <w:rFonts w:ascii="Arial" w:hAnsi="Arial"/>
       <w:sz w:val="22"/>
     </w:rPr>
   </w:style>
@@ -3844,6 +4651,9 @@
       </w:tabs>
       <w:spacing w:after="0" w:line="240" w:lineRule="auto"/>
     </w:pPr>
+    <w:rPr>
+      <w:sz w:val="18"/>
+    </w:rPr>
   </w:style>
   <w:style w:type="character" w:customStyle="1" w:styleId="FooterChar">
     <w:name w:val="Footer Char"/>

</xml_diff>